<commit_message>
Correção de peças tecnicas
</commit_message>
<xml_diff>
--- a/reference/pecas-posse/2-memorial-tabular.docx
+++ b/reference/pecas-posse/2-memorial-tabular.docx
@@ -3341,7 +3341,7 @@
       <w:footerReference w:type="default" r:id="rId10"/>
       <w:headerReference w:type="first" r:id="rId11"/>
       <w:pgSz w:w="15840" w:h="12240" w:orient="landscape"/>
-      <w:pgMar w:top="2410" w:right="1871" w:bottom="1559" w:left="1701" w:header="340" w:footer="1134" w:gutter="0"/>
+      <w:pgMar w:top="2410" w:right="1871" w:bottom="1559" w:left="1701" w:header="340" w:footer="0" w:gutter="0"/>
       <w:cols w:space="720"/>
       <w:docGrid w:linePitch="299"/>
     </w:sectPr>
@@ -3369,1669 +3369,391 @@
 </file>
 
 <file path=word/footer1.xml><?xml version="1.0" encoding="utf-8"?>
-<w:ftr xmlns:wpc="http://schemas.microsoft.com/office/word/2010/wordprocessingCanvas" xmlns:cx="http://schemas.microsoft.com/office/drawing/2014/chartex" xmlns:cx1="http://schemas.microsoft.com/office/drawing/2015/9/8/chartex" xmlns:cx2="http://schemas.microsoft.com/office/drawing/2015/10/21/chartex" xmlns:cx3="http://schemas.microsoft.com/office/drawing/2016/5/9/chartex" xmlns:cx4="http://schemas.microsoft.com/office/drawing/2016/5/10/chartex" xmlns:cx5="http://schemas.microsoft.com/office/drawing/2016/5/11/chartex" xmlns:cx6="http://schemas.microsoft.com/office/drawing/2016/5/12/chartex" xmlns:cx7="http://schemas.microsoft.com/office/drawing/2016/5/13/chartex" xmlns:cx8="http://schemas.microsoft.com/office/drawing/2016/5/14/chartex" xmlns:mc="http://schemas.openxmlformats.org/markup-compatibility/2006" xmlns:aink="http://schemas.microsoft.com/office/drawing/2016/ink" xmlns:am3d="http://schemas.microsoft.com/office/drawing/2017/model3d" xmlns:o="urn:schemas-microsoft-com:office:office" xmlns:oel="http://schemas.microsoft.com/office/2019/extlst" xmlns:r="http://schemas.openxmlformats.org/officeDocument/2006/relationships" xmlns:m="http://schemas.openxmlformats.org/officeDocument/2006/math" xmlns:v="urn:schemas-microsoft-com:vml" xmlns:wp14="http://schemas.microsoft.com/office/word/2010/wordprocessingDrawing" xmlns:wp="http://schemas.openxmlformats.org/drawingml/2006/wordprocessingDrawing" xmlns:w10="urn:schemas-microsoft-com:office:word" xmlns:w="http://schemas.openxmlformats.org/wordprocessingml/2006/main" xmlns:w14="http://schemas.microsoft.com/office/word/2010/wordml" xmlns:w15="http://schemas.microsoft.com/office/word/2012/wordml" xmlns:w16cex="http://schemas.microsoft.com/office/word/2018/wordml/cex" xmlns:w16cid="http://schemas.microsoft.com/office/word/2016/wordml/cid" xmlns:w16="http://schemas.microsoft.com/office/word/2018/wordml" xmlns:w16du="http://schemas.microsoft.com/office/word/2023/wordml/word16du" xmlns:w16sdtdh="http://schemas.microsoft.com/office/word/2020/wordml/sdtdatahash" xmlns:w16sdtfl="http://schemas.microsoft.com/office/word/2024/wordml/sdtformatlock" xmlns:w16se="http://schemas.microsoft.com/office/word/2015/wordml/symex" xmlns:wpg="http://schemas.microsoft.com/office/word/2010/wordprocessingGroup" xmlns:wpi="http://schemas.microsoft.com/office/word/2010/wordprocessingInk" xmlns:wne="http://schemas.microsoft.com/office/word/2006/wordml" xmlns:wps="http://schemas.microsoft.com/office/word/2010/wordprocessingShape" mc:Ignorable="w14 w15 w16se w16cid w16 w16cex w16sdtdh w16sdtfl w16du wp14">
+<w:ftr xmlns:ve="http://schemas.openxmlformats.org/markup-compatibility/2006" xmlns:o="urn:schemas-microsoft-com:office:office" xmlns:r="http://schemas.openxmlformats.org/officeDocument/2006/relationships" xmlns:m="http://schemas.openxmlformats.org/officeDocument/2006/math" xmlns:v="urn:schemas-microsoft-com:vml" xmlns:wp="http://schemas.openxmlformats.org/drawingml/2006/wordprocessingDrawing" xmlns:w10="urn:schemas-microsoft-com:office:word" xmlns:w="http://schemas.openxmlformats.org/wordprocessingml/2006/main" xmlns:wne="http://schemas.microsoft.com/office/word/2006/wordml">
   <w:p>
     <w:pPr>
       <w:pStyle w:val="Rodap"/>
-      <w:ind w:left="567"/>
+      <w:jc w:val="center"/>
+      <w:rPr>
+        <w:color w:val="FFFFFF" w:themeColor="background1"/>
+      </w:rPr>
     </w:pPr>
     <w:r>
       <w:rPr>
         <w:noProof/>
+        <w:color w:val="FFFFFF" w:themeColor="background1"/>
       </w:rPr>
-      <w:pict w14:anchorId="179D318A">
-        <v:shape id="_x0000_s1153" style="position:absolute;left:0;text-align:left;margin-left:0;margin-top:774.25pt;width:595.25pt;height:52.5pt;z-index:251676672;visibility:visible;mso-wrap-style:square;mso-wrap-distance-left:9pt;mso-wrap-distance-top:0;mso-wrap-distance-right:9pt;mso-wrap-distance-bottom:0;mso-position-horizontal:absolute;mso-position-horizontal-relative:text;mso-position-vertical:absolute;mso-position-vertical-relative:text;v-text-anchor:top" coordsize="7560005,666750" o:spt="100" o:gfxdata="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" adj="0,,0" path="m,l7560005,r,666750l,666750,,e" fillcolor="#295c2f" stroked="f" strokeweight="0">
-          <v:stroke miterlimit="83231f" joinstyle="miter"/>
-          <v:formulas/>
-          <v:path arrowok="t" o:connecttype="segments" textboxrect="0,0,7560005,666750"/>
+      <w:pict>
+        <v:rect id="_x0000_s2001" style="position:absolute;left:0;text-align:left;margin-left:-.35pt;margin-top:750.4pt;width:596pt;height:92pt;z-index:-251656192;mso-position-horizontal-relative:page;mso-position-vertical-relative:page" o:allowincell="f" fillcolor="#017841" stroked="f">
+          <w10:wrap anchorx="page" anchory="page"/>
+        </v:rect>
+      </w:pict>
+    </w:r>
+    <w:r>
+      <w:rPr>
+        <w:color w:val="FFFFFF" w:themeColor="background1"/>
+      </w:rPr>
+      <w:pict>
+        <v:shapetype id="_x0000_t75" coordsize="21600,21600" o:spt="75" o:preferrelative="t" path="m@4@5l@4@11@9@11@9@5xe" filled="f" stroked="f">
+          <v:stroke joinstyle="miter"/>
+          <v:formulas>
+            <v:f eqn="if lineDrawn pixelLineWidth 0"/>
+            <v:f eqn="sum @0 1 0"/>
+            <v:f eqn="sum 0 0 @1"/>
+            <v:f eqn="prod @2 1 2"/>
+            <v:f eqn="prod @3 21600 pixelWidth"/>
+            <v:f eqn="prod @3 21600 pixelHeight"/>
+            <v:f eqn="sum @0 0 1"/>
+            <v:f eqn="prod @6 1 2"/>
+            <v:f eqn="prod @7 21600 pixelWidth"/>
+            <v:f eqn="sum @8 21600 0"/>
+            <v:f eqn="prod @7 21600 pixelHeight"/>
+            <v:f eqn="sum @10 21600 0"/>
+          </v:formulas>
+          <v:path o:extrusionok="f" gradientshapeok="t" o:connecttype="rect"/>
+          <o:lock v:ext="edit" aspectratio="t"/>
+        </v:shapetype>
+        <v:shape id="_x0000_i1025" type="#_x0000_t75" style="width:5.85pt;height:9.2pt">
+          <v:imagedata r:id="rId1" o:title="localização"/>
         </v:shape>
       </w:pict>
     </w:r>
     <w:r>
       <w:rPr>
-        <w:noProof/>
+        <w:color w:val="FFFFFF" w:themeColor="background1"/>
       </w:rPr>
-      <w:pict w14:anchorId="04822745">
-        <v:shape id="_x0000_s1152" style="position:absolute;left:0;text-align:left;margin-left:0;margin-top:774.25pt;width:595.25pt;height:52.5pt;z-index:251674624;visibility:visible;mso-wrap-style:square;mso-wrap-distance-left:9pt;mso-wrap-distance-top:0;mso-wrap-distance-right:9pt;mso-wrap-distance-bottom:0;mso-position-horizontal:absolute;mso-position-horizontal-relative:text;mso-position-vertical:absolute;mso-position-vertical-relative:text;v-text-anchor:top" coordsize="7560005,666750" o:spt="100" o:gfxdata="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" adj="0,,0" path="m,l7560005,r,666750l,666750,,e" fillcolor="#295c2f" stroked="f" strokeweight="0">
-          <v:stroke miterlimit="83231f" joinstyle="miter"/>
-          <v:formulas/>
-          <v:path arrowok="t" o:connecttype="segments" textboxrect="0,0,7560005,666750"/>
-        </v:shape>
-      </w:pict>
+      <w:t xml:space="preserve"> </w:t>
     </w:r>
     <w:r>
       <w:rPr>
-        <w:noProof/>
+        <w:color w:val="FFFFFF" w:themeColor="background1"/>
       </w:rPr>
-      <w:pict w14:anchorId="10293505">
-        <v:shape id="Shape 1141" o:spid="_x0000_s1151" style="position:absolute;left:0;text-align:left;margin-left:0;margin-top:774.25pt;width:595.25pt;height:52.5pt;z-index:251672576;visibility:visible;mso-wrap-style:square;mso-wrap-distance-left:9pt;mso-wrap-distance-top:0;mso-wrap-distance-right:9pt;mso-wrap-distance-bottom:0;mso-position-horizontal:absolute;mso-position-horizontal-relative:text;mso-position-vertical:absolute;mso-position-vertical-relative:text;v-text-anchor:top" coordsize="7560005,666750" o:spt="100" o:gfxdata="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" adj="0,,0" path="m,l7560005,r,666750l,666750,,e" fillcolor="#295c2f" stroked="f" strokeweight="0">
-          <v:stroke miterlimit="83231f" joinstyle="miter"/>
-          <v:formulas/>
-          <v:path arrowok="t" o:connecttype="segments" textboxrect="0,0,7560005,666750"/>
-        </v:shape>
-      </w:pict>
+      <w:t>Rua Theognes Antonio Calixto, nº 109, Centro, Conceição do Coité – BA, 48730-000.</w:t>
     </w:r>
     <w:r>
       <w:rPr>
-        <w:noProof/>
+        <w:color w:val="FFFFFF" w:themeColor="background1"/>
       </w:rPr>
-      <w:pict w14:anchorId="17E3C813">
-        <v:group id="Group 1088" o:spid="_x0000_s1095" style="position:absolute;left:0;text-align:left;margin-left:-.25pt;margin-top:768.75pt;width:595.5pt;height:58pt;z-index:251668480;mso-position-horizontal-relative:page;mso-position-vertical-relative:page;mso-width-relative:margin;mso-height-relative:margin" coordorigin="-63,381" coordsize="75631,7366" o:gfxdata="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">
-          <v:shape id="_x0000_s1096" style="position:absolute;left:-31;top:1079;width:75599;height:6668;visibility:visible;mso-wrap-style:square;v-text-anchor:top" coordsize="7560005,666750" o:spt="100" o:gfxdata="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" adj="0,,0" path="m,l7560005,r,666750l,666750,,e" fillcolor="#295c2f" stroked="f" strokeweight="0">
-            <v:stroke miterlimit="83231f" joinstyle="miter"/>
-            <v:formulas/>
-            <v:path arrowok="t" o:connecttype="segments" textboxrect="0,0,7560005,666750"/>
-          </v:shape>
-          <v:shape id="Shape 1142" o:spid="_x0000_s1097" style="position:absolute;left:-63;top:381;width:75599;height:889;visibility:visible;mso-wrap-style:square;v-text-anchor:top" coordsize="7560005,88900" o:spt="100" o:gfxdata="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" adj="0,,0" path="m,l7560005,r,88900l,88900,,e" fillcolor="#4e4d48" stroked="f" strokeweight="0">
-            <v:stroke miterlimit="83231f" joinstyle="miter"/>
-            <v:formulas/>
-            <v:path arrowok="t" o:connecttype="segments" textboxrect="0,0,7560005,88900"/>
-          </v:shape>
-          <v:shape id="Shape 17" o:spid="_x0000_s1098" style="position:absolute;left:18862;top:1825;width:453;height:1247;visibility:visible;mso-wrap-style:square;v-text-anchor:top" coordsize="45288,124675" o:spt="100" o:gfxdata="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" adj="0,,0" path="m45288,r,27686c35560,27686,27673,35572,27673,45288v,9741,7887,17628,17615,17628l45288,124675c165,79565,,45288,,45288,,20282,20269,,45288,xe" fillcolor="#fffefd" stroked="f" strokeweight="0">
-            <v:stroke miterlimit="83231f" joinstyle="miter"/>
-            <v:formulas/>
-            <v:path arrowok="t" o:connecttype="segments" textboxrect="0,0,45288,124675"/>
-          </v:shape>
-          <v:shape id="Shape 18" o:spid="_x0000_s1099" style="position:absolute;left:19315;top:1825;width:453;height:1247;visibility:visible;mso-wrap-style:square;v-text-anchor:top" coordsize="45301,124675" o:spt="100" o:gfxdata="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" adj="0,,0" path="m,c25019,,45301,20282,45301,45288v,,-838,34925,-45301,79387l,62916v9728,,17615,-7887,17615,-17628c17615,35572,9728,27686,,27686l,xe" fillcolor="#fffefd" stroked="f" strokeweight="0">
-            <v:stroke miterlimit="83231f" joinstyle="miter"/>
-            <v:formulas/>
-            <v:path arrowok="t" o:connecttype="segments" textboxrect="0,0,45301,124675"/>
-          </v:shape>
-          <v:rect id="Rectangle 19" o:spid="_x0000_s1100" style="position:absolute;left:20329;top:1824;width:48424;height:2051;visibility:visible;mso-wrap-style:square;v-text-anchor:top" o:gfxdata="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" filled="f" stroked="f">
-            <v:textbox style="mso-next-textbox:#Rectangle 19" inset="0,0,0,0">
-              <w:txbxContent>
-                <w:p>
-                  <w:r>
-                    <w:rPr>
-                      <w:rFonts w:ascii="Calibri" w:eastAsia="Calibri" w:hAnsi="Calibri" w:cs="Calibri"/>
-                      <w:color w:val="FFFEFD"/>
-                      <w:w w:val="113"/>
-                      <w:sz w:val="20"/>
-                    </w:rPr>
-                    <w:t>Rua</w:t>
-                  </w:r>
-                  <w:r>
-                    <w:rPr>
-                      <w:rFonts w:ascii="Calibri" w:eastAsia="Calibri" w:hAnsi="Calibri" w:cs="Calibri"/>
-                      <w:color w:val="FFFEFD"/>
-                      <w:spacing w:val="11"/>
-                      <w:w w:val="113"/>
-                      <w:sz w:val="20"/>
-                    </w:rPr>
-                    <w:t xml:space="preserve"> </w:t>
-                  </w:r>
-                  <w:r>
-                    <w:rPr>
-                      <w:rFonts w:ascii="Calibri" w:eastAsia="Calibri" w:hAnsi="Calibri" w:cs="Calibri"/>
-                      <w:color w:val="FFFEFD"/>
-                      <w:w w:val="113"/>
-                      <w:sz w:val="20"/>
-                    </w:rPr>
-                    <w:t>Lag</w:t>
-                  </w:r>
-                  <w:r>
-                    <w:rPr>
-                      <w:rFonts w:ascii="Calibri" w:eastAsia="Calibri" w:hAnsi="Calibri" w:cs="Calibri"/>
-                      <w:color w:val="FFFEFD"/>
-                      <w:spacing w:val="11"/>
-                      <w:w w:val="113"/>
-                      <w:sz w:val="20"/>
-                    </w:rPr>
-                    <w:t xml:space="preserve"> </w:t>
-                  </w:r>
-                  <w:r>
-                    <w:rPr>
-                      <w:rFonts w:ascii="Calibri" w:eastAsia="Calibri" w:hAnsi="Calibri" w:cs="Calibri"/>
-                      <w:color w:val="FFFEFD"/>
-                      <w:w w:val="113"/>
-                      <w:sz w:val="20"/>
-                    </w:rPr>
-                    <w:t>do</w:t>
-                  </w:r>
-                  <w:r>
-                    <w:rPr>
-                      <w:rFonts w:ascii="Calibri" w:eastAsia="Calibri" w:hAnsi="Calibri" w:cs="Calibri"/>
-                      <w:color w:val="FFFEFD"/>
-                      <w:spacing w:val="11"/>
-                      <w:w w:val="113"/>
-                      <w:sz w:val="20"/>
-                    </w:rPr>
-                    <w:t xml:space="preserve"> </w:t>
-                  </w:r>
-                  <w:r>
-                    <w:rPr>
-                      <w:rFonts w:ascii="Calibri" w:eastAsia="Calibri" w:hAnsi="Calibri" w:cs="Calibri"/>
-                      <w:color w:val="FFFEFD"/>
-                      <w:w w:val="113"/>
-                      <w:sz w:val="20"/>
-                    </w:rPr>
-                    <w:t>San</w:t>
-                  </w:r>
-                  <w:r>
-                    <w:rPr>
-                      <w:rFonts w:ascii="Calibri" w:eastAsia="Calibri" w:hAnsi="Calibri" w:cs="Calibri"/>
-                      <w:color w:val="FFFEFD"/>
-                      <w:spacing w:val="11"/>
-                      <w:w w:val="113"/>
-                      <w:sz w:val="20"/>
-                    </w:rPr>
-                    <w:t xml:space="preserve"> </w:t>
-                  </w:r>
-                  <w:r>
-                    <w:rPr>
-                      <w:rFonts w:ascii="Calibri" w:eastAsia="Calibri" w:hAnsi="Calibri" w:cs="Calibri"/>
-                      <w:color w:val="FFFEFD"/>
-                      <w:w w:val="113"/>
-                      <w:sz w:val="20"/>
-                    </w:rPr>
-                    <w:t>Juan,</w:t>
-                  </w:r>
-                  <w:r>
-                    <w:rPr>
-                      <w:rFonts w:ascii="Calibri" w:eastAsia="Calibri" w:hAnsi="Calibri" w:cs="Calibri"/>
-                      <w:color w:val="FFFEFD"/>
-                      <w:spacing w:val="11"/>
-                      <w:w w:val="113"/>
-                      <w:sz w:val="20"/>
-                    </w:rPr>
-                    <w:t xml:space="preserve"> </w:t>
-                  </w:r>
-                  <w:r>
-                    <w:rPr>
-                      <w:rFonts w:ascii="Calibri" w:eastAsia="Calibri" w:hAnsi="Calibri" w:cs="Calibri"/>
-                      <w:color w:val="FFFEFD"/>
-                      <w:w w:val="113"/>
-                      <w:sz w:val="20"/>
-                    </w:rPr>
-                    <w:t>n°</w:t>
-                  </w:r>
-                  <w:r>
-                    <w:rPr>
-                      <w:rFonts w:ascii="Calibri" w:eastAsia="Calibri" w:hAnsi="Calibri" w:cs="Calibri"/>
-                      <w:color w:val="FFFEFD"/>
-                      <w:spacing w:val="11"/>
-                      <w:w w:val="113"/>
-                      <w:sz w:val="20"/>
-                    </w:rPr>
-                    <w:t xml:space="preserve"> </w:t>
-                  </w:r>
-                  <w:r>
-                    <w:rPr>
-                      <w:rFonts w:ascii="Calibri" w:eastAsia="Calibri" w:hAnsi="Calibri" w:cs="Calibri"/>
-                      <w:color w:val="FFFEFD"/>
-                      <w:w w:val="113"/>
-                      <w:sz w:val="20"/>
-                    </w:rPr>
-                    <w:t>9998,</w:t>
-                  </w:r>
-                  <w:r>
-                    <w:rPr>
-                      <w:rFonts w:ascii="Calibri" w:eastAsia="Calibri" w:hAnsi="Calibri" w:cs="Calibri"/>
-                      <w:color w:val="FFFEFD"/>
-                      <w:spacing w:val="11"/>
-                      <w:w w:val="113"/>
-                      <w:sz w:val="20"/>
-                    </w:rPr>
-                    <w:t xml:space="preserve"> </w:t>
-                  </w:r>
-                  <w:r>
-                    <w:rPr>
-                      <w:rFonts w:ascii="Calibri" w:eastAsia="Calibri" w:hAnsi="Calibri" w:cs="Calibri"/>
-                      <w:color w:val="FFFEFD"/>
-                      <w:w w:val="113"/>
-                      <w:sz w:val="20"/>
-                    </w:rPr>
-                    <w:t>Centro,</w:t>
-                  </w:r>
-                  <w:r>
-                    <w:rPr>
-                      <w:rFonts w:ascii="Calibri" w:eastAsia="Calibri" w:hAnsi="Calibri" w:cs="Calibri"/>
-                      <w:color w:val="FFFEFD"/>
-                      <w:spacing w:val="11"/>
-                      <w:w w:val="113"/>
-                      <w:sz w:val="20"/>
-                    </w:rPr>
-                    <w:t xml:space="preserve"> </w:t>
-                  </w:r>
-                  <w:r>
-                    <w:rPr>
-                      <w:rFonts w:ascii="Calibri" w:eastAsia="Calibri" w:hAnsi="Calibri" w:cs="Calibri"/>
-                      <w:color w:val="FFFEFD"/>
-                      <w:w w:val="113"/>
-                      <w:sz w:val="20"/>
-                    </w:rPr>
-                    <w:t>Boa</w:t>
-                  </w:r>
-                  <w:r>
-                    <w:rPr>
-                      <w:rFonts w:ascii="Calibri" w:eastAsia="Calibri" w:hAnsi="Calibri" w:cs="Calibri"/>
-                      <w:color w:val="FFFEFD"/>
-                      <w:spacing w:val="11"/>
-                      <w:w w:val="113"/>
-                      <w:sz w:val="20"/>
-                    </w:rPr>
-                    <w:t xml:space="preserve"> </w:t>
-                  </w:r>
-                  <w:r>
-                    <w:rPr>
-                      <w:rFonts w:ascii="Calibri" w:eastAsia="Calibri" w:hAnsi="Calibri" w:cs="Calibri"/>
-                      <w:color w:val="FFFEFD"/>
-                      <w:w w:val="113"/>
-                      <w:sz w:val="20"/>
-                    </w:rPr>
-                    <w:t>Vista</w:t>
-                  </w:r>
-                  <w:r>
-                    <w:rPr>
-                      <w:rFonts w:ascii="Calibri" w:eastAsia="Calibri" w:hAnsi="Calibri" w:cs="Calibri"/>
-                      <w:color w:val="FFFEFD"/>
-                      <w:spacing w:val="11"/>
-                      <w:w w:val="113"/>
-                      <w:sz w:val="20"/>
-                    </w:rPr>
-                    <w:t xml:space="preserve"> </w:t>
-                  </w:r>
-                  <w:r>
-                    <w:rPr>
-                      <w:rFonts w:ascii="Calibri" w:eastAsia="Calibri" w:hAnsi="Calibri" w:cs="Calibri"/>
-                      <w:color w:val="FFFEFD"/>
-                      <w:w w:val="113"/>
-                      <w:sz w:val="20"/>
-                    </w:rPr>
-                    <w:t>do</w:t>
-                  </w:r>
-                  <w:r>
-                    <w:rPr>
-                      <w:rFonts w:ascii="Calibri" w:eastAsia="Calibri" w:hAnsi="Calibri" w:cs="Calibri"/>
-                      <w:color w:val="FFFEFD"/>
-                      <w:spacing w:val="11"/>
-                      <w:w w:val="113"/>
-                      <w:sz w:val="20"/>
-                    </w:rPr>
-                    <w:t xml:space="preserve"> </w:t>
-                  </w:r>
-                  <w:r>
-                    <w:rPr>
-                      <w:rFonts w:ascii="Calibri" w:eastAsia="Calibri" w:hAnsi="Calibri" w:cs="Calibri"/>
-                      <w:color w:val="FFFEFD"/>
-                      <w:w w:val="113"/>
-                      <w:sz w:val="20"/>
-                    </w:rPr>
-                    <w:t>Tupim</w:t>
-                  </w:r>
-                  <w:r>
-                    <w:rPr>
-                      <w:rFonts w:ascii="Calibri" w:eastAsia="Calibri" w:hAnsi="Calibri" w:cs="Calibri"/>
-                      <w:color w:val="FFFEFD"/>
-                      <w:spacing w:val="11"/>
-                      <w:w w:val="113"/>
-                      <w:sz w:val="20"/>
-                    </w:rPr>
-                    <w:t xml:space="preserve"> </w:t>
-                  </w:r>
-                  <w:r>
-                    <w:rPr>
-                      <w:rFonts w:ascii="Calibri" w:eastAsia="Calibri" w:hAnsi="Calibri" w:cs="Calibri"/>
-                      <w:color w:val="FFFEFD"/>
-                      <w:w w:val="113"/>
-                      <w:sz w:val="20"/>
-                    </w:rPr>
-                    <w:t>-</w:t>
-                  </w:r>
-                  <w:r>
-                    <w:rPr>
-                      <w:rFonts w:ascii="Calibri" w:eastAsia="Calibri" w:hAnsi="Calibri" w:cs="Calibri"/>
-                      <w:color w:val="FFFEFD"/>
-                      <w:spacing w:val="11"/>
-                      <w:w w:val="113"/>
-                      <w:sz w:val="20"/>
-                    </w:rPr>
-                    <w:t xml:space="preserve"> </w:t>
-                  </w:r>
-                  <w:r>
-                    <w:rPr>
-                      <w:rFonts w:ascii="Calibri" w:eastAsia="Calibri" w:hAnsi="Calibri" w:cs="Calibri"/>
-                      <w:color w:val="FFFEFD"/>
-                      <w:w w:val="113"/>
-                      <w:sz w:val="20"/>
-                    </w:rPr>
-                    <w:t>BA</w:t>
-                  </w:r>
-                </w:p>
-              </w:txbxContent>
-            </v:textbox>
-          </v:rect>
-          <v:shape id="Shape 20" o:spid="_x0000_s1101" style="position:absolute;left:48693;top:3718;width:404;height:791;visibility:visible;mso-wrap-style:square;v-text-anchor:top" coordsize="40483,79167" o:spt="100" o:gfxdata="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" adj="0,,0" path="m34950,r5533,689l40483,47494,28740,36995v-432,-749,-406,-1448,229,-2158c29883,33808,30810,32766,31598,31636v635,-901,1193,-1892,673,-3111c30962,25477,29744,22378,28397,19342v-305,-686,-876,-1549,-1498,-1714c24790,17082,22530,16777,20714,18390v-3632,3213,-5220,7290,-4598,12116c16650,34519,18631,37922,20891,41211v3125,4554,6592,8653,10637,12021l40483,58083r,20660l35130,79167c29873,78432,24752,76568,19799,73673v-825,-483,-1549,-584,-2476,-343c13005,74511,8674,75616,4344,76734v-216,63,-445,76,-852,126c4140,74499,4725,72314,5334,70130v648,-2439,1359,-4877,1969,-7328c7404,62383,7201,61773,6947,61379,5181,58624,3734,55715,2654,52629,686,46978,,41173,673,35230,1727,25794,5652,17717,12421,11062,18694,4890,26213,1042,34950,xe" fillcolor="#fffefd" stroked="f" strokeweight="0">
-            <v:stroke miterlimit="83231f" joinstyle="miter"/>
-            <v:formulas/>
-            <v:path arrowok="t" o:connecttype="segments" textboxrect="0,0,40483,79167"/>
-          </v:shape>
-          <v:shape id="Shape 21" o:spid="_x0000_s1102" style="position:absolute;left:49097;top:3725;width:417;height:780;visibility:visible;mso-wrap-style:square;v-text-anchor:top" coordsize="41711,78054" o:spt="100" o:gfxdata="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" adj="0,,0" path="m,l15932,1984v6386,2725,11981,7284,16711,13685c39527,24991,41711,35658,39184,46961,35704,62506,26027,72705,10787,77200l,78054,,57394r5148,2788c7802,60957,10418,61871,13263,62024v1410,-305,2908,-407,4191,-966c22890,58684,24198,56347,24490,51521v51,-800,-114,-1498,-927,-1880c20236,48054,16921,46441,13581,44904v-1219,-559,-1791,-318,-2617,775c10063,46822,9187,47965,8259,49070,6405,51242,6380,51242,3713,50124l,46805,,xe" fillcolor="#fffefd" stroked="f" strokeweight="0">
-            <v:stroke miterlimit="83231f" joinstyle="miter"/>
-            <v:formulas/>
-            <v:path arrowok="t" o:connecttype="segments" textboxrect="0,0,41711,78054"/>
-          </v:shape>
-          <v:shape id="Shape 22" o:spid="_x0000_s1103" style="position:absolute;left:48326;top:3346;width:770;height:1541;visibility:visible;mso-wrap-style:square;v-text-anchor:top" coordsize="77020,154037" o:spt="100" o:gfxdata="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" adj="0,,0" path="m77020,r,29211l67061,29556v-5218,1102,-10228,3127,-14991,6105c38164,44373,30404,56997,29096,73418v-762,9449,1384,18288,5918,26594c35230,100380,35280,100964,35154,101384v-1918,7074,-3887,14135,-5830,21209c29096,123469,28880,124358,28588,125463v1778,-457,3302,-851,4825,-1245c40068,122479,46711,120738,53378,119024v445,-114,1042,13,1486,190c56350,119837,57772,120611,59271,121208v5429,2127,10919,3340,16422,3539l77020,124542r,29495l47042,147986c19395,136293,,108920,,77012,,45114,19395,17743,47042,6052l77020,xe" fillcolor="#fffefd" stroked="f" strokeweight="0">
-            <v:stroke miterlimit="83231f" joinstyle="miter"/>
-            <v:formulas/>
-            <v:path arrowok="t" o:connecttype="segments" textboxrect="0,0,77020,154037"/>
-          </v:shape>
-          <v:shape id="Shape 23" o:spid="_x0000_s1104" style="position:absolute;left:49096;top:3346;width:770;height:1541;visibility:visible;mso-wrap-style:square;v-text-anchor:top" coordsize="77018,154039" o:spt="100" o:gfxdata="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" adj="0,,0" path="m5,c42537,,77018,34481,77018,77013v,42545,-34481,77026,-77013,77026l,154038,,124543r15182,-2343c33088,115913,44214,103315,47617,84557,50183,70434,46652,57531,37572,46381,29507,36462,19004,30645,6279,28994l,29211,,1,5,xe" fillcolor="#fffefd" stroked="f" strokeweight="0">
-            <v:stroke miterlimit="83231f" joinstyle="miter"/>
-            <v:formulas/>
-            <v:path arrowok="t" o:connecttype="segments" textboxrect="0,0,77018,154039"/>
-          </v:shape>
-          <v:rect id="Rectangle 1056" o:spid="_x0000_s1105" style="position:absolute;left:50486;top:3416;width:1771;height:2052;visibility:visible;mso-wrap-style:square;v-text-anchor:top" o:gfxdata="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" filled="f" stroked="f">
-            <v:textbox style="mso-next-textbox:#Rectangle 1056" inset="0,0,0,0">
-              <w:txbxContent>
-                <w:p>
-                  <w:r>
-                    <w:rPr>
-                      <w:rFonts w:ascii="Calibri" w:eastAsia="Calibri" w:hAnsi="Calibri" w:cs="Calibri"/>
-                      <w:color w:val="FFFEFD"/>
-                      <w:spacing w:val="-4"/>
-                      <w:w w:val="103"/>
-                      <w:sz w:val="20"/>
-                    </w:rPr>
-                    <w:t>75</w:t>
-                  </w:r>
-                </w:p>
-              </w:txbxContent>
-            </v:textbox>
-          </v:rect>
-          <v:rect id="Rectangle 1058" o:spid="_x0000_s1106" style="position:absolute;left:51818;top:3416;width:473;height:2052;visibility:visible;mso-wrap-style:square;v-text-anchor:top" o:gfxdata="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" filled="f" stroked="f">
-            <v:textbox style="mso-next-textbox:#Rectangle 1058" inset="0,0,0,0">
-              <w:txbxContent>
-                <w:p>
-                  <w:r>
-                    <w:rPr>
-                      <w:rFonts w:ascii="Calibri" w:eastAsia="Calibri" w:hAnsi="Calibri" w:cs="Calibri"/>
-                      <w:color w:val="FFFEFD"/>
-                      <w:sz w:val="20"/>
-                    </w:rPr>
-                    <w:t xml:space="preserve"> </w:t>
-                  </w:r>
-                </w:p>
-              </w:txbxContent>
-            </v:textbox>
-          </v:rect>
-          <v:rect id="Rectangle 1057" o:spid="_x0000_s1107" style="position:absolute;left:52174;top:3416;width:967;height:2052;visibility:visible;mso-wrap-style:square;v-text-anchor:top" o:gfxdata="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" filled="f" stroked="f">
-            <v:textbox style="mso-next-textbox:#Rectangle 1057" inset="0,0,0,0">
-              <w:txbxContent>
-                <w:p>
-                  <w:r>
-                    <w:rPr>
-                      <w:rFonts w:ascii="Calibri" w:eastAsia="Calibri" w:hAnsi="Calibri" w:cs="Calibri"/>
-                      <w:color w:val="FFFEFD"/>
-                      <w:w w:val="112"/>
-                      <w:sz w:val="20"/>
-                    </w:rPr>
-                    <w:t>9</w:t>
-                  </w:r>
-                </w:p>
-              </w:txbxContent>
-            </v:textbox>
-          </v:rect>
-          <v:rect id="Rectangle 25" o:spid="_x0000_s1108" style="position:absolute;left:52901;top:3390;width:8878;height:2111;visibility:visible;mso-wrap-style:square;v-text-anchor:top" o:gfxdata="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" filled="f" stroked="f">
-            <v:textbox style="mso-next-textbox:#Rectangle 25" inset="0,0,0,0">
-              <w:txbxContent>
-                <w:p>
-                  <w:r>
-                    <w:rPr>
-                      <w:rFonts w:ascii="Calibri" w:eastAsia="Calibri" w:hAnsi="Calibri" w:cs="Calibri"/>
-                      <w:b/>
-                      <w:color w:val="FFFEFD"/>
-                      <w:w w:val="122"/>
-                      <w:sz w:val="20"/>
-                    </w:rPr>
-                    <w:t>8354.3553</w:t>
-                  </w:r>
-                </w:p>
-              </w:txbxContent>
-            </v:textbox>
-          </v:rect>
-          <v:shape id="Shape 26" o:spid="_x0000_s1109" style="position:absolute;left:35664;top:3476;width:642;height:1281;visibility:visible;mso-wrap-style:square;v-text-anchor:top" coordsize="64292,128048" o:spt="100" o:gfxdata="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" adj="0,,0" path="m50584,l64292,36r,11739l47866,11620v-4851,,-9741,279,-14567,800c22111,13614,14592,20497,12852,31635v-902,5664,-1028,11469,-1092,17209c11620,60160,11671,71488,11849,82817v51,4661,254,9372,1029,13944c14440,105956,19723,112192,28854,114757v2350,660,4814,1117,7252,1232c42697,116281,49288,116509,55880,116484r8412,-127l64292,128048r-20058,-83c38748,127850,33147,127597,27825,126416,12497,123024,2806,112052,1029,96342,330,90106,178,83782,114,77482,,66319,76,55131,216,43967,305,37770,444,31546,2248,25540,6388,11709,15786,3556,29845,1270,36652,165,43662,102,50584,xe" fillcolor="#fffefd" stroked="f" strokeweight="0">
-            <v:stroke miterlimit="83231f" joinstyle="miter"/>
-            <v:formulas/>
-            <v:path arrowok="t" o:connecttype="segments" textboxrect="0,0,64292,128048"/>
-          </v:shape>
-          <v:shape id="Shape 27" o:spid="_x0000_s1110" style="position:absolute;left:36306;top:3476;width:643;height:1281;visibility:visible;mso-wrap-style:square;v-text-anchor:top" coordsize="64207,128068" o:spt="100" o:gfxdata="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" adj="0,,0" path="m,l19820,52v6439,89,12903,242,19139,2197c52497,6529,60435,15877,62657,29681v1105,6960,1029,14110,1296,21184c64131,55742,63991,60619,63991,65483r216,c63953,74690,63889,83897,63381,93080v-546,9804,-3785,18542,-11265,25362c46376,123699,39480,126429,31885,127205v-6007,597,-12078,812,-18123,863l,128012,,116321r28494,-432c33917,115724,39061,114149,43404,110606v5728,-4661,8014,-11011,8382,-18060c52269,83059,52358,73560,52612,64073v-115,,-242,-13,-356,-13c52256,57570,52370,51068,52205,44579v-102,-4420,-267,-8878,-1016,-13221c49640,22239,44471,15940,35403,13374v-2819,-800,-5804,-1333,-8712,-1384l,11739,,xe" fillcolor="#fffefd" stroked="f" strokeweight="0">
-            <v:stroke miterlimit="83231f" joinstyle="miter"/>
-            <v:formulas/>
-            <v:path arrowok="t" o:connecttype="segments" textboxrect="0,0,64207,128068"/>
-          </v:shape>
-          <v:shape id="Shape 28" o:spid="_x0000_s1111" style="position:absolute;left:35976;top:3787;width:329;height:659;visibility:visible;mso-wrap-style:square;v-text-anchor:top" coordsize="32976,65879" o:spt="100" o:gfxdata="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" adj="0,,0" path="m32976,r,11685l17948,17813v-3880,3825,-6277,9115,-6277,14969c11678,38846,14046,44213,17947,48061r15029,5998l32976,65845r-172,34c14732,65867,,51020,38,32859,76,19200,8429,7470,20265,2507l32976,xe" fillcolor="#fffefd" stroked="f" strokeweight="0">
-            <v:stroke miterlimit="83231f" joinstyle="miter"/>
-            <v:formulas/>
-            <v:path arrowok="t" o:connecttype="segments" textboxrect="0,0,32976,65879"/>
-          </v:shape>
-          <v:shape id="Shape 29" o:spid="_x0000_s1112" style="position:absolute;left:36305;top:3787;width:330;height:659;visibility:visible;mso-wrap-style:square;v-text-anchor:top" coordsize="33001,65866" o:spt="100" o:gfxdata="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" adj="0,,0" path="m108,c18307,114,33001,14846,32950,32944v-38,13754,-8313,25421,-20201,30391l,65866,,54080r438,174c11830,54242,21317,44552,21304,32956,21291,21209,11805,11646,146,11646l,11705,,21,108,xe" fillcolor="#fffefd" stroked="f" strokeweight="0">
-            <v:stroke miterlimit="83231f" joinstyle="miter"/>
-            <v:formulas/>
-            <v:path arrowok="t" o:connecttype="segments" textboxrect="0,0,33001,65866"/>
-          </v:shape>
-          <v:shape id="Shape 30" o:spid="_x0000_s1113" style="position:absolute;left:36570;top:3697;width:155;height:155;visibility:visible;mso-wrap-style:square;v-text-anchor:top" coordsize="15469,15431" o:spt="100" o:gfxdata="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" adj="0,,0" path="m7671,v4343,,7798,3467,7759,7798c15392,12065,11976,15431,7671,15431,3391,15431,13,12027,,7734,,3442,3404,13,7671,xe" fillcolor="#fffefd" stroked="f" strokeweight="0">
-            <v:stroke miterlimit="83231f" joinstyle="miter"/>
-            <v:formulas/>
-            <v:path arrowok="t" o:connecttype="segments" textboxrect="0,0,15469,15431"/>
-          </v:shape>
-          <v:rect id="Rectangle 31" o:spid="_x0000_s1114" style="position:absolute;left:37536;top:3358;width:10675;height:2051;visibility:visible;mso-wrap-style:square;v-text-anchor:top" o:gfxdata="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" filled="f" stroked="f">
-            <v:textbox style="mso-next-textbox:#Rectangle 31" inset="0,0,0,0">
-              <w:txbxContent>
-                <w:p>
-                  <w:r>
-                    <w:rPr>
-                      <w:rFonts w:ascii="Calibri" w:eastAsia="Calibri" w:hAnsi="Calibri" w:cs="Calibri"/>
-                      <w:color w:val="FFFEFD"/>
-                      <w:w w:val="110"/>
-                      <w:sz w:val="20"/>
-                    </w:rPr>
-                    <w:t>dprol.projetos</w:t>
-                  </w:r>
-                </w:p>
-              </w:txbxContent>
-            </v:textbox>
-          </v:rect>
-          <v:shape id="Shape 32" o:spid="_x0000_s1115" style="position:absolute;left:16023;top:3658;width:262;height:918;visibility:visible;mso-wrap-style:square;v-text-anchor:top" coordsize="26238,91811" o:spt="100" o:gfxdata="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" adj="0,,0" path="m26238,r,12792l24511,12792v-152,178,-292,368,-444,546c24511,13580,25019,13745,25362,14075r876,878l26238,35893,12929,22584v-26,292,-77,724,-77,1143c12840,29937,12840,36160,12840,42383v,9030,12,18034,,27064c12827,70641,13157,71669,13970,72533v965,1028,1206,1028,2197,25l26238,62539r,29272l13386,91811c5677,91811,25,86160,25,78401,,56797,13,35208,13,13618,25,5503,5461,16,13576,3l26238,xe" fillcolor="#fffefd" stroked="f" strokeweight="0">
-            <v:stroke miterlimit="83231f" joinstyle="miter"/>
-            <v:formulas/>
-            <v:path arrowok="t" o:connecttype="segments" textboxrect="0,0,26238,91811"/>
-          </v:shape>
-          <v:shape id="Shape 33" o:spid="_x0000_s1116" style="position:absolute;left:16285;top:3807;width:373;height:769;visibility:visible;mso-wrap-style:square;v-text-anchor:top" coordsize="37326,76858" o:spt="100" o:gfxdata="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" adj="0,,0" path="m,l35522,35609r1804,17l37326,51361r-1525,-30c34379,49934,32982,48524,31572,47102,29896,45426,28220,43737,26454,41946,18326,50163,10300,58265,2045,66609r35281,l37326,76858,,76858,,47585,9703,37933v1283,-1270,2578,-2515,3696,-3594l,20940,,xe" fillcolor="#fffefd" stroked="f" strokeweight="0">
-            <v:stroke miterlimit="83231f" joinstyle="miter"/>
-            <v:formulas/>
-            <v:path arrowok="t" o:connecttype="segments" textboxrect="0,0,37326,76858"/>
-          </v:shape>
-          <v:shape id="Shape 34" o:spid="_x0000_s1117" style="position:absolute;left:16285;top:3657;width:373;height:129;visibility:visible;mso-wrap-style:square;v-text-anchor:top" coordsize="37326,12802" o:spt="100" o:gfxdata="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" adj="0,,0" path="m37326,r,12802l,12802,,9,37326,xe" fillcolor="#fffefd" stroked="f" strokeweight="0">
-            <v:stroke miterlimit="83231f" joinstyle="miter"/>
-            <v:formulas/>
-            <v:path arrowok="t" o:connecttype="segments" textboxrect="0,0,37326,12802"/>
-          </v:shape>
-          <v:shape id="Shape 35" o:spid="_x0000_s1118" style="position:absolute;left:16658;top:3805;width:377;height:771;visibility:visible;mso-wrap-style:square;v-text-anchor:top" coordsize="37668,77054" o:spt="100" o:gfxdata="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" adj="0,,0" path="m37668,r,18935l22072,34243v216,305,267,418,331,508l37668,49988r,27066l,77054,,66805r35281,c26899,58690,18745,50778,10566,42853,9042,44365,7658,45724,6261,47095,4737,48606,3238,50143,1651,51591l,51557,,35822r2159,21c6464,31512,10769,27156,15075,22826l37668,xe" fillcolor="#fffefd" stroked="f" strokeweight="0">
-            <v:stroke miterlimit="83231f" joinstyle="miter"/>
-            <v:formulas/>
-            <v:path arrowok="t" o:connecttype="segments" textboxrect="0,0,37668,77054"/>
-          </v:shape>
-          <v:shape id="Shape 36" o:spid="_x0000_s1119" style="position:absolute;left:16658;top:3657;width:377;height:129;visibility:visible;mso-wrap-style:square;v-text-anchor:top" coordsize="37668,12812" o:spt="100" o:gfxdata="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" adj="0,,0" path="m37668,r,12812l,12812,,10r267,l37668,xe" fillcolor="#fffefd" stroked="f" strokeweight="0">
-            <v:stroke miterlimit="83231f" joinstyle="miter"/>
-            <v:formulas/>
-            <v:path arrowok="t" o:connecttype="segments" textboxrect="0,0,37668,12812"/>
-          </v:shape>
-          <v:shape id="Shape 37" o:spid="_x0000_s1120" style="position:absolute;left:17035;top:3657;width:266;height:919;visibility:visible;mso-wrap-style:square;v-text-anchor:top" coordsize="26543,91846" o:spt="100" o:gfxdata="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" adj="0,,0" path="m12700,12c18250,,22530,2184,25019,7138v914,1790,1422,3987,1435,5994c26543,35014,26530,56883,26492,78778v-13,7455,-5766,13068,-13246,13068l,91846,,64780,11900,76657v241,241,952,305,1283,140c14961,75794,15596,74155,15596,72174v,-17272,,-34544,-13,-51829c15583,19710,15430,19088,15379,18631l,33727,,14792r914,-924c1181,13589,1410,13297,1816,12827l,12827,,16,12700,12xe" fillcolor="#fffefd" stroked="f" strokeweight="0">
-            <v:stroke miterlimit="83231f" joinstyle="miter"/>
-            <v:formulas/>
-            <v:path arrowok="t" o:connecttype="segments" textboxrect="0,0,26543,91846"/>
-          </v:shape>
-          <v:rect id="Rectangle 38" o:spid="_x0000_s1121" style="position:absolute;left:18025;top:3358;width:19661;height:2051;visibility:visible;mso-wrap-style:square;v-text-anchor:top" o:gfxdata="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" filled="f" stroked="f">
-            <v:textbox style="mso-next-textbox:#Rectangle 38" inset="0,0,0,0">
-              <w:txbxContent>
-                <w:p>
-                  <w:r>
-                    <w:rPr>
-                      <w:rFonts w:ascii="Calibri" w:eastAsia="Calibri" w:hAnsi="Calibri" w:cs="Calibri"/>
-                      <w:color w:val="FFFEFD"/>
-                      <w:w w:val="110"/>
-                      <w:sz w:val="20"/>
-                    </w:rPr>
-                    <w:t>dprolprojetos@gmail.com</w:t>
-                  </w:r>
-                </w:p>
-              </w:txbxContent>
-            </v:textbox>
-          </v:rect>
-          <v:rect id="Rectangle 106" o:spid="_x0000_s1122" style="position:absolute;left:22609;top:5000;width:40407;height:2176;visibility:visible;mso-wrap-style:square;v-text-anchor:top" o:gfxdata="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" filled="f" stroked="f">
-            <v:textbox style="mso-next-textbox:#Rectangle 106" inset="0,0,0,0">
-              <w:txbxContent>
-                <w:p>
-                  <w:r>
-                    <w:rPr>
-                      <w:rFonts w:ascii="Calibri" w:eastAsia="Calibri" w:hAnsi="Calibri" w:cs="Calibri"/>
-                      <w:color w:val="FFFEFD"/>
-                      <w:w w:val="111"/>
-                      <w:sz w:val="21"/>
-                    </w:rPr>
-                    <w:t>CNPJ:</w:t>
-                  </w:r>
-                  <w:r>
-                    <w:rPr>
-                      <w:rFonts w:ascii="Calibri" w:eastAsia="Calibri" w:hAnsi="Calibri" w:cs="Calibri"/>
-                      <w:color w:val="FFFEFD"/>
-                      <w:spacing w:val="11"/>
-                      <w:w w:val="111"/>
-                      <w:sz w:val="21"/>
-                    </w:rPr>
-                    <w:t xml:space="preserve"> </w:t>
-                  </w:r>
-                  <w:r>
-                    <w:rPr>
-                      <w:rFonts w:ascii="Calibri" w:eastAsia="Calibri" w:hAnsi="Calibri" w:cs="Calibri"/>
-                      <w:color w:val="FFFEFD"/>
-                      <w:w w:val="111"/>
-                      <w:sz w:val="21"/>
-                    </w:rPr>
-                    <w:t>37.638.987/0001-84</w:t>
-                  </w:r>
-                  <w:r>
-                    <w:rPr>
-                      <w:rFonts w:ascii="Calibri" w:eastAsia="Calibri" w:hAnsi="Calibri" w:cs="Calibri"/>
-                      <w:color w:val="FFFEFD"/>
-                      <w:spacing w:val="11"/>
-                      <w:w w:val="111"/>
-                      <w:sz w:val="21"/>
-                    </w:rPr>
-                    <w:t xml:space="preserve">  </w:t>
-                  </w:r>
-                  <w:r>
-                    <w:rPr>
-                      <w:rFonts w:ascii="Calibri" w:eastAsia="Calibri" w:hAnsi="Calibri" w:cs="Calibri"/>
-                      <w:color w:val="FFFEFD"/>
-                      <w:w w:val="111"/>
-                      <w:sz w:val="21"/>
-                    </w:rPr>
-                    <w:t>-</w:t>
-                  </w:r>
-                  <w:r>
-                    <w:rPr>
-                      <w:rFonts w:ascii="Calibri" w:eastAsia="Calibri" w:hAnsi="Calibri" w:cs="Calibri"/>
-                      <w:color w:val="FFFEFD"/>
-                      <w:spacing w:val="11"/>
-                      <w:w w:val="111"/>
-                      <w:sz w:val="21"/>
-                    </w:rPr>
-                    <w:t xml:space="preserve">  </w:t>
-                  </w:r>
-                  <w:r>
-                    <w:rPr>
-                      <w:rFonts w:ascii="Calibri" w:eastAsia="Calibri" w:hAnsi="Calibri" w:cs="Calibri"/>
-                      <w:color w:val="FFFEFD"/>
-                      <w:w w:val="111"/>
-                      <w:sz w:val="21"/>
-                    </w:rPr>
-                    <w:t>CFTA:</w:t>
-                  </w:r>
-                  <w:r>
-                    <w:rPr>
-                      <w:rFonts w:ascii="Calibri" w:eastAsia="Calibri" w:hAnsi="Calibri" w:cs="Calibri"/>
-                      <w:color w:val="FFFEFD"/>
-                      <w:spacing w:val="11"/>
-                      <w:w w:val="111"/>
-                      <w:sz w:val="21"/>
-                    </w:rPr>
-                    <w:t xml:space="preserve"> </w:t>
-                  </w:r>
-                  <w:r>
-                    <w:rPr>
-                      <w:rFonts w:ascii="Calibri" w:eastAsia="Calibri" w:hAnsi="Calibri" w:cs="Calibri"/>
-                      <w:color w:val="FFFEFD"/>
-                      <w:w w:val="111"/>
-                      <w:sz w:val="21"/>
-                    </w:rPr>
-                    <w:t>05788394589</w:t>
-                  </w:r>
-                </w:p>
-              </w:txbxContent>
-            </v:textbox>
-          </v:rect>
-          <w10:wrap type="topAndBottom" anchorx="page" anchory="page"/>
-        </v:group>
-      </w:pict>
-    </w:r>
-    <w:r>
-      <w:rPr>
-        <w:noProof/>
-        <w:lang w:val="pt-BR" w:eastAsia="pt-BR" w:bidi="ar-SA"/>
-      </w:rPr>
-      <w:drawing>
-        <wp:anchor distT="0" distB="0" distL="114300" distR="114300" simplePos="0" relativeHeight="251664384" behindDoc="0" locked="0" layoutInCell="1" allowOverlap="1" wp14:anchorId="187F50C7" wp14:editId="674AADE5">
-          <wp:simplePos x="0" y="0"/>
-          <wp:positionH relativeFrom="margin">
-            <wp:posOffset>-279400</wp:posOffset>
-          </wp:positionH>
-          <wp:positionV relativeFrom="margin">
-            <wp:posOffset>7829550</wp:posOffset>
-          </wp:positionV>
-          <wp:extent cx="7904480" cy="1238250"/>
-          <wp:effectExtent l="19050" t="0" r="1270" b="0"/>
-          <wp:wrapSquare wrapText="bothSides"/>
-          <wp:docPr id="72" name="Imagem 72" descr="Rodapé Jacobina.png"/>
-          <wp:cNvGraphicFramePr>
-            <a:graphicFrameLocks xmlns:a="http://schemas.openxmlformats.org/drawingml/2006/main" noChangeAspect="1"/>
-          </wp:cNvGraphicFramePr>
-          <a:graphic xmlns:a="http://schemas.openxmlformats.org/drawingml/2006/main">
-            <a:graphicData uri="http://schemas.openxmlformats.org/drawingml/2006/picture">
-              <pic:pic xmlns:pic="http://schemas.openxmlformats.org/drawingml/2006/picture">
-                <pic:nvPicPr>
-                  <pic:cNvPr id="0" name="Rodapé Jacobina.png"/>
-                  <pic:cNvPicPr/>
-                </pic:nvPicPr>
-                <pic:blipFill>
-                  <a:blip r:embed="rId1"/>
-                  <a:stretch>
-                    <a:fillRect/>
-                  </a:stretch>
-                </pic:blipFill>
-                <pic:spPr>
-                  <a:xfrm>
-                    <a:off x="0" y="0"/>
-                    <a:ext cx="7904480" cy="1238250"/>
-                  </a:xfrm>
-                  <a:prstGeom prst="rect">
-                    <a:avLst/>
-                  </a:prstGeom>
-                </pic:spPr>
-              </pic:pic>
-            </a:graphicData>
-          </a:graphic>
-        </wp:anchor>
-      </w:drawing>
-    </w:r>
-    <w:r>
-      <w:rPr>
-        <w:noProof/>
-      </w:rPr>
-      <w:pict w14:anchorId="36FE0E99">
-        <v:group id="_x0000_s1123" style="position:absolute;left:0;text-align:left;margin-left:-.25pt;margin-top:768.75pt;width:595.5pt;height:58pt;z-index:251670528;mso-position-horizontal-relative:page;mso-position-vertical-relative:page;mso-width-relative:margin;mso-height-relative:margin" coordorigin="-63,381" coordsize="75631,7366" o:gfxdata="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">
-          <v:shape id="_x0000_s1124" style="position:absolute;left:-31;top:1079;width:75599;height:6668;visibility:visible;mso-wrap-style:square;v-text-anchor:top" coordsize="7560005,666750" o:spt="100" o:gfxdata="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" adj="0,,0" path="m,l7560005,r,666750l,666750,,e" fillcolor="#295c2f" stroked="f" strokeweight="0">
-            <v:stroke miterlimit="83231f" joinstyle="miter"/>
-            <v:formulas/>
-            <v:path arrowok="t" o:connecttype="segments" textboxrect="0,0,7560005,666750"/>
-          </v:shape>
-          <v:shape id="Shape 1142" o:spid="_x0000_s1125" style="position:absolute;left:-63;top:381;width:75599;height:889;visibility:visible;mso-wrap-style:square;v-text-anchor:top" coordsize="7560005,88900" o:spt="100" o:gfxdata="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" adj="0,,0" path="m,l7560005,r,88900l,88900,,e" fillcolor="#4e4d48" stroked="f" strokeweight="0">
-            <v:stroke miterlimit="83231f" joinstyle="miter"/>
-            <v:formulas/>
-            <v:path arrowok="t" o:connecttype="segments" textboxrect="0,0,7560005,88900"/>
-          </v:shape>
-          <v:shape id="Shape 17" o:spid="_x0000_s1126" style="position:absolute;left:18862;top:1825;width:453;height:1247;visibility:visible;mso-wrap-style:square;v-text-anchor:top" coordsize="45288,124675" o:spt="100" o:gfxdata="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" adj="0,,0" path="m45288,r,27686c35560,27686,27673,35572,27673,45288v,9741,7887,17628,17615,17628l45288,124675c165,79565,,45288,,45288,,20282,20269,,45288,xe" fillcolor="#fffefd" stroked="f" strokeweight="0">
-            <v:stroke miterlimit="83231f" joinstyle="miter"/>
-            <v:formulas/>
-            <v:path arrowok="t" o:connecttype="segments" textboxrect="0,0,45288,124675"/>
-          </v:shape>
-          <v:shape id="Shape 18" o:spid="_x0000_s1127" style="position:absolute;left:19315;top:1825;width:453;height:1247;visibility:visible;mso-wrap-style:square;v-text-anchor:top" coordsize="45301,124675" o:spt="100" o:gfxdata="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" adj="0,,0" path="m,c25019,,45301,20282,45301,45288v,,-838,34925,-45301,79387l,62916v9728,,17615,-7887,17615,-17628c17615,35572,9728,27686,,27686l,xe" fillcolor="#fffefd" stroked="f" strokeweight="0">
-            <v:stroke miterlimit="83231f" joinstyle="miter"/>
-            <v:formulas/>
-            <v:path arrowok="t" o:connecttype="segments" textboxrect="0,0,45301,124675"/>
-          </v:shape>
-          <v:rect id="Rectangle 19" o:spid="_x0000_s1128" style="position:absolute;left:20329;top:1824;width:48424;height:2051;visibility:visible;mso-wrap-style:square;v-text-anchor:top" o:gfxdata="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" filled="f" stroked="f">
-            <v:textbox inset="0,0,0,0">
-              <w:txbxContent>
-                <w:p>
-                  <w:r>
-                    <w:rPr>
-                      <w:rFonts w:ascii="Calibri" w:eastAsia="Calibri" w:hAnsi="Calibri" w:cs="Calibri"/>
-                      <w:color w:val="FFFEFD"/>
-                      <w:w w:val="113"/>
-                      <w:sz w:val="20"/>
-                    </w:rPr>
-                    <w:t>Rua</w:t>
-                  </w:r>
-                  <w:r>
-                    <w:rPr>
-                      <w:rFonts w:ascii="Calibri" w:eastAsia="Calibri" w:hAnsi="Calibri" w:cs="Calibri"/>
-                      <w:color w:val="FFFEFD"/>
-                      <w:spacing w:val="11"/>
-                      <w:w w:val="113"/>
-                      <w:sz w:val="20"/>
-                    </w:rPr>
-                    <w:t xml:space="preserve"> </w:t>
-                  </w:r>
-                  <w:r>
-                    <w:rPr>
-                      <w:rFonts w:ascii="Calibri" w:eastAsia="Calibri" w:hAnsi="Calibri" w:cs="Calibri"/>
-                      <w:color w:val="FFFEFD"/>
-                      <w:w w:val="113"/>
-                      <w:sz w:val="20"/>
-                    </w:rPr>
-                    <w:t>Lag</w:t>
-                  </w:r>
-                  <w:r>
-                    <w:rPr>
-                      <w:rFonts w:ascii="Calibri" w:eastAsia="Calibri" w:hAnsi="Calibri" w:cs="Calibri"/>
-                      <w:color w:val="FFFEFD"/>
-                      <w:spacing w:val="11"/>
-                      <w:w w:val="113"/>
-                      <w:sz w:val="20"/>
-                    </w:rPr>
-                    <w:t xml:space="preserve"> </w:t>
-                  </w:r>
-                  <w:r>
-                    <w:rPr>
-                      <w:rFonts w:ascii="Calibri" w:eastAsia="Calibri" w:hAnsi="Calibri" w:cs="Calibri"/>
-                      <w:color w:val="FFFEFD"/>
-                      <w:w w:val="113"/>
-                      <w:sz w:val="20"/>
-                    </w:rPr>
-                    <w:t>do</w:t>
-                  </w:r>
-                  <w:r>
-                    <w:rPr>
-                      <w:rFonts w:ascii="Calibri" w:eastAsia="Calibri" w:hAnsi="Calibri" w:cs="Calibri"/>
-                      <w:color w:val="FFFEFD"/>
-                      <w:spacing w:val="11"/>
-                      <w:w w:val="113"/>
-                      <w:sz w:val="20"/>
-                    </w:rPr>
-                    <w:t xml:space="preserve"> </w:t>
-                  </w:r>
-                  <w:r>
-                    <w:rPr>
-                      <w:rFonts w:ascii="Calibri" w:eastAsia="Calibri" w:hAnsi="Calibri" w:cs="Calibri"/>
-                      <w:color w:val="FFFEFD"/>
-                      <w:w w:val="113"/>
-                      <w:sz w:val="20"/>
-                    </w:rPr>
-                    <w:t>San</w:t>
-                  </w:r>
-                  <w:r>
-                    <w:rPr>
-                      <w:rFonts w:ascii="Calibri" w:eastAsia="Calibri" w:hAnsi="Calibri" w:cs="Calibri"/>
-                      <w:color w:val="FFFEFD"/>
-                      <w:spacing w:val="11"/>
-                      <w:w w:val="113"/>
-                      <w:sz w:val="20"/>
-                    </w:rPr>
-                    <w:t xml:space="preserve"> </w:t>
-                  </w:r>
-                  <w:r>
-                    <w:rPr>
-                      <w:rFonts w:ascii="Calibri" w:eastAsia="Calibri" w:hAnsi="Calibri" w:cs="Calibri"/>
-                      <w:color w:val="FFFEFD"/>
-                      <w:w w:val="113"/>
-                      <w:sz w:val="20"/>
-                    </w:rPr>
-                    <w:t>Juan,</w:t>
-                  </w:r>
-                  <w:r>
-                    <w:rPr>
-                      <w:rFonts w:ascii="Calibri" w:eastAsia="Calibri" w:hAnsi="Calibri" w:cs="Calibri"/>
-                      <w:color w:val="FFFEFD"/>
-                      <w:spacing w:val="11"/>
-                      <w:w w:val="113"/>
-                      <w:sz w:val="20"/>
-                    </w:rPr>
-                    <w:t xml:space="preserve"> </w:t>
-                  </w:r>
-                  <w:r>
-                    <w:rPr>
-                      <w:rFonts w:ascii="Calibri" w:eastAsia="Calibri" w:hAnsi="Calibri" w:cs="Calibri"/>
-                      <w:color w:val="FFFEFD"/>
-                      <w:w w:val="113"/>
-                      <w:sz w:val="20"/>
-                    </w:rPr>
-                    <w:t>n°</w:t>
-                  </w:r>
-                  <w:r>
-                    <w:rPr>
-                      <w:rFonts w:ascii="Calibri" w:eastAsia="Calibri" w:hAnsi="Calibri" w:cs="Calibri"/>
-                      <w:color w:val="FFFEFD"/>
-                      <w:spacing w:val="11"/>
-                      <w:w w:val="113"/>
-                      <w:sz w:val="20"/>
-                    </w:rPr>
-                    <w:t xml:space="preserve"> </w:t>
-                  </w:r>
-                  <w:r>
-                    <w:rPr>
-                      <w:rFonts w:ascii="Calibri" w:eastAsia="Calibri" w:hAnsi="Calibri" w:cs="Calibri"/>
-                      <w:color w:val="FFFEFD"/>
-                      <w:w w:val="113"/>
-                      <w:sz w:val="20"/>
-                    </w:rPr>
-                    <w:t>9998,</w:t>
-                  </w:r>
-                  <w:r>
-                    <w:rPr>
-                      <w:rFonts w:ascii="Calibri" w:eastAsia="Calibri" w:hAnsi="Calibri" w:cs="Calibri"/>
-                      <w:color w:val="FFFEFD"/>
-                      <w:spacing w:val="11"/>
-                      <w:w w:val="113"/>
-                      <w:sz w:val="20"/>
-                    </w:rPr>
-                    <w:t xml:space="preserve"> </w:t>
-                  </w:r>
-                  <w:r>
-                    <w:rPr>
-                      <w:rFonts w:ascii="Calibri" w:eastAsia="Calibri" w:hAnsi="Calibri" w:cs="Calibri"/>
-                      <w:color w:val="FFFEFD"/>
-                      <w:w w:val="113"/>
-                      <w:sz w:val="20"/>
-                    </w:rPr>
-                    <w:t>Centro,</w:t>
-                  </w:r>
-                  <w:r>
-                    <w:rPr>
-                      <w:rFonts w:ascii="Calibri" w:eastAsia="Calibri" w:hAnsi="Calibri" w:cs="Calibri"/>
-                      <w:color w:val="FFFEFD"/>
-                      <w:spacing w:val="11"/>
-                      <w:w w:val="113"/>
-                      <w:sz w:val="20"/>
-                    </w:rPr>
-                    <w:t xml:space="preserve"> </w:t>
-                  </w:r>
-                  <w:r>
-                    <w:rPr>
-                      <w:rFonts w:ascii="Calibri" w:eastAsia="Calibri" w:hAnsi="Calibri" w:cs="Calibri"/>
-                      <w:color w:val="FFFEFD"/>
-                      <w:w w:val="113"/>
-                      <w:sz w:val="20"/>
-                    </w:rPr>
-                    <w:t>Boa</w:t>
-                  </w:r>
-                  <w:r>
-                    <w:rPr>
-                      <w:rFonts w:ascii="Calibri" w:eastAsia="Calibri" w:hAnsi="Calibri" w:cs="Calibri"/>
-                      <w:color w:val="FFFEFD"/>
-                      <w:spacing w:val="11"/>
-                      <w:w w:val="113"/>
-                      <w:sz w:val="20"/>
-                    </w:rPr>
-                    <w:t xml:space="preserve"> </w:t>
-                  </w:r>
-                  <w:r>
-                    <w:rPr>
-                      <w:rFonts w:ascii="Calibri" w:eastAsia="Calibri" w:hAnsi="Calibri" w:cs="Calibri"/>
-                      <w:color w:val="FFFEFD"/>
-                      <w:w w:val="113"/>
-                      <w:sz w:val="20"/>
-                    </w:rPr>
-                    <w:t>Vista</w:t>
-                  </w:r>
-                  <w:r>
-                    <w:rPr>
-                      <w:rFonts w:ascii="Calibri" w:eastAsia="Calibri" w:hAnsi="Calibri" w:cs="Calibri"/>
-                      <w:color w:val="FFFEFD"/>
-                      <w:spacing w:val="11"/>
-                      <w:w w:val="113"/>
-                      <w:sz w:val="20"/>
-                    </w:rPr>
-                    <w:t xml:space="preserve"> </w:t>
-                  </w:r>
-                  <w:r>
-                    <w:rPr>
-                      <w:rFonts w:ascii="Calibri" w:eastAsia="Calibri" w:hAnsi="Calibri" w:cs="Calibri"/>
-                      <w:color w:val="FFFEFD"/>
-                      <w:w w:val="113"/>
-                      <w:sz w:val="20"/>
-                    </w:rPr>
-                    <w:t>do</w:t>
-                  </w:r>
-                  <w:r>
-                    <w:rPr>
-                      <w:rFonts w:ascii="Calibri" w:eastAsia="Calibri" w:hAnsi="Calibri" w:cs="Calibri"/>
-                      <w:color w:val="FFFEFD"/>
-                      <w:spacing w:val="11"/>
-                      <w:w w:val="113"/>
-                      <w:sz w:val="20"/>
-                    </w:rPr>
-                    <w:t xml:space="preserve"> </w:t>
-                  </w:r>
-                  <w:r>
-                    <w:rPr>
-                      <w:rFonts w:ascii="Calibri" w:eastAsia="Calibri" w:hAnsi="Calibri" w:cs="Calibri"/>
-                      <w:color w:val="FFFEFD"/>
-                      <w:w w:val="113"/>
-                      <w:sz w:val="20"/>
-                    </w:rPr>
-                    <w:t>Tupim</w:t>
-                  </w:r>
-                  <w:r>
-                    <w:rPr>
-                      <w:rFonts w:ascii="Calibri" w:eastAsia="Calibri" w:hAnsi="Calibri" w:cs="Calibri"/>
-                      <w:color w:val="FFFEFD"/>
-                      <w:spacing w:val="11"/>
-                      <w:w w:val="113"/>
-                      <w:sz w:val="20"/>
-                    </w:rPr>
-                    <w:t xml:space="preserve"> </w:t>
-                  </w:r>
-                  <w:r>
-                    <w:rPr>
-                      <w:rFonts w:ascii="Calibri" w:eastAsia="Calibri" w:hAnsi="Calibri" w:cs="Calibri"/>
-                      <w:color w:val="FFFEFD"/>
-                      <w:w w:val="113"/>
-                      <w:sz w:val="20"/>
-                    </w:rPr>
-                    <w:t>-</w:t>
-                  </w:r>
-                  <w:r>
-                    <w:rPr>
-                      <w:rFonts w:ascii="Calibri" w:eastAsia="Calibri" w:hAnsi="Calibri" w:cs="Calibri"/>
-                      <w:color w:val="FFFEFD"/>
-                      <w:spacing w:val="11"/>
-                      <w:w w:val="113"/>
-                      <w:sz w:val="20"/>
-                    </w:rPr>
-                    <w:t xml:space="preserve"> </w:t>
-                  </w:r>
-                  <w:r>
-                    <w:rPr>
-                      <w:rFonts w:ascii="Calibri" w:eastAsia="Calibri" w:hAnsi="Calibri" w:cs="Calibri"/>
-                      <w:color w:val="FFFEFD"/>
-                      <w:w w:val="113"/>
-                      <w:sz w:val="20"/>
-                    </w:rPr>
-                    <w:t>BA</w:t>
-                  </w:r>
-                </w:p>
-              </w:txbxContent>
-            </v:textbox>
-          </v:rect>
-          <v:shape id="Shape 20" o:spid="_x0000_s1129" style="position:absolute;left:48693;top:3718;width:404;height:791;visibility:visible;mso-wrap-style:square;v-text-anchor:top" coordsize="40483,79167" o:spt="100" o:gfxdata="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" adj="0,,0" path="m34950,r5533,689l40483,47494,28740,36995v-432,-749,-406,-1448,229,-2158c29883,33808,30810,32766,31598,31636v635,-901,1193,-1892,673,-3111c30962,25477,29744,22378,28397,19342v-305,-686,-876,-1549,-1498,-1714c24790,17082,22530,16777,20714,18390v-3632,3213,-5220,7290,-4598,12116c16650,34519,18631,37922,20891,41211v3125,4554,6592,8653,10637,12021l40483,58083r,20660l35130,79167c29873,78432,24752,76568,19799,73673v-825,-483,-1549,-584,-2476,-343c13005,74511,8674,75616,4344,76734v-216,63,-445,76,-852,126c4140,74499,4725,72314,5334,70130v648,-2439,1359,-4877,1969,-7328c7404,62383,7201,61773,6947,61379,5181,58624,3734,55715,2654,52629,686,46978,,41173,673,35230,1727,25794,5652,17717,12421,11062,18694,4890,26213,1042,34950,xe" fillcolor="#fffefd" stroked="f" strokeweight="0">
-            <v:stroke miterlimit="83231f" joinstyle="miter"/>
-            <v:formulas/>
-            <v:path arrowok="t" o:connecttype="segments" textboxrect="0,0,40483,79167"/>
-          </v:shape>
-          <v:shape id="Shape 21" o:spid="_x0000_s1130" style="position:absolute;left:49097;top:3725;width:417;height:780;visibility:visible;mso-wrap-style:square;v-text-anchor:top" coordsize="41711,78054" o:spt="100" o:gfxdata="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" adj="0,,0" path="m,l15932,1984v6386,2725,11981,7284,16711,13685c39527,24991,41711,35658,39184,46961,35704,62506,26027,72705,10787,77200l,78054,,57394r5148,2788c7802,60957,10418,61871,13263,62024v1410,-305,2908,-407,4191,-966c22890,58684,24198,56347,24490,51521v51,-800,-114,-1498,-927,-1880c20236,48054,16921,46441,13581,44904v-1219,-559,-1791,-318,-2617,775c10063,46822,9187,47965,8259,49070,6405,51242,6380,51242,3713,50124l,46805,,xe" fillcolor="#fffefd" stroked="f" strokeweight="0">
-            <v:stroke miterlimit="83231f" joinstyle="miter"/>
-            <v:formulas/>
-            <v:path arrowok="t" o:connecttype="segments" textboxrect="0,0,41711,78054"/>
-          </v:shape>
-          <v:shape id="Shape 22" o:spid="_x0000_s1131" style="position:absolute;left:48326;top:3346;width:770;height:1541;visibility:visible;mso-wrap-style:square;v-text-anchor:top" coordsize="77020,154037" o:spt="100" o:gfxdata="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" adj="0,,0" path="m77020,r,29211l67061,29556v-5218,1102,-10228,3127,-14991,6105c38164,44373,30404,56997,29096,73418v-762,9449,1384,18288,5918,26594c35230,100380,35280,100964,35154,101384v-1918,7074,-3887,14135,-5830,21209c29096,123469,28880,124358,28588,125463v1778,-457,3302,-851,4825,-1245c40068,122479,46711,120738,53378,119024v445,-114,1042,13,1486,190c56350,119837,57772,120611,59271,121208v5429,2127,10919,3340,16422,3539l77020,124542r,29495l47042,147986c19395,136293,,108920,,77012,,45114,19395,17743,47042,6052l77020,xe" fillcolor="#fffefd" stroked="f" strokeweight="0">
-            <v:stroke miterlimit="83231f" joinstyle="miter"/>
-            <v:formulas/>
-            <v:path arrowok="t" o:connecttype="segments" textboxrect="0,0,77020,154037"/>
-          </v:shape>
-          <v:shape id="Shape 23" o:spid="_x0000_s1132" style="position:absolute;left:49096;top:3346;width:770;height:1541;visibility:visible;mso-wrap-style:square;v-text-anchor:top" coordsize="77018,154039" o:spt="100" o:gfxdata="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" adj="0,,0" path="m5,c42537,,77018,34481,77018,77013v,42545,-34481,77026,-77013,77026l,154038,,124543r15182,-2343c33088,115913,44214,103315,47617,84557,50183,70434,46652,57531,37572,46381,29507,36462,19004,30645,6279,28994l,29211,,1,5,xe" fillcolor="#fffefd" stroked="f" strokeweight="0">
-            <v:stroke miterlimit="83231f" joinstyle="miter"/>
-            <v:formulas/>
-            <v:path arrowok="t" o:connecttype="segments" textboxrect="0,0,77018,154039"/>
-          </v:shape>
-          <v:rect id="Rectangle 1056" o:spid="_x0000_s1133" style="position:absolute;left:50486;top:3416;width:1771;height:2052;visibility:visible;mso-wrap-style:square;v-text-anchor:top" o:gfxdata="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" filled="f" stroked="f">
-            <v:textbox inset="0,0,0,0">
-              <w:txbxContent>
-                <w:p>
-                  <w:r>
-                    <w:rPr>
-                      <w:rFonts w:ascii="Calibri" w:eastAsia="Calibri" w:hAnsi="Calibri" w:cs="Calibri"/>
-                      <w:color w:val="FFFEFD"/>
-                      <w:spacing w:val="-4"/>
-                      <w:w w:val="103"/>
-                      <w:sz w:val="20"/>
-                    </w:rPr>
-                    <w:t>75</w:t>
-                  </w:r>
-                </w:p>
-              </w:txbxContent>
-            </v:textbox>
-          </v:rect>
-          <v:rect id="Rectangle 1058" o:spid="_x0000_s1134" style="position:absolute;left:51818;top:3416;width:473;height:2052;visibility:visible;mso-wrap-style:square;v-text-anchor:top" o:gfxdata="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" filled="f" stroked="f">
-            <v:textbox inset="0,0,0,0">
-              <w:txbxContent>
-                <w:p>
-                  <w:r>
-                    <w:rPr>
-                      <w:rFonts w:ascii="Calibri" w:eastAsia="Calibri" w:hAnsi="Calibri" w:cs="Calibri"/>
-                      <w:color w:val="FFFEFD"/>
-                      <w:sz w:val="20"/>
-                    </w:rPr>
-                    <w:t xml:space="preserve"> </w:t>
-                  </w:r>
-                </w:p>
-              </w:txbxContent>
-            </v:textbox>
-          </v:rect>
-          <v:rect id="Rectangle 1057" o:spid="_x0000_s1135" style="position:absolute;left:52174;top:3416;width:967;height:2052;visibility:visible;mso-wrap-style:square;v-text-anchor:top" o:gfxdata="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" filled="f" stroked="f">
-            <v:textbox inset="0,0,0,0">
-              <w:txbxContent>
-                <w:p>
-                  <w:r>
-                    <w:rPr>
-                      <w:rFonts w:ascii="Calibri" w:eastAsia="Calibri" w:hAnsi="Calibri" w:cs="Calibri"/>
-                      <w:color w:val="FFFEFD"/>
-                      <w:w w:val="112"/>
-                      <w:sz w:val="20"/>
-                    </w:rPr>
-                    <w:t>9</w:t>
-                  </w:r>
-                </w:p>
-              </w:txbxContent>
-            </v:textbox>
-          </v:rect>
-          <v:rect id="Rectangle 25" o:spid="_x0000_s1136" style="position:absolute;left:52901;top:3390;width:8878;height:2111;visibility:visible;mso-wrap-style:square;v-text-anchor:top" o:gfxdata="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" filled="f" stroked="f">
-            <v:textbox inset="0,0,0,0">
-              <w:txbxContent>
-                <w:p>
-                  <w:r>
-                    <w:rPr>
-                      <w:rFonts w:ascii="Calibri" w:eastAsia="Calibri" w:hAnsi="Calibri" w:cs="Calibri"/>
-                      <w:b/>
-                      <w:color w:val="FFFEFD"/>
-                      <w:w w:val="122"/>
-                      <w:sz w:val="20"/>
-                    </w:rPr>
-                    <w:t>8354.3553</w:t>
-                  </w:r>
-                </w:p>
-              </w:txbxContent>
-            </v:textbox>
-          </v:rect>
-          <v:shape id="Shape 26" o:spid="_x0000_s1137" style="position:absolute;left:35664;top:3476;width:642;height:1281;visibility:visible;mso-wrap-style:square;v-text-anchor:top" coordsize="64292,128048" o:spt="100" o:gfxdata="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" adj="0,,0" path="m50584,l64292,36r,11739l47866,11620v-4851,,-9741,279,-14567,800c22111,13614,14592,20497,12852,31635v-902,5664,-1028,11469,-1092,17209c11620,60160,11671,71488,11849,82817v51,4661,254,9372,1029,13944c14440,105956,19723,112192,28854,114757v2350,660,4814,1117,7252,1232c42697,116281,49288,116509,55880,116484r8412,-127l64292,128048r-20058,-83c38748,127850,33147,127597,27825,126416,12497,123024,2806,112052,1029,96342,330,90106,178,83782,114,77482,,66319,76,55131,216,43967,305,37770,444,31546,2248,25540,6388,11709,15786,3556,29845,1270,36652,165,43662,102,50584,xe" fillcolor="#fffefd" stroked="f" strokeweight="0">
-            <v:stroke miterlimit="83231f" joinstyle="miter"/>
-            <v:formulas/>
-            <v:path arrowok="t" o:connecttype="segments" textboxrect="0,0,64292,128048"/>
-          </v:shape>
-          <v:shape id="Shape 27" o:spid="_x0000_s1138" style="position:absolute;left:36306;top:3476;width:643;height:1281;visibility:visible;mso-wrap-style:square;v-text-anchor:top" coordsize="64207,128068" o:spt="100" o:gfxdata="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" adj="0,,0" path="m,l19820,52v6439,89,12903,242,19139,2197c52497,6529,60435,15877,62657,29681v1105,6960,1029,14110,1296,21184c64131,55742,63991,60619,63991,65483r216,c63953,74690,63889,83897,63381,93080v-546,9804,-3785,18542,-11265,25362c46376,123699,39480,126429,31885,127205v-6007,597,-12078,812,-18123,863l,128012,,116321r28494,-432c33917,115724,39061,114149,43404,110606v5728,-4661,8014,-11011,8382,-18060c52269,83059,52358,73560,52612,64073v-115,,-242,-13,-356,-13c52256,57570,52370,51068,52205,44579v-102,-4420,-267,-8878,-1016,-13221c49640,22239,44471,15940,35403,13374v-2819,-800,-5804,-1333,-8712,-1384l,11739,,xe" fillcolor="#fffefd" stroked="f" strokeweight="0">
-            <v:stroke miterlimit="83231f" joinstyle="miter"/>
-            <v:formulas/>
-            <v:path arrowok="t" o:connecttype="segments" textboxrect="0,0,64207,128068"/>
-          </v:shape>
-          <v:shape id="Shape 28" o:spid="_x0000_s1139" style="position:absolute;left:35976;top:3787;width:329;height:659;visibility:visible;mso-wrap-style:square;v-text-anchor:top" coordsize="32976,65879" o:spt="100" o:gfxdata="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" adj="0,,0" path="m32976,r,11685l17948,17813v-3880,3825,-6277,9115,-6277,14969c11678,38846,14046,44213,17947,48061r15029,5998l32976,65845r-172,34c14732,65867,,51020,38,32859,76,19200,8429,7470,20265,2507l32976,xe" fillcolor="#fffefd" stroked="f" strokeweight="0">
-            <v:stroke miterlimit="83231f" joinstyle="miter"/>
-            <v:formulas/>
-            <v:path arrowok="t" o:connecttype="segments" textboxrect="0,0,32976,65879"/>
-          </v:shape>
-          <v:shape id="Shape 29" o:spid="_x0000_s1140" style="position:absolute;left:36305;top:3787;width:330;height:659;visibility:visible;mso-wrap-style:square;v-text-anchor:top" coordsize="33001,65866" o:spt="100" o:gfxdata="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" adj="0,,0" path="m108,c18307,114,33001,14846,32950,32944v-38,13754,-8313,25421,-20201,30391l,65866,,54080r438,174c11830,54242,21317,44552,21304,32956,21291,21209,11805,11646,146,11646l,11705,,21,108,xe" fillcolor="#fffefd" stroked="f" strokeweight="0">
-            <v:stroke miterlimit="83231f" joinstyle="miter"/>
-            <v:formulas/>
-            <v:path arrowok="t" o:connecttype="segments" textboxrect="0,0,33001,65866"/>
-          </v:shape>
-          <v:shape id="Shape 30" o:spid="_x0000_s1141" style="position:absolute;left:36570;top:3697;width:155;height:155;visibility:visible;mso-wrap-style:square;v-text-anchor:top" coordsize="15469,15431" o:spt="100" o:gfxdata="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" adj="0,,0" path="m7671,v4343,,7798,3467,7759,7798c15392,12065,11976,15431,7671,15431,3391,15431,13,12027,,7734,,3442,3404,13,7671,xe" fillcolor="#fffefd" stroked="f" strokeweight="0">
-            <v:stroke miterlimit="83231f" joinstyle="miter"/>
-            <v:formulas/>
-            <v:path arrowok="t" o:connecttype="segments" textboxrect="0,0,15469,15431"/>
-          </v:shape>
-          <v:rect id="Rectangle 31" o:spid="_x0000_s1142" style="position:absolute;left:37536;top:3358;width:10675;height:2051;visibility:visible;mso-wrap-style:square;v-text-anchor:top" o:gfxdata="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" filled="f" stroked="f">
-            <v:textbox inset="0,0,0,0">
-              <w:txbxContent>
-                <w:p>
-                  <w:r>
-                    <w:rPr>
-                      <w:rFonts w:ascii="Calibri" w:eastAsia="Calibri" w:hAnsi="Calibri" w:cs="Calibri"/>
-                      <w:color w:val="FFFEFD"/>
-                      <w:w w:val="110"/>
-                      <w:sz w:val="20"/>
-                    </w:rPr>
-                    <w:t>dprol.projetos</w:t>
-                  </w:r>
-                </w:p>
-              </w:txbxContent>
-            </v:textbox>
-          </v:rect>
-          <v:shape id="Shape 32" o:spid="_x0000_s1143" style="position:absolute;left:16023;top:3658;width:262;height:918;visibility:visible;mso-wrap-style:square;v-text-anchor:top" coordsize="26238,91811" o:spt="100" o:gfxdata="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" adj="0,,0" path="m26238,r,12792l24511,12792v-152,178,-292,368,-444,546c24511,13580,25019,13745,25362,14075r876,878l26238,35893,12929,22584v-26,292,-77,724,-77,1143c12840,29937,12840,36160,12840,42383v,9030,12,18034,,27064c12827,70641,13157,71669,13970,72533v965,1028,1206,1028,2197,25l26238,62539r,29272l13386,91811c5677,91811,25,86160,25,78401,,56797,13,35208,13,13618,25,5503,5461,16,13576,3l26238,xe" fillcolor="#fffefd" stroked="f" strokeweight="0">
-            <v:stroke miterlimit="83231f" joinstyle="miter"/>
-            <v:formulas/>
-            <v:path arrowok="t" o:connecttype="segments" textboxrect="0,0,26238,91811"/>
-          </v:shape>
-          <v:shape id="Shape 33" o:spid="_x0000_s1144" style="position:absolute;left:16285;top:3807;width:373;height:769;visibility:visible;mso-wrap-style:square;v-text-anchor:top" coordsize="37326,76858" o:spt="100" o:gfxdata="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" adj="0,,0" path="m,l35522,35609r1804,17l37326,51361r-1525,-30c34379,49934,32982,48524,31572,47102,29896,45426,28220,43737,26454,41946,18326,50163,10300,58265,2045,66609r35281,l37326,76858,,76858,,47585,9703,37933v1283,-1270,2578,-2515,3696,-3594l,20940,,xe" fillcolor="#fffefd" stroked="f" strokeweight="0">
-            <v:stroke miterlimit="83231f" joinstyle="miter"/>
-            <v:formulas/>
-            <v:path arrowok="t" o:connecttype="segments" textboxrect="0,0,37326,76858"/>
-          </v:shape>
-          <v:shape id="Shape 34" o:spid="_x0000_s1145" style="position:absolute;left:16285;top:3657;width:373;height:129;visibility:visible;mso-wrap-style:square;v-text-anchor:top" coordsize="37326,12802" o:spt="100" o:gfxdata="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" adj="0,,0" path="m37326,r,12802l,12802,,9,37326,xe" fillcolor="#fffefd" stroked="f" strokeweight="0">
-            <v:stroke miterlimit="83231f" joinstyle="miter"/>
-            <v:formulas/>
-            <v:path arrowok="t" o:connecttype="segments" textboxrect="0,0,37326,12802"/>
-          </v:shape>
-          <v:shape id="Shape 35" o:spid="_x0000_s1146" style="position:absolute;left:16658;top:3805;width:377;height:771;visibility:visible;mso-wrap-style:square;v-text-anchor:top" coordsize="37668,77054" o:spt="100" o:gfxdata="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" adj="0,,0" path="m37668,r,18935l22072,34243v216,305,267,418,331,508l37668,49988r,27066l,77054,,66805r35281,c26899,58690,18745,50778,10566,42853,9042,44365,7658,45724,6261,47095,4737,48606,3238,50143,1651,51591l,51557,,35822r2159,21c6464,31512,10769,27156,15075,22826l37668,xe" fillcolor="#fffefd" stroked="f" strokeweight="0">
-            <v:stroke miterlimit="83231f" joinstyle="miter"/>
-            <v:formulas/>
-            <v:path arrowok="t" o:connecttype="segments" textboxrect="0,0,37668,77054"/>
-          </v:shape>
-          <v:shape id="Shape 36" o:spid="_x0000_s1147" style="position:absolute;left:16658;top:3657;width:377;height:129;visibility:visible;mso-wrap-style:square;v-text-anchor:top" coordsize="37668,12812" o:spt="100" o:gfxdata="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" adj="0,,0" path="m37668,r,12812l,12812,,10r267,l37668,xe" fillcolor="#fffefd" stroked="f" strokeweight="0">
-            <v:stroke miterlimit="83231f" joinstyle="miter"/>
-            <v:formulas/>
-            <v:path arrowok="t" o:connecttype="segments" textboxrect="0,0,37668,12812"/>
-          </v:shape>
-          <v:shape id="Shape 37" o:spid="_x0000_s1148" style="position:absolute;left:17035;top:3657;width:266;height:919;visibility:visible;mso-wrap-style:square;v-text-anchor:top" coordsize="26543,91846" o:spt="100" o:gfxdata="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" adj="0,,0" path="m12700,12c18250,,22530,2184,25019,7138v914,1790,1422,3987,1435,5994c26543,35014,26530,56883,26492,78778v-13,7455,-5766,13068,-13246,13068l,91846,,64780,11900,76657v241,241,952,305,1283,140c14961,75794,15596,74155,15596,72174v,-17272,,-34544,-13,-51829c15583,19710,15430,19088,15379,18631l,33727,,14792r914,-924c1181,13589,1410,13297,1816,12827l,12827,,16,12700,12xe" fillcolor="#fffefd" stroked="f" strokeweight="0">
-            <v:stroke miterlimit="83231f" joinstyle="miter"/>
-            <v:formulas/>
-            <v:path arrowok="t" o:connecttype="segments" textboxrect="0,0,26543,91846"/>
-          </v:shape>
-          <v:rect id="Rectangle 38" o:spid="_x0000_s1149" style="position:absolute;left:18025;top:3358;width:19661;height:2051;visibility:visible;mso-wrap-style:square;v-text-anchor:top" o:gfxdata="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" filled="f" stroked="f">
-            <v:textbox inset="0,0,0,0">
-              <w:txbxContent>
-                <w:p>
-                  <w:r>
-                    <w:rPr>
-                      <w:rFonts w:ascii="Calibri" w:eastAsia="Calibri" w:hAnsi="Calibri" w:cs="Calibri"/>
-                      <w:color w:val="FFFEFD"/>
-                      <w:w w:val="110"/>
-                      <w:sz w:val="20"/>
-                    </w:rPr>
-                    <w:t>dprolprojetos@gmail.com</w:t>
-                  </w:r>
-                </w:p>
-              </w:txbxContent>
-            </v:textbox>
-          </v:rect>
-          <v:rect id="Rectangle 106" o:spid="_x0000_s1150" style="position:absolute;left:22609;top:5000;width:40407;height:2176;visibility:visible;mso-wrap-style:square;v-text-anchor:top" o:gfxdata="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" filled="f" stroked="f">
-            <v:textbox inset="0,0,0,0">
-              <w:txbxContent>
-                <w:p>
-                  <w:r>
-                    <w:rPr>
-                      <w:rFonts w:ascii="Calibri" w:eastAsia="Calibri" w:hAnsi="Calibri" w:cs="Calibri"/>
-                      <w:color w:val="FFFEFD"/>
-                      <w:w w:val="111"/>
-                      <w:sz w:val="21"/>
-                    </w:rPr>
-                    <w:t>CNPJ:</w:t>
-                  </w:r>
-                  <w:r>
-                    <w:rPr>
-                      <w:rFonts w:ascii="Calibri" w:eastAsia="Calibri" w:hAnsi="Calibri" w:cs="Calibri"/>
-                      <w:color w:val="FFFEFD"/>
-                      <w:spacing w:val="11"/>
-                      <w:w w:val="111"/>
-                      <w:sz w:val="21"/>
-                    </w:rPr>
-                    <w:t xml:space="preserve"> </w:t>
-                  </w:r>
-                  <w:r>
-                    <w:rPr>
-                      <w:rFonts w:ascii="Calibri" w:eastAsia="Calibri" w:hAnsi="Calibri" w:cs="Calibri"/>
-                      <w:color w:val="FFFEFD"/>
-                      <w:w w:val="111"/>
-                      <w:sz w:val="21"/>
-                    </w:rPr>
-                    <w:t>37.638.987/0001-84</w:t>
-                  </w:r>
-                  <w:r>
-                    <w:rPr>
-                      <w:rFonts w:ascii="Calibri" w:eastAsia="Calibri" w:hAnsi="Calibri" w:cs="Calibri"/>
-                      <w:color w:val="FFFEFD"/>
-                      <w:spacing w:val="11"/>
-                      <w:w w:val="111"/>
-                      <w:sz w:val="21"/>
-                    </w:rPr>
-                    <w:t xml:space="preserve">  </w:t>
-                  </w:r>
-                  <w:r>
-                    <w:rPr>
-                      <w:rFonts w:ascii="Calibri" w:eastAsia="Calibri" w:hAnsi="Calibri" w:cs="Calibri"/>
-                      <w:color w:val="FFFEFD"/>
-                      <w:w w:val="111"/>
-                      <w:sz w:val="21"/>
-                    </w:rPr>
-                    <w:t>-</w:t>
-                  </w:r>
-                  <w:r>
-                    <w:rPr>
-                      <w:rFonts w:ascii="Calibri" w:eastAsia="Calibri" w:hAnsi="Calibri" w:cs="Calibri"/>
-                      <w:color w:val="FFFEFD"/>
-                      <w:spacing w:val="11"/>
-                      <w:w w:val="111"/>
-                      <w:sz w:val="21"/>
-                    </w:rPr>
-                    <w:t xml:space="preserve">  </w:t>
-                  </w:r>
-                  <w:r>
-                    <w:rPr>
-                      <w:rFonts w:ascii="Calibri" w:eastAsia="Calibri" w:hAnsi="Calibri" w:cs="Calibri"/>
-                      <w:color w:val="FFFEFD"/>
-                      <w:w w:val="111"/>
-                      <w:sz w:val="21"/>
-                    </w:rPr>
-                    <w:t>CFTA:</w:t>
-                  </w:r>
-                  <w:r>
-                    <w:rPr>
-                      <w:rFonts w:ascii="Calibri" w:eastAsia="Calibri" w:hAnsi="Calibri" w:cs="Calibri"/>
-                      <w:color w:val="FFFEFD"/>
-                      <w:spacing w:val="11"/>
-                      <w:w w:val="111"/>
-                      <w:sz w:val="21"/>
-                    </w:rPr>
-                    <w:t xml:space="preserve"> </w:t>
-                  </w:r>
-                  <w:r>
-                    <w:rPr>
-                      <w:rFonts w:ascii="Calibri" w:eastAsia="Calibri" w:hAnsi="Calibri" w:cs="Calibri"/>
-                      <w:color w:val="FFFEFD"/>
-                      <w:w w:val="111"/>
-                      <w:sz w:val="21"/>
-                    </w:rPr>
-                    <w:t>05788394589</w:t>
-                  </w:r>
-                </w:p>
-              </w:txbxContent>
-            </v:textbox>
-          </v:rect>
-          <w10:wrap type="topAndBottom" anchorx="page" anchory="page"/>
-        </v:group>
-      </w:pict>
+      <w:br/>
     </w:r>
   </w:p>
+  <w:tbl>
+    <w:tblPr>
+      <w:tblStyle w:val="Tabelacomgrade"/>
+      <w:tblW w:w="0" w:type="auto"/>
+      <w:tblLook w:val="04A0"/>
+    </w:tblPr>
+    <w:tblGrid>
+      <w:gridCol w:w="5573"/>
+      <w:gridCol w:w="5573"/>
+    </w:tblGrid>
+    <w:tr>
+      <w:trPr>
+        <w:trHeight w:val="618"/>
+      </w:trPr>
+      <w:tc>
+        <w:tcPr>
+          <w:tcW w:w="5573" w:type="dxa"/>
+          <w:tcBorders>
+            <w:top w:val="nil"/>
+            <w:left w:val="nil"/>
+            <w:bottom w:val="nil"/>
+            <w:right w:val="nil"/>
+          </w:tcBorders>
+        </w:tcPr>
+        <w:p>
+          <w:pPr>
+            <w:pStyle w:val="Rodap"/>
+            <w:jc w:val="center"/>
+            <w:rPr>
+              <w:color w:val="FFFFFF" w:themeColor="background1"/>
+            </w:rPr>
+          </w:pPr>
+          <w:r>
+            <w:rPr>
+              <w:noProof/>
+              <w:color w:val="FFFFFF" w:themeColor="background1"/>
+              <w:lang w:val="pt-BR" w:eastAsia="pt-BR" w:bidi="ar-SA"/>
+            </w:rPr>
+            <w:drawing>
+              <wp:inline distT="0" distB="0" distL="0" distR="0">
+                <wp:extent cx="147568" cy="89865"/>
+                <wp:effectExtent l="19050" t="0" r="4832" b="0"/>
+                <wp:docPr id="23" name="Imagem 23" descr="C:\Users\User\AppData\Local\Microsoft\Windows\INetCache\Content.Word\email.png"/>
+                <wp:cNvGraphicFramePr>
+                  <a:graphicFrameLocks xmlns:a="http://schemas.openxmlformats.org/drawingml/2006/main" noChangeAspect="1"/>
+                </wp:cNvGraphicFramePr>
+                <a:graphic xmlns:a="http://schemas.openxmlformats.org/drawingml/2006/main">
+                  <a:graphicData uri="http://schemas.openxmlformats.org/drawingml/2006/picture">
+                    <pic:pic xmlns:pic="http://schemas.openxmlformats.org/drawingml/2006/picture">
+                      <pic:nvPicPr>
+                        <pic:cNvPr id="0" name="Picture 23" descr="C:\Users\User\AppData\Local\Microsoft\Windows\INetCache\Content.Word\email.png"/>
+                        <pic:cNvPicPr>
+                          <a:picLocks noChangeAspect="1" noChangeArrowheads="1"/>
+                        </pic:cNvPicPr>
+                      </pic:nvPicPr>
+                      <pic:blipFill>
+                        <a:blip r:embed="rId2"/>
+                        <a:srcRect/>
+                        <a:stretch>
+                          <a:fillRect/>
+                        </a:stretch>
+                      </pic:blipFill>
+                      <pic:spPr bwMode="auto">
+                        <a:xfrm>
+                          <a:off x="0" y="0"/>
+                          <a:ext cx="151118" cy="92027"/>
+                        </a:xfrm>
+                        <a:prstGeom prst="rect">
+                          <a:avLst/>
+                        </a:prstGeom>
+                        <a:noFill/>
+                        <a:ln w="9525">
+                          <a:noFill/>
+                          <a:miter lim="800000"/>
+                          <a:headEnd/>
+                          <a:tailEnd/>
+                        </a:ln>
+                      </pic:spPr>
+                    </pic:pic>
+                  </a:graphicData>
+                </a:graphic>
+              </wp:inline>
+            </w:drawing>
+          </w:r>
+          <w:r>
+            <w:rPr>
+              <w:color w:val="FFFFFF" w:themeColor="background1"/>
+            </w:rPr>
+            <w:t xml:space="preserve"> </w:t>
+          </w:r>
+          <w:hyperlink r:id="rId3" w:history="1">
+            <w:r>
+              <w:rPr>
+                <w:rStyle w:val="Hyperlink"/>
+                <w:color w:val="FFFFFF" w:themeColor="background1"/>
+                <w:u w:val="none"/>
+              </w:rPr>
+              <w:t>dprolprojetos@gmail.com</w:t>
+            </w:r>
+          </w:hyperlink>
+          <w:r>
+            <w:rPr>
+              <w:color w:val="FFFFFF" w:themeColor="background1"/>
+            </w:rPr>
+            <w:br/>
+          </w:r>
+          <w:r>
+            <w:rPr>
+              <w:noProof/>
+              <w:color w:val="FFFFFF" w:themeColor="background1"/>
+              <w:lang w:val="pt-BR" w:eastAsia="pt-BR" w:bidi="ar-SA"/>
+            </w:rPr>
+            <w:drawing>
+              <wp:inline distT="0" distB="0" distL="0" distR="0">
+                <wp:extent cx="115072" cy="117695"/>
+                <wp:effectExtent l="19050" t="0" r="0" b="0"/>
+                <wp:docPr id="13" name="Imagem 13" descr="C:\Users\User\AppData\Local\Microsoft\Windows\INetCache\Content.Word\whatsapp.png"/>
+                <wp:cNvGraphicFramePr>
+                  <a:graphicFrameLocks xmlns:a="http://schemas.openxmlformats.org/drawingml/2006/main" noChangeAspect="1"/>
+                </wp:cNvGraphicFramePr>
+                <a:graphic xmlns:a="http://schemas.openxmlformats.org/drawingml/2006/main">
+                  <a:graphicData uri="http://schemas.openxmlformats.org/drawingml/2006/picture">
+                    <pic:pic xmlns:pic="http://schemas.openxmlformats.org/drawingml/2006/picture">
+                      <pic:nvPicPr>
+                        <pic:cNvPr id="0" name="Picture 13" descr="C:\Users\User\AppData\Local\Microsoft\Windows\INetCache\Content.Word\whatsapp.png"/>
+                        <pic:cNvPicPr>
+                          <a:picLocks noChangeAspect="1" noChangeArrowheads="1"/>
+                        </pic:cNvPicPr>
+                      </pic:nvPicPr>
+                      <pic:blipFill>
+                        <a:blip r:embed="rId4"/>
+                        <a:srcRect/>
+                        <a:stretch>
+                          <a:fillRect/>
+                        </a:stretch>
+                      </pic:blipFill>
+                      <pic:spPr bwMode="auto">
+                        <a:xfrm>
+                          <a:off x="0" y="0"/>
+                          <a:ext cx="121144" cy="123905"/>
+                        </a:xfrm>
+                        <a:prstGeom prst="rect">
+                          <a:avLst/>
+                        </a:prstGeom>
+                        <a:noFill/>
+                        <a:ln w="9525">
+                          <a:noFill/>
+                          <a:miter lim="800000"/>
+                          <a:headEnd/>
+                          <a:tailEnd/>
+                        </a:ln>
+                      </pic:spPr>
+                    </pic:pic>
+                  </a:graphicData>
+                </a:graphic>
+              </wp:inline>
+            </w:drawing>
+          </w:r>
+          <w:r>
+            <w:rPr>
+              <w:color w:val="FFFFFF" w:themeColor="background1"/>
+            </w:rPr>
+            <w:t xml:space="preserve"> </w:t>
+          </w:r>
+          <w:r>
+            <w:rPr>
+              <w:color w:val="FFFFFF" w:themeColor="background1"/>
+            </w:rPr>
+            <w:t>(75) 9 8167-2207</w:t>
+          </w:r>
+          <w:r>
+            <w:rPr>
+              <w:color w:val="FFFFFF" w:themeColor="background1"/>
+            </w:rPr>
+            <w:br/>
+          </w:r>
+          <w:r>
+            <w:rPr>
+              <w:noProof/>
+              <w:color w:val="FFFFFF" w:themeColor="background1"/>
+              <w:lang w:val="pt-BR" w:eastAsia="pt-BR" w:bidi="ar-SA"/>
+            </w:rPr>
+            <w:drawing>
+              <wp:inline distT="0" distB="0" distL="0" distR="0">
+                <wp:extent cx="109685" cy="109685"/>
+                <wp:effectExtent l="19050" t="0" r="4615" b="0"/>
+                <wp:docPr id="20" name="Imagem 20" descr="C:\Users\User\AppData\Local\Microsoft\Windows\INetCache\Content.Word\instagram.png"/>
+                <wp:cNvGraphicFramePr>
+                  <a:graphicFrameLocks xmlns:a="http://schemas.openxmlformats.org/drawingml/2006/main" noChangeAspect="1"/>
+                </wp:cNvGraphicFramePr>
+                <a:graphic xmlns:a="http://schemas.openxmlformats.org/drawingml/2006/main">
+                  <a:graphicData uri="http://schemas.openxmlformats.org/drawingml/2006/picture">
+                    <pic:pic xmlns:pic="http://schemas.openxmlformats.org/drawingml/2006/picture">
+                      <pic:nvPicPr>
+                        <pic:cNvPr id="0" name="Picture 20" descr="C:\Users\User\AppData\Local\Microsoft\Windows\INetCache\Content.Word\instagram.png"/>
+                        <pic:cNvPicPr>
+                          <a:picLocks noChangeAspect="1" noChangeArrowheads="1"/>
+                        </pic:cNvPicPr>
+                      </pic:nvPicPr>
+                      <pic:blipFill>
+                        <a:blip r:embed="rId5"/>
+                        <a:srcRect/>
+                        <a:stretch>
+                          <a:fillRect/>
+                        </a:stretch>
+                      </pic:blipFill>
+                      <pic:spPr bwMode="auto">
+                        <a:xfrm>
+                          <a:off x="0" y="0"/>
+                          <a:ext cx="113393" cy="113393"/>
+                        </a:xfrm>
+                        <a:prstGeom prst="rect">
+                          <a:avLst/>
+                        </a:prstGeom>
+                        <a:noFill/>
+                        <a:ln w="9525">
+                          <a:noFill/>
+                          <a:miter lim="800000"/>
+                          <a:headEnd/>
+                          <a:tailEnd/>
+                        </a:ln>
+                      </pic:spPr>
+                    </pic:pic>
+                  </a:graphicData>
+                </a:graphic>
+              </wp:inline>
+            </w:drawing>
+          </w:r>
+          <w:r>
+            <w:rPr>
+              <w:color w:val="FFFFFF" w:themeColor="background1"/>
+            </w:rPr>
+            <w:t xml:space="preserve"> </w:t>
+          </w:r>
+          <w:r>
+            <w:rPr>
+              <w:color w:val="FFFFFF" w:themeColor="background1"/>
+            </w:rPr>
+            <w:t>dprol.projetos</w:t>
+          </w:r>
+        </w:p>
+      </w:tc>
+      <w:tc>
+        <w:tcPr>
+          <w:tcW w:w="5573" w:type="dxa"/>
+          <w:tcBorders>
+            <w:top w:val="nil"/>
+            <w:left w:val="nil"/>
+            <w:bottom w:val="nil"/>
+            <w:right w:val="nil"/>
+          </w:tcBorders>
+        </w:tcPr>
+        <w:p>
+          <w:pPr>
+            <w:pStyle w:val="Rodap"/>
+            <w:jc w:val="center"/>
+            <w:rPr>
+              <w:color w:val="FFFFFF" w:themeColor="background1"/>
+            </w:rPr>
+          </w:pPr>
+          <w:r>
+            <w:rPr>
+              <w:color w:val="FFFFFF" w:themeColor="background1"/>
+            </w:rPr>
+            <w:t>CNPJ: 37.638.987/0001-84</w:t>
+          </w:r>
+          <w:r>
+            <w:rPr>
+              <w:color w:val="FFFFFF" w:themeColor="background1"/>
+            </w:rPr>
+            <w:br/>
+          </w:r>
+          <w:r>
+            <w:rPr>
+              <w:color w:val="FFFFFF" w:themeColor="background1"/>
+            </w:rPr>
+            <w:br/>
+          </w:r>
+          <w:r>
+            <w:rPr>
+              <w:color w:val="FFFFFF" w:themeColor="background1"/>
+            </w:rPr>
+            <w:t>CFTA</w:t>
+          </w:r>
+          <w:r>
+            <w:rPr>
+              <w:color w:val="FFFFFF" w:themeColor="background1"/>
+            </w:rPr>
+            <w:t>/CFT</w:t>
+          </w:r>
+          <w:r>
+            <w:rPr>
+              <w:color w:val="FFFFFF" w:themeColor="background1"/>
+            </w:rPr>
+            <w:t>: 0578839458</w:t>
+          </w:r>
+          <w:r>
+            <w:rPr>
+              <w:color w:val="FFFFFF" w:themeColor="background1"/>
+            </w:rPr>
+            <w:t>-</w:t>
+          </w:r>
+          <w:r>
+            <w:rPr>
+              <w:color w:val="FFFFFF" w:themeColor="background1"/>
+            </w:rPr>
+            <w:t>9</w:t>
+          </w:r>
+        </w:p>
+      </w:tc>
+    </w:tr>
+  </w:tbl>
   <w:p>
-    <w:r>
-      <w:rPr>
-        <w:noProof/>
-      </w:rPr>
-      <w:pict w14:anchorId="140D1277">
-        <v:group id="Group 1085" o:spid="_x0000_s1509" style="position:absolute;left:0;text-align:left;margin-left:-40.5pt;margin-top:563.05pt;width:841.9pt;height:48.2pt;z-index:251696128;mso-position-horizontal-relative:page;mso-position-vertical-relative:page" coordsize="106920,6120" o:gfxdata="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">
-          <v:shape id="Shape 1249" o:spid="_x0000_s1510" style="position:absolute;top:720;width:106920;height:5400;visibility:visible;mso-wrap-style:square;v-text-anchor:top" coordsize="10692003,540042" o:spt="100" o:gfxdata="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" adj="0,,0" path="m,l10692003,r,540042l,540042,,e" fillcolor="#295c2f" stroked="f" strokeweight="0">
-            <v:stroke miterlimit="83231f" joinstyle="miter"/>
-            <v:formulas/>
-            <v:path arrowok="t" o:connecttype="segments" textboxrect="0,0,10692003,540042"/>
-          </v:shape>
-          <v:shape id="Shape 1250" o:spid="_x0000_s1511" style="position:absolute;width:106920;height:720;visibility:visible;mso-wrap-style:square;v-text-anchor:top" coordsize="10692003,72009" o:spt="100" o:gfxdata="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" adj="0,,0" path="m,l10692003,r,72009l,72009,,e" fillcolor="#4e4d48" stroked="f" strokeweight="0">
-            <v:stroke miterlimit="83231f" joinstyle="miter"/>
-            <v:formulas/>
-            <v:path arrowok="t" o:connecttype="segments" textboxrect="0,0,10692003,72009"/>
-          </v:shape>
-          <v:shape id="Shape 115" o:spid="_x0000_s1512" style="position:absolute;left:64352;top:3810;width:405;height:792;visibility:visible;mso-wrap-style:square;v-text-anchor:top" coordsize="40487,79161" o:spt="100" o:gfxdata="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" adj="0,,0" path="m34963,r5524,685l40487,47483,28753,36983v-445,-750,-419,-1448,216,-2160c29883,33808,30810,32754,31598,31636v635,-901,1206,-1905,673,-3125c30962,25464,29744,22365,28397,19330v-292,-674,-876,-1550,-1498,-1715c24790,17069,22530,16764,20714,18377v-3620,3226,-5220,7303,-4585,12116c16650,34506,18643,37910,20891,41211v3125,4547,6592,8646,10638,12014l40487,58070r,20665l35135,79161c29877,78426,24752,76562,19799,73673v-825,-483,-1537,-597,-2476,-343c13005,74499,8674,75603,4356,76721v-216,63,-445,76,-864,127c4140,74486,4737,72301,5334,70117v660,-2438,1371,-4877,1969,-7328c7417,62370,7201,61761,6947,61367,5181,58611,3734,55703,2667,52616,686,46965,,41161,673,35217,1727,25781,5652,17704,12421,11062,18694,4877,26213,1029,34963,xe" fillcolor="#fffefd" stroked="f" strokeweight="0">
-            <v:stroke miterlimit="83231f" joinstyle="miter"/>
-            <v:formulas/>
-            <v:path arrowok="t" o:connecttype="segments" textboxrect="0,0,40487,79161"/>
-          </v:shape>
-          <v:shape id="Shape 116" o:spid="_x0000_s1513" style="position:absolute;left:64757;top:3817;width:418;height:781;visibility:visible;mso-wrap-style:square;v-text-anchor:top" coordsize="41720,78050" o:spt="100" o:gfxdata="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" adj="0,,0" path="m,l15934,1977v6384,2723,11975,7282,16706,13683c39523,24981,41720,35650,39180,46953,35700,62498,26023,72709,10783,77191l,78050,,57385r5157,2789c7798,60961,10414,61875,13259,62028v1423,-318,2909,-419,4191,-978c22886,58688,24194,56351,24486,51525v51,-800,-114,-1512,-927,-1892c20232,48058,16917,46432,13589,44896v-1231,-559,-1790,-306,-2628,774c10071,46813,9183,47956,8255,49061,6401,51246,6376,51233,3721,50128l,46798,,xe" fillcolor="#fffefd" stroked="f" strokeweight="0">
-            <v:stroke miterlimit="83231f" joinstyle="miter"/>
-            <v:formulas/>
-            <v:path arrowok="t" o:connecttype="segments" textboxrect="0,0,41720,78050"/>
-          </v:shape>
-          <v:shape id="Shape 117" o:spid="_x0000_s1514" style="position:absolute;left:63986;top:3439;width:770;height:1540;visibility:visible;mso-wrap-style:square;v-text-anchor:top" coordsize="77014,154039" o:spt="100" o:gfxdata="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" adj="0,,0" path="m77013,r1,l77014,29220r-9966,338c61830,30659,56820,32684,52057,35662,38163,44374,30391,57010,29083,73432v-749,9436,1397,18275,5931,26581c35217,100381,35268,100965,35153,101385v-1917,7074,-3886,14134,-5829,21208c29083,123470,28867,124358,28587,125476v1766,-457,3290,-863,4814,-1257c40056,122479,46698,120739,53365,119038v457,-127,1042,,1486,190c56337,119850,57759,120625,59271,121209v5423,2134,10909,3349,16411,3549l77014,124554r,29485l77013,154039c34468,154039,,119558,,77013,,34481,34468,,77013,xe" fillcolor="#fffefd" stroked="f" strokeweight="0">
-            <v:stroke miterlimit="83231f" joinstyle="miter"/>
-            <v:formulas/>
-            <v:path arrowok="t" o:connecttype="segments" textboxrect="0,0,77014,154039"/>
-          </v:shape>
-          <v:shape id="Shape 118" o:spid="_x0000_s1515" style="position:absolute;left:64756;top:3439;width:770;height:1540;visibility:visible;mso-wrap-style:square;v-text-anchor:top" coordsize="77012,154039" o:spt="100" o:gfxdata="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" adj="0,,0" path="m,l29982,6052c57624,17744,77012,45114,77012,77013v,31909,-19388,59281,-47030,70973l,154039,,124554r15176,-2341c33083,115913,44208,103315,47611,84557,50177,70434,46646,57531,37566,46381,29501,36462,18998,30645,6273,29007l,29220,,xe" fillcolor="#fffefd" stroked="f" strokeweight="0">
-            <v:stroke miterlimit="83231f" joinstyle="miter"/>
-            <v:formulas/>
-            <v:path arrowok="t" o:connecttype="segments" textboxrect="0,0,77012,154039"/>
-          </v:shape>
-          <v:rect id="Rectangle 1056" o:spid="_x0000_s1516" style="position:absolute;left:66146;top:3509;width:1771;height:2051;visibility:visible;mso-wrap-style:square;v-text-anchor:top" o:gfxdata="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" filled="f" stroked="f">
-            <v:textbox inset="0,0,0,0">
-              <w:txbxContent>
-                <w:p>
-                  <w:pPr>
-                    <w:rPr>
-                      <w:sz w:val="19"/>
-                      <w:szCs w:val="19"/>
-                    </w:rPr>
-                  </w:pPr>
-                  <w:r>
-                    <w:rPr>
-                      <w:color w:val="FFFEFD"/>
-                      <w:spacing w:val="-4"/>
-                      <w:w w:val="103"/>
-                      <w:sz w:val="20"/>
-                    </w:rPr>
-                    <w:t xml:space="preserve">                   </w:t>
-                  </w:r>
-                  <w:r>
-                    <w:rPr>
-                      <w:color w:val="FFFEFD"/>
-                      <w:spacing w:val="-4"/>
-                      <w:w w:val="103"/>
-                      <w:sz w:val="19"/>
-                      <w:szCs w:val="19"/>
-                    </w:rPr>
-                    <w:t>75</w:t>
-                  </w:r>
-                </w:p>
-              </w:txbxContent>
-            </v:textbox>
-          </v:rect>
-          <v:rect id="Rectangle 1058" o:spid="_x0000_s1517" style="position:absolute;left:67478;top:3509;width:473;height:2051;visibility:visible;mso-wrap-style:square;v-text-anchor:top" o:gfxdata="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" filled="f" stroked="f">
-            <v:textbox inset="0,0,0,0">
-              <w:txbxContent>
-                <w:p>
-                  <w:r>
-                    <w:rPr>
-                      <w:color w:val="FFFEFD"/>
-                      <w:sz w:val="20"/>
-                    </w:rPr>
-                    <w:t xml:space="preserve"> </w:t>
-                  </w:r>
-                </w:p>
-              </w:txbxContent>
-            </v:textbox>
-          </v:rect>
-          <v:rect id="Rectangle 1057" o:spid="_x0000_s1518" style="position:absolute;left:67834;top:3509;width:967;height:2051;visibility:visible;mso-wrap-style:square;v-text-anchor:top" o:gfxdata="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" filled="f" stroked="f">
-            <v:textbox inset="0,0,0,0">
-              <w:txbxContent>
-                <w:p>
-                  <w:r>
-                    <w:rPr>
-                      <w:color w:val="FFFEFD"/>
-                      <w:w w:val="112"/>
-                      <w:sz w:val="20"/>
-                    </w:rPr>
-                    <w:t>9</w:t>
-                  </w:r>
-                </w:p>
-              </w:txbxContent>
-            </v:textbox>
-          </v:rect>
-          <v:rect id="Rectangle 120" o:spid="_x0000_s1519" style="position:absolute;left:68561;top:3482;width:8878;height:2111;visibility:visible;mso-wrap-style:square;v-text-anchor:top" o:gfxdata="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" filled="f" stroked="f">
-            <v:textbox style="mso-next-textbox:#Rectangle 120" inset="0,0,0,0">
-              <w:txbxContent>
-                <w:p>
-                  <w:r>
-                    <w:rPr>
-                      <w:b/>
-                      <w:color w:val="FFFEFD"/>
-                      <w:w w:val="122"/>
-                      <w:sz w:val="20"/>
-                    </w:rPr>
-                    <w:t>8354</w:t>
-                  </w:r>
-                  <w:r>
-                    <w:rPr>
-                      <w:b/>
-                      <w:color w:val="FFFEFD"/>
-                      <w:w w:val="122"/>
-                      <w:sz w:val="20"/>
-                    </w:rPr>
-                    <w:t xml:space="preserve">    </w:t>
-                  </w:r>
-                  <w:r>
-                    <w:rPr>
-                      <w:b/>
-                      <w:color w:val="FFFEFD"/>
-                      <w:w w:val="122"/>
-                      <w:sz w:val="19"/>
-                      <w:szCs w:val="19"/>
-                    </w:rPr>
-                    <w:t>9 8296-5262</w:t>
-                  </w:r>
-                </w:p>
-              </w:txbxContent>
-            </v:textbox>
-          </v:rect>
-          <v:shape id="Shape 121" o:spid="_x0000_s1520" style="position:absolute;left:51324;top:3569;width:642;height:1280;visibility:visible;mso-wrap-style:square;v-text-anchor:top" coordsize="64281,128048" o:spt="100" o:gfxdata="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" adj="0,,0" path="m50571,l64281,36r,11739l47866,11620v-4851,,-9740,279,-14579,800c22098,13614,14593,20510,12840,31635v-902,5664,-1016,11481,-1092,17222c11608,60160,11671,71488,11836,82817v64,4661,254,9372,1042,13957c14440,105956,19723,112192,28842,114757v2350,660,4813,1117,7264,1232c42685,116281,49276,116522,55868,116484r8413,-124l64281,128048r-20060,-83c38748,127850,33134,127597,27813,126416,12484,123037,2807,112052,1029,96342,318,90106,165,83782,102,77495,,66319,76,55143,203,43967,292,37770,432,31559,2248,25540,6388,11709,15773,3556,29845,1282,36652,165,43650,102,50571,xe" fillcolor="#fffefd" stroked="f" strokeweight="0">
-            <v:stroke miterlimit="83231f" joinstyle="miter"/>
-            <v:formulas/>
-            <v:path arrowok="t" o:connecttype="segments" textboxrect="0,0,64281,128048"/>
-          </v:shape>
-          <v:shape id="Shape 122" o:spid="_x0000_s1521" style="position:absolute;left:51966;top:3569;width:643;height:1281;visibility:visible;mso-wrap-style:square;v-text-anchor:top" coordsize="64205,128068" o:spt="100" o:gfxdata="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" adj="0,,0" path="m,l19819,52v6439,89,12916,242,19151,2210c52496,6529,60434,15877,62656,29681v1118,6960,1029,14110,1308,21184c64129,55742,63990,60619,63990,65483v63,,139,,215,12c63952,74690,63888,83910,63393,93080v-546,9804,-3798,18542,-11265,25362c46375,123699,39491,126429,31884,127205v-6007,597,-12078,812,-18123,863l,128012,,116323r28493,-422c33916,115724,39072,114149,43403,110618v5740,-4673,8014,-11023,8382,-18072c52267,83072,52356,73560,52610,64073r-355,c52255,57570,52369,51081,52217,44579v-115,-4420,-280,-8878,-1016,-13221c49651,22239,44470,15940,35415,13374v-2820,-800,-5804,-1333,-8725,-1384l,11739,,xe" fillcolor="#fffefd" stroked="f" strokeweight="0">
-            <v:stroke miterlimit="83231f" joinstyle="miter"/>
-            <v:formulas/>
-            <v:path arrowok="t" o:connecttype="segments" textboxrect="0,0,64205,128068"/>
-          </v:shape>
-          <v:shape id="Shape 123" o:spid="_x0000_s1522" style="position:absolute;left:51636;top:3880;width:329;height:659;visibility:visible;mso-wrap-style:square;v-text-anchor:top" coordsize="32982,65880" o:spt="100" o:gfxdata="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" adj="0,,0" path="m32982,r,11688l17956,17818v-3878,3828,-6272,9117,-6272,14965c11684,38847,14049,44217,17948,48067r15034,5995l32982,65844r-178,36c14732,65880,,51021,38,32872,76,19204,8429,7472,20265,2508l32982,xe" fillcolor="#fffefd" stroked="f" strokeweight="0">
-            <v:stroke miterlimit="83231f" joinstyle="miter"/>
-            <v:formulas/>
-            <v:path arrowok="t" o:connecttype="segments" textboxrect="0,0,32982,65880"/>
-          </v:shape>
-          <v:shape id="Shape 124" o:spid="_x0000_s1523" style="position:absolute;left:51965;top:3880;width:330;height:658;visibility:visible;mso-wrap-style:square;v-text-anchor:top" coordsize="32994,65864" o:spt="100" o:gfxdata="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" adj="0,,0" path="m102,c18301,114,32994,14846,32944,32956v-38,13745,-8313,25410,-20201,30379l,65864,,54082r432,172c11824,54242,21311,44552,21298,32956,21285,21209,11799,11646,152,11646l,11708,,20,102,xe" fillcolor="#fffefd" stroked="f" strokeweight="0">
-            <v:stroke miterlimit="83231f" joinstyle="miter"/>
-            <v:formulas/>
-            <v:path arrowok="t" o:connecttype="segments" textboxrect="0,0,32994,65864"/>
-          </v:shape>
-          <v:shape id="Shape 125" o:spid="_x0000_s1524" style="position:absolute;left:52230;top:3790;width:155;height:154;visibility:visible;mso-wrap-style:square;v-text-anchor:top" coordsize="15456,15431" o:spt="100" o:gfxdata="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" adj="0,,0" path="m7671,13c12014,,15456,3480,15418,7798v-26,4267,-3442,7633,-7747,7633c3378,15431,,12040,,7734,,3442,3391,26,7671,13xe" fillcolor="#fffefd" stroked="f" strokeweight="0">
-            <v:stroke miterlimit="83231f" joinstyle="miter"/>
-            <v:formulas/>
-            <v:path arrowok="t" o:connecttype="segments" textboxrect="0,0,15456,15431"/>
-          </v:shape>
-          <v:rect id="Rectangle 126" o:spid="_x0000_s1525" style="position:absolute;left:53196;top:3450;width:10675;height:2052;visibility:visible;mso-wrap-style:square;v-text-anchor:top" o:gfxdata="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" filled="f" stroked="f">
-            <v:textbox style="mso-next-textbox:#Rectangle 126" inset="0,0,0,0">
-              <w:txbxContent>
-                <w:p>
-                  <w:r>
-                    <w:rPr>
-                      <w:color w:val="FFFEFD"/>
-                      <w:w w:val="110"/>
-                      <w:sz w:val="20"/>
-                    </w:rPr>
-                    <w:t>dprol.p</w:t>
-                  </w:r>
-                  <w:r>
-                    <w:rPr>
-                      <w:color w:val="FFFEFD"/>
-                      <w:w w:val="110"/>
-                      <w:sz w:val="20"/>
-                    </w:rPr>
-                    <w:t xml:space="preserve"> </w:t>
-                  </w:r>
-                  <w:r>
-                    <w:rPr>
-                      <w:color w:val="FFFEFD"/>
-                      <w:w w:val="110"/>
-                      <w:sz w:val="19"/>
-                      <w:szCs w:val="19"/>
-                    </w:rPr>
-                    <w:t>dprol.projetos</w:t>
-                  </w:r>
-                </w:p>
-              </w:txbxContent>
-            </v:textbox>
-          </v:rect>
-          <v:shape id="Shape 127" o:spid="_x0000_s1526" style="position:absolute;left:31683;top:3750;width:262;height:918;visibility:visible;mso-wrap-style:square;v-text-anchor:top" coordsize="26232,91825" o:spt="100" o:gfxdata="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" adj="0,,0" path="m26232,r,12792l24511,12792r-444,546c24498,13580,25006,13745,25362,14075r870,872l26232,35887,12929,22584v-26,292,-89,724,-89,1143l12840,42396v,9017,,18021,-13,27051c12827,70641,13157,71669,13970,72546v965,1015,1207,1015,2210,12l26232,62558r,29267l13373,91825c5677,91825,25,86160,13,78401,,56797,,35208,13,13618,13,5503,5461,16,13576,3l26232,xe" fillcolor="#fffefd" stroked="f" strokeweight="0">
-            <v:stroke miterlimit="83231f" joinstyle="miter"/>
-            <v:formulas/>
-            <v:path arrowok="t" o:connecttype="segments" textboxrect="0,0,26232,91825"/>
-          </v:shape>
-          <v:shape id="Shape 128" o:spid="_x0000_s1527" style="position:absolute;left:31945;top:3900;width:374;height:768;visibility:visible;mso-wrap-style:square;v-text-anchor:top" coordsize="37332,76877" o:spt="100" o:gfxdata="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" adj="0,,0" path="m,l35541,35615r1791,23l37332,51368r-1537,-31c34385,49940,32988,48530,31566,47108,29889,45432,28226,43743,26460,41965,18332,50169,10306,58272,2051,66628r35281,l37332,76877,,76877,,47611,9709,37952v1270,-1283,2578,-2528,3696,-3607l,20940,,xe" fillcolor="#fffefd" stroked="f" strokeweight="0">
-            <v:stroke miterlimit="83231f" joinstyle="miter"/>
-            <v:formulas/>
-            <v:path arrowok="t" o:connecttype="segments" textboxrect="0,0,37332,76877"/>
-          </v:shape>
-          <v:shape id="Shape 129" o:spid="_x0000_s1528" style="position:absolute;left:31945;top:3750;width:374;height:128;visibility:visible;mso-wrap-style:square;v-text-anchor:top" coordsize="37332,12802" o:spt="100" o:gfxdata="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" adj="0,,0" path="m37332,r,12802l,12802,,9,37332,xe" fillcolor="#fffefd" stroked="f" strokeweight="0">
-            <v:stroke miterlimit="83231f" joinstyle="miter"/>
-            <v:formulas/>
-            <v:path arrowok="t" o:connecttype="segments" textboxrect="0,0,37332,12802"/>
-          </v:shape>
-          <v:shape id="Shape 130" o:spid="_x0000_s1529" style="position:absolute;left:32319;top:3898;width:376;height:770;visibility:visible;mso-wrap-style:square;v-text-anchor:top" coordsize="37668,77067" o:spt="100" o:gfxdata="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" adj="0,,0" path="m37668,r,18928l22073,34243v203,305,254,418,343,508l37668,49988r,27079l,77067,,66818r35281,c26899,58690,18745,50778,10566,42853,9042,44365,7658,45724,6261,47108,4724,48606,3226,50156,1638,51591l,51558,,35828r2146,27c6464,31512,10770,27156,15075,22826l37668,xe" fillcolor="#fffefd" stroked="f" strokeweight="0">
-            <v:stroke miterlimit="83231f" joinstyle="miter"/>
-            <v:formulas/>
-            <v:path arrowok="t" o:connecttype="segments" textboxrect="0,0,37668,77067"/>
-          </v:shape>
-          <v:shape id="Shape 131" o:spid="_x0000_s1530" style="position:absolute;left:32319;top:3750;width:376;height:128;visibility:visible;mso-wrap-style:square;v-text-anchor:top" coordsize="37668,12812" o:spt="100" o:gfxdata="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" adj="0,,0" path="m37668,r,12812l,12812,,10r267,l37668,xe" fillcolor="#fffefd" stroked="f" strokeweight="0">
-            <v:stroke miterlimit="83231f" joinstyle="miter"/>
-            <v:formulas/>
-            <v:path arrowok="t" o:connecttype="segments" textboxrect="0,0,37668,12812"/>
-          </v:shape>
-          <v:shape id="Shape 132" o:spid="_x0000_s1531" style="position:absolute;left:32695;top:3750;width:266;height:918;visibility:visible;mso-wrap-style:square;v-text-anchor:top" coordsize="26543,91860" o:spt="100" o:gfxdata="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" adj="0,,0" path="m12700,12c18250,,22530,2184,25019,7138v902,1803,1410,3987,1422,5994c26543,35014,26530,56896,26492,78778v-13,7468,-5766,13082,-13259,13082l,91860,,64781,11900,76670v241,228,952,292,1270,127c14961,75794,15596,74155,15596,72174v,-17272,,-34544,-13,-51829c15583,19710,15430,19088,15367,18631l,33720,,14792r914,-924c1181,13601,1410,13297,1816,12827l,12827,,16,12700,12xe" fillcolor="#fffefd" stroked="f" strokeweight="0">
-            <v:stroke miterlimit="83231f" joinstyle="miter"/>
-            <v:formulas/>
-            <v:path arrowok="t" o:connecttype="segments" textboxrect="0,0,26543,91860"/>
-          </v:shape>
-          <v:rect id="Rectangle 133" o:spid="_x0000_s1532" style="position:absolute;left:33685;top:3450;width:19661;height:2052;visibility:visible;mso-wrap-style:square;v-text-anchor:top" o:gfxdata="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" filled="f" stroked="f">
-            <v:textbox style="mso-next-textbox:#Rectangle 133" inset="0,0,0,0">
-              <w:txbxContent>
-                <w:p>
-                  <w:r>
-                    <w:rPr>
-                      <w:color w:val="FFFEFD"/>
-                      <w:w w:val="110"/>
-                      <w:sz w:val="20"/>
-                    </w:rPr>
-                    <w:t>Dpro</w:t>
-                  </w:r>
-                  <w:r>
-                    <w:rPr>
-                      <w:color w:val="FFFEFD"/>
-                      <w:w w:val="110"/>
-                      <w:sz w:val="20"/>
-                    </w:rPr>
-                    <w:t xml:space="preserve">      </w:t>
-                  </w:r>
-                  <w:r>
-                    <w:rPr>
-                      <w:color w:val="FFFEFD"/>
-                      <w:w w:val="110"/>
-                      <w:sz w:val="19"/>
-                      <w:szCs w:val="19"/>
-                    </w:rPr>
-                    <w:t>dprolprojetos@gmail.com</w:t>
-                  </w:r>
-                </w:p>
-              </w:txbxContent>
-            </v:textbox>
-          </v:rect>
-          <v:rect id="Rectangle 209" o:spid="_x0000_s1533" style="position:absolute;left:18547;top:1445;width:40407;height:2175;visibility:visible;mso-wrap-style:square;v-text-anchor:top" o:gfxdata="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" filled="f" stroked="f">
-            <v:textbox style="mso-next-textbox:#Rectangle 209" inset="0,0,0,0">
-              <w:txbxContent>
-                <w:p>
-                  <w:pPr>
-                    <w:rPr>
-                      <w:sz w:val="20"/>
-                      <w:szCs w:val="20"/>
-                    </w:rPr>
-                  </w:pPr>
-                  <w:r>
-                    <w:rPr>
-                      <w:color w:val="FFFEFD"/>
-                      <w:w w:val="111"/>
-                      <w:sz w:val="20"/>
-                      <w:szCs w:val="20"/>
-                    </w:rPr>
-                    <w:t>CNPJ</w:t>
-                  </w:r>
-                  <w:r>
-                    <w:rPr>
-                      <w:color w:val="FFFEFD"/>
-                      <w:w w:val="111"/>
-                      <w:sz w:val="20"/>
-                      <w:szCs w:val="20"/>
-                    </w:rPr>
-                    <w:t xml:space="preserve">      </w:t>
-                  </w:r>
-                  <w:r>
-                    <w:rPr>
-                      <w:color w:val="FFFEFD"/>
-                      <w:w w:val="111"/>
-                      <w:sz w:val="19"/>
-                      <w:szCs w:val="19"/>
-                    </w:rPr>
-                    <w:t>CNPJ:</w:t>
-                  </w:r>
-                  <w:r>
-                    <w:rPr>
-                      <w:color w:val="FFFEFD"/>
-                      <w:spacing w:val="11"/>
-                      <w:w w:val="111"/>
-                      <w:sz w:val="19"/>
-                      <w:szCs w:val="19"/>
-                    </w:rPr>
-                    <w:t xml:space="preserve"> </w:t>
-                  </w:r>
-                  <w:r>
-                    <w:rPr>
-                      <w:color w:val="FFFEFD"/>
-                      <w:w w:val="111"/>
-                      <w:sz w:val="19"/>
-                      <w:szCs w:val="19"/>
-                    </w:rPr>
-                    <w:t>37.638.987/0001-84</w:t>
-                  </w:r>
-                  <w:r>
-                    <w:rPr>
-                      <w:color w:val="FFFEFD"/>
-                      <w:spacing w:val="11"/>
-                      <w:w w:val="111"/>
-                      <w:sz w:val="19"/>
-                      <w:szCs w:val="19"/>
-                    </w:rPr>
-                    <w:t xml:space="preserve">  </w:t>
-                  </w:r>
-                  <w:r>
-                    <w:rPr>
-                      <w:color w:val="FFFEFD"/>
-                      <w:w w:val="111"/>
-                      <w:sz w:val="19"/>
-                      <w:szCs w:val="19"/>
-                    </w:rPr>
-                    <w:t>-</w:t>
-                  </w:r>
-                  <w:r>
-                    <w:rPr>
-                      <w:color w:val="FFFEFD"/>
-                      <w:spacing w:val="11"/>
-                      <w:w w:val="111"/>
-                      <w:sz w:val="19"/>
-                      <w:szCs w:val="19"/>
-                    </w:rPr>
-                    <w:t xml:space="preserve">  </w:t>
-                  </w:r>
-                  <w:r>
-                    <w:rPr>
-                      <w:color w:val="FFFEFD"/>
-                      <w:w w:val="111"/>
-                      <w:sz w:val="19"/>
-                      <w:szCs w:val="19"/>
-                    </w:rPr>
-                    <w:t>CFTA:</w:t>
-                  </w:r>
-                  <w:r>
-                    <w:rPr>
-                      <w:color w:val="FFFEFD"/>
-                      <w:spacing w:val="11"/>
-                      <w:w w:val="111"/>
-                      <w:sz w:val="19"/>
-                      <w:szCs w:val="19"/>
-                    </w:rPr>
-                    <w:t xml:space="preserve"> </w:t>
-                  </w:r>
-                  <w:r>
-                    <w:rPr>
-                      <w:color w:val="FFFEFD"/>
-                      <w:w w:val="111"/>
-                      <w:sz w:val="19"/>
-                      <w:szCs w:val="19"/>
-                    </w:rPr>
-                    <w:t>05788394589</w:t>
-                  </w:r>
-                </w:p>
-              </w:txbxContent>
-            </v:textbox>
-          </v:rect>
-          <v:shape id="Shape 210" o:spid="_x0000_s1534" style="position:absolute;left:50496;top:1568;width:453;height:1247;visibility:visible;mso-wrap-style:square;v-text-anchor:top" coordsize="45282,124666" o:spt="100" o:gfxdata="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" adj="0,,0" path="m45282,r,27687l32822,32842v-3190,3186,-5161,7587,-5161,12444c27661,50157,29632,54564,32822,57753r12460,5159l45282,124666,19176,93238c93,64567,,45286,,45286,,26532,11402,10434,27657,3558l45282,xe" fillcolor="#fffefd" stroked="f" strokeweight="0">
-            <v:stroke miterlimit="83231f" joinstyle="miter"/>
-            <v:formulas/>
-            <v:path arrowok="t" o:connecttype="segments" textboxrect="0,0,45282,124666"/>
-          </v:shape>
-          <v:shape id="Shape 211" o:spid="_x0000_s1535" style="position:absolute;left:50949;top:1568;width:453;height:1247;visibility:visible;mso-wrap-style:square;v-text-anchor:top" coordsize="45295,124675" o:spt="100" o:gfxdata="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" adj="0,,0" path="m6,c25025,,45295,20282,45295,45288v,,-826,34925,-45289,79387l,124668,,62913r6,3c9734,62916,17621,55029,17621,45288,17621,35572,9734,27686,6,27686r-6,2l,2,6,xe" fillcolor="#fffefd" stroked="f" strokeweight="0">
-            <v:stroke miterlimit="83231f" joinstyle="miter"/>
-            <v:formulas/>
-            <v:path arrowok="t" o:connecttype="segments" textboxrect="0,0,45295,124675"/>
-          </v:shape>
-          <v:rect id="Rectangle 212" o:spid="_x0000_s1536" style="position:absolute;left:51963;top:1567;width:48424;height:2052;visibility:visible;mso-wrap-style:square;v-text-anchor:top" o:gfxdata="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" filled="f" stroked="f">
-            <v:textbox style="mso-next-textbox:#Rectangle 212" inset="0,0,0,0">
-              <w:txbxContent>
-                <w:p>
-                  <w:r>
-                    <w:rPr>
-                      <w:color w:val="FFFEFD"/>
-                      <w:w w:val="113"/>
-                      <w:sz w:val="20"/>
-                    </w:rPr>
-                    <w:t>Rua</w:t>
-                  </w:r>
-                  <w:r>
-                    <w:rPr>
-                      <w:color w:val="FFFEFD"/>
-                      <w:w w:val="113"/>
-                      <w:sz w:val="20"/>
-                    </w:rPr>
-                    <w:t xml:space="preserve">       </w:t>
-                  </w:r>
-                  <w:r>
-                    <w:rPr>
-                      <w:color w:val="FFFEFD"/>
-                      <w:w w:val="113"/>
-                      <w:sz w:val="19"/>
-                      <w:szCs w:val="19"/>
-                    </w:rPr>
-                    <w:t>Rua Theognes Antonio Calixto, n° 109, Centro, Conceição do Coité-</w:t>
-                  </w:r>
-                  <w:r>
-                    <w:rPr>
-                      <w:color w:val="FFFEFD"/>
-                      <w:spacing w:val="11"/>
-                      <w:w w:val="113"/>
-                      <w:sz w:val="19"/>
-                      <w:szCs w:val="19"/>
-                    </w:rPr>
-                    <w:t xml:space="preserve"> </w:t>
-                  </w:r>
-                  <w:r>
-                    <w:rPr>
-                      <w:color w:val="FFFEFD"/>
-                      <w:w w:val="113"/>
-                      <w:sz w:val="19"/>
-                      <w:szCs w:val="19"/>
-                    </w:rPr>
-                    <w:t>BA, 48730-000</w:t>
-                  </w:r>
-                </w:p>
-              </w:txbxContent>
-            </v:textbox>
-          </v:rect>
-          <w10:wrap type="topAndBottom" anchorx="page" anchory="page"/>
-        </v:group>
-      </w:pict>
-    </w:r>
+    <w:pPr>
+      <w:pStyle w:val="Rodap"/>
+      <w:jc w:val="center"/>
+    </w:pPr>
   </w:p>
 </w:ftr>
 </file>
@@ -5056,7 +3778,7 @@
 </file>
 
 <file path=word/header1.xml><?xml version="1.0" encoding="utf-8"?>
-<w:hdr xmlns:wpc="http://schemas.microsoft.com/office/word/2010/wordprocessingCanvas" xmlns:cx="http://schemas.microsoft.com/office/drawing/2014/chartex" xmlns:cx1="http://schemas.microsoft.com/office/drawing/2015/9/8/chartex" xmlns:cx2="http://schemas.microsoft.com/office/drawing/2015/10/21/chartex" xmlns:cx3="http://schemas.microsoft.com/office/drawing/2016/5/9/chartex" xmlns:cx4="http://schemas.microsoft.com/office/drawing/2016/5/10/chartex" xmlns:cx5="http://schemas.microsoft.com/office/drawing/2016/5/11/chartex" xmlns:cx6="http://schemas.microsoft.com/office/drawing/2016/5/12/chartex" xmlns:cx7="http://schemas.microsoft.com/office/drawing/2016/5/13/chartex" xmlns:cx8="http://schemas.microsoft.com/office/drawing/2016/5/14/chartex" xmlns:mc="http://schemas.openxmlformats.org/markup-compatibility/2006" xmlns:aink="http://schemas.microsoft.com/office/drawing/2016/ink" xmlns:am3d="http://schemas.microsoft.com/office/drawing/2017/model3d" xmlns:o="urn:schemas-microsoft-com:office:office" xmlns:oel="http://schemas.microsoft.com/office/2019/extlst" xmlns:r="http://schemas.openxmlformats.org/officeDocument/2006/relationships" xmlns:m="http://schemas.openxmlformats.org/officeDocument/2006/math" xmlns:v="urn:schemas-microsoft-com:vml" xmlns:wp14="http://schemas.microsoft.com/office/word/2010/wordprocessingDrawing" xmlns:wp="http://schemas.openxmlformats.org/drawingml/2006/wordprocessingDrawing" xmlns:w10="urn:schemas-microsoft-com:office:word" xmlns:w="http://schemas.openxmlformats.org/wordprocessingml/2006/main" xmlns:w14="http://schemas.microsoft.com/office/word/2010/wordml" xmlns:w15="http://schemas.microsoft.com/office/word/2012/wordml" xmlns:w16cex="http://schemas.microsoft.com/office/word/2018/wordml/cex" xmlns:w16cid="http://schemas.microsoft.com/office/word/2016/wordml/cid" xmlns:w16="http://schemas.microsoft.com/office/word/2018/wordml" xmlns:w16du="http://schemas.microsoft.com/office/word/2023/wordml/word16du" xmlns:w16sdtdh="http://schemas.microsoft.com/office/word/2020/wordml/sdtdatahash" xmlns:w16sdtfl="http://schemas.microsoft.com/office/word/2024/wordml/sdtformatlock" xmlns:w16se="http://schemas.microsoft.com/office/word/2015/wordml/symex" xmlns:wpg="http://schemas.microsoft.com/office/word/2010/wordprocessingGroup" xmlns:wpi="http://schemas.microsoft.com/office/word/2010/wordprocessingInk" xmlns:wne="http://schemas.microsoft.com/office/word/2006/wordml" xmlns:wps="http://schemas.microsoft.com/office/word/2010/wordprocessingShape" mc:Ignorable="w14 w15 w16se w16cid w16 w16cex w16sdtdh w16sdtfl w16du wp14">
+<w:hdr xmlns:ve="http://schemas.openxmlformats.org/markup-compatibility/2006" xmlns:o="urn:schemas-microsoft-com:office:office" xmlns:r="http://schemas.openxmlformats.org/officeDocument/2006/relationships" xmlns:m="http://schemas.openxmlformats.org/officeDocument/2006/math" xmlns:v="urn:schemas-microsoft-com:vml" xmlns:wp="http://schemas.openxmlformats.org/drawingml/2006/wordprocessingDrawing" xmlns:w10="urn:schemas-microsoft-com:office:word" xmlns:w="http://schemas.openxmlformats.org/wordprocessingml/2006/main" xmlns:wne="http://schemas.microsoft.com/office/word/2006/wordml">
   <w:p>
     <w:pPr>
       <w:pStyle w:val="Cabealho"/>
@@ -5066,7 +3788,7 @@
         <w:noProof/>
         <w:lang w:val="pt-BR" w:eastAsia="pt-BR" w:bidi="ar-SA"/>
       </w:rPr>
-      <w:pict w14:anchorId="3C5AC73A">
+      <w:pict>
         <v:shapetype id="_x0000_t75" coordsize="21600,21600" o:spt="75" o:preferrelative="t" path="m@4@5l@4@11@9@11@9@5xe" filled="f" stroked="f">
           <v:stroke joinstyle="miter"/>
           <v:formulas>
@@ -5086,7 +3808,7 @@
           <v:path o:extrusionok="f" gradientshapeok="t" o:connecttype="rect"/>
           <o:lock v:ext="edit" aspectratio="t"/>
         </v:shapetype>
-        <v:shape id="WordPictureWatermark180196532" o:spid="_x0000_s1506" type="#_x0000_t75" style="position:absolute;left:0;text-align:left;margin-left:0;margin-top:0;width:322.55pt;height:360.8pt;z-index:-251623424;mso-position-horizontal:center;mso-position-horizontal-relative:margin;mso-position-vertical:center;mso-position-vertical-relative:margin" o:allowincell="f">
+        <v:shape id="WordPictureWatermark179838110" o:spid="_x0000_s1124" type="#_x0000_t75" style="position:absolute;margin-left:0;margin-top:0;width:322.55pt;height:360.8pt;z-index:-251650048;mso-position-horizontal:center;mso-position-horizontal-relative:margin;mso-position-vertical:center;mso-position-vertical-relative:margin" o:allowincell="f">
           <v:imagedata r:id="rId1" o:title="Marca D'agua" gain="19661f" blacklevel="22938f"/>
           <w10:wrap anchorx="margin" anchory="margin"/>
         </v:shape>
@@ -5097,22 +3819,157 @@
 </file>
 
 <file path=word/header2.xml><?xml version="1.0" encoding="utf-8"?>
-<w:hdr xmlns:wpc="http://schemas.microsoft.com/office/word/2010/wordprocessingCanvas" xmlns:cx="http://schemas.microsoft.com/office/drawing/2014/chartex" xmlns:cx1="http://schemas.microsoft.com/office/drawing/2015/9/8/chartex" xmlns:cx2="http://schemas.microsoft.com/office/drawing/2015/10/21/chartex" xmlns:cx3="http://schemas.microsoft.com/office/drawing/2016/5/9/chartex" xmlns:cx4="http://schemas.microsoft.com/office/drawing/2016/5/10/chartex" xmlns:cx5="http://schemas.microsoft.com/office/drawing/2016/5/11/chartex" xmlns:cx6="http://schemas.microsoft.com/office/drawing/2016/5/12/chartex" xmlns:cx7="http://schemas.microsoft.com/office/drawing/2016/5/13/chartex" xmlns:cx8="http://schemas.microsoft.com/office/drawing/2016/5/14/chartex" xmlns:mc="http://schemas.openxmlformats.org/markup-compatibility/2006" xmlns:aink="http://schemas.microsoft.com/office/drawing/2016/ink" xmlns:am3d="http://schemas.microsoft.com/office/drawing/2017/model3d" xmlns:o="urn:schemas-microsoft-com:office:office" xmlns:oel="http://schemas.microsoft.com/office/2019/extlst" xmlns:r="http://schemas.openxmlformats.org/officeDocument/2006/relationships" xmlns:m="http://schemas.openxmlformats.org/officeDocument/2006/math" xmlns:v="urn:schemas-microsoft-com:vml" xmlns:wp14="http://schemas.microsoft.com/office/word/2010/wordprocessingDrawing" xmlns:wp="http://schemas.openxmlformats.org/drawingml/2006/wordprocessingDrawing" xmlns:w10="urn:schemas-microsoft-com:office:word" xmlns:w="http://schemas.openxmlformats.org/wordprocessingml/2006/main" xmlns:w14="http://schemas.microsoft.com/office/word/2010/wordml" xmlns:w15="http://schemas.microsoft.com/office/word/2012/wordml" xmlns:w16cex="http://schemas.microsoft.com/office/word/2018/wordml/cex" xmlns:w16cid="http://schemas.microsoft.com/office/word/2016/wordml/cid" xmlns:w16="http://schemas.microsoft.com/office/word/2018/wordml" xmlns:w16du="http://schemas.microsoft.com/office/word/2023/wordml/word16du" xmlns:w16sdtdh="http://schemas.microsoft.com/office/word/2020/wordml/sdtdatahash" xmlns:w16sdtfl="http://schemas.microsoft.com/office/word/2024/wordml/sdtformatlock" xmlns:w16se="http://schemas.microsoft.com/office/word/2015/wordml/symex" xmlns:wpg="http://schemas.microsoft.com/office/word/2010/wordprocessingGroup" xmlns:wpi="http://schemas.microsoft.com/office/word/2010/wordprocessingInk" xmlns:wne="http://schemas.microsoft.com/office/word/2006/wordml" xmlns:wps="http://schemas.microsoft.com/office/word/2010/wordprocessingShape" mc:Ignorable="w14 w15 w16se w16cid w16 w16cex w16sdtdh w16sdtfl w16du wp14">
+<w:hdr xmlns:ve="http://schemas.openxmlformats.org/markup-compatibility/2006" xmlns:o="urn:schemas-microsoft-com:office:office" xmlns:r="http://schemas.openxmlformats.org/officeDocument/2006/relationships" xmlns:m="http://schemas.openxmlformats.org/officeDocument/2006/math" xmlns:v="urn:schemas-microsoft-com:vml" xmlns:wp="http://schemas.openxmlformats.org/drawingml/2006/wordprocessingDrawing" xmlns:w10="urn:schemas-microsoft-com:office:word" xmlns:w="http://schemas.openxmlformats.org/wordprocessingml/2006/main" xmlns:wne="http://schemas.microsoft.com/office/word/2006/wordml">
   <w:p>
     <w:pPr>
       <w:pStyle w:val="Corpodetexto"/>
       <w:spacing w:line="14" w:lineRule="auto"/>
-      <w:ind w:left="567"/>
       <w:rPr>
         <w:sz w:val="20"/>
       </w:rPr>
     </w:pPr>
     <w:r>
       <w:rPr>
+        <w:sz w:val="20"/>
+      </w:rPr>
+      <w:br/>
+    </w:r>
+    <w:r>
+      <w:rPr>
+        <w:sz w:val="20"/>
+      </w:rPr>
+      <w:br/>
+    </w:r>
+    <w:r>
+      <w:rPr>
+        <w:sz w:val="20"/>
+      </w:rPr>
+      <w:br/>
+    </w:r>
+    <w:r>
+      <w:rPr>
+        <w:sz w:val="20"/>
+      </w:rPr>
+      <w:br/>
+    </w:r>
+    <w:r>
+      <w:rPr>
+        <w:sz w:val="20"/>
+      </w:rPr>
+      <w:br/>
+    </w:r>
+    <w:r>
+      <w:rPr>
+        <w:sz w:val="20"/>
+      </w:rPr>
+      <w:br/>
+    </w:r>
+    <w:r>
+      <w:rPr>
+        <w:sz w:val="20"/>
+      </w:rPr>
+      <w:br/>
+    </w:r>
+    <w:r>
+      <w:rPr>
+        <w:sz w:val="20"/>
+      </w:rPr>
+      <w:br/>
+    </w:r>
+    <w:r>
+      <w:rPr>
+        <w:sz w:val="20"/>
+      </w:rPr>
+      <w:br/>
+    </w:r>
+    <w:r>
+      <w:rPr>
+        <w:sz w:val="20"/>
+      </w:rPr>
+      <w:br/>
+    </w:r>
+    <w:r>
+      <w:rPr>
+        <w:sz w:val="20"/>
+      </w:rPr>
+      <w:br/>
+    </w:r>
+    <w:r>
+      <w:rPr>
+        <w:sz w:val="20"/>
+      </w:rPr>
+      <w:br/>
+    </w:r>
+    <w:r>
+      <w:rPr>
+        <w:sz w:val="20"/>
+      </w:rPr>
+      <w:br/>
+    </w:r>
+    <w:r>
+      <w:rPr>
+        <w:sz w:val="20"/>
+      </w:rPr>
+      <w:br/>
+    </w:r>
+    <w:r>
+      <w:rPr>
+        <w:noProof/>
+        <w:sz w:val="20"/>
+        <w:lang w:val="pt-BR" w:eastAsia="pt-BR" w:bidi="ar-SA"/>
+      </w:rPr>
+      <w:drawing>
+        <wp:inline distT="0" distB="0" distL="0" distR="0">
+          <wp:extent cx="1200150" cy="616470"/>
+          <wp:effectExtent l="19050" t="0" r="0" b="0"/>
+          <wp:docPr id="34" name="Imagem 34" descr="C:\Users\User\OneDrive\Imagens\dprollogo\logolateral.png"/>
+          <wp:cNvGraphicFramePr>
+            <a:graphicFrameLocks xmlns:a="http://schemas.openxmlformats.org/drawingml/2006/main" noChangeAspect="1"/>
+          </wp:cNvGraphicFramePr>
+          <a:graphic xmlns:a="http://schemas.openxmlformats.org/drawingml/2006/main">
+            <a:graphicData uri="http://schemas.openxmlformats.org/drawingml/2006/picture">
+              <pic:pic xmlns:pic="http://schemas.openxmlformats.org/drawingml/2006/picture">
+                <pic:nvPicPr>
+                  <pic:cNvPr id="0" name="Picture 34" descr="C:\Users\User\OneDrive\Imagens\dprollogo\logolateral.png"/>
+                  <pic:cNvPicPr>
+                    <a:picLocks noChangeAspect="1" noChangeArrowheads="1"/>
+                  </pic:cNvPicPr>
+                </pic:nvPicPr>
+                <pic:blipFill>
+                  <a:blip r:embed="rId1"/>
+                  <a:srcRect/>
+                  <a:stretch>
+                    <a:fillRect/>
+                  </a:stretch>
+                </pic:blipFill>
+                <pic:spPr bwMode="auto">
+                  <a:xfrm>
+                    <a:off x="0" y="0"/>
+                    <a:ext cx="1202802" cy="617832"/>
+                  </a:xfrm>
+                  <a:prstGeom prst="rect">
+                    <a:avLst/>
+                  </a:prstGeom>
+                  <a:noFill/>
+                  <a:ln w="9525">
+                    <a:noFill/>
+                    <a:miter lim="800000"/>
+                    <a:headEnd/>
+                    <a:tailEnd/>
+                  </a:ln>
+                </pic:spPr>
+              </pic:pic>
+            </a:graphicData>
+          </a:graphic>
+        </wp:inline>
+      </w:drawing>
+    </w:r>
+    <w:r>
+      <w:rPr>
         <w:noProof/>
         <w:lang w:val="pt-BR" w:eastAsia="pt-BR" w:bidi="ar-SA"/>
       </w:rPr>
-      <w:pict w14:anchorId="0199C07C">
+      <w:pict>
         <v:shapetype id="_x0000_t75" coordsize="21600,21600" o:spt="75" o:preferrelative="t" path="m@4@5l@4@11@9@11@9@5xe" filled="f" stroked="f">
           <v:stroke joinstyle="miter"/>
           <v:formulas>
@@ -5132,927 +3989,10 @@
           <v:path o:extrusionok="f" gradientshapeok="t" o:connecttype="rect"/>
           <o:lock v:ext="edit" aspectratio="t"/>
         </v:shapetype>
-        <v:shape id="WordPictureWatermark180196533" o:spid="_x0000_s1507" type="#_x0000_t75" style="position:absolute;left:0;text-align:left;margin-left:0;margin-top:0;width:322.55pt;height:360.8pt;z-index:-251622400;mso-position-horizontal:center;mso-position-horizontal-relative:margin;mso-position-vertical:center;mso-position-vertical-relative:margin" o:allowincell="f">
-          <v:imagedata r:id="rId1" o:title="Marca D'agua" gain="19661f" blacklevel="22938f"/>
+        <v:shape id="WordPictureWatermark179838111" o:spid="_x0000_s1125" type="#_x0000_t75" style="position:absolute;margin-left:0;margin-top:0;width:322.55pt;height:360.8pt;z-index:-251649024;mso-position-horizontal:center;mso-position-horizontal-relative:margin;mso-position-vertical:center;mso-position-vertical-relative:margin" o:allowincell="f">
+          <v:imagedata r:id="rId2" o:title="Marca D'agua" gain="19661f" blacklevel="22938f"/>
           <w10:wrap anchorx="margin" anchory="margin"/>
         </v:shape>
-      </w:pict>
-    </w:r>
-    <w:r>
-      <w:rPr>
-        <w:noProof/>
-      </w:rPr>
-      <w:pict w14:anchorId="027A024F">
-        <v:group id="Group 1131" o:spid="_x0000_s1409" style="position:absolute;left:0;text-align:left;margin-left:-42.1pt;margin-top:31.8pt;width:730pt;height:47.45pt;z-index:251688960" coordsize="92711,6024" o:gfxdata="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">
-          <v:shape id="Shape 134" o:spid="_x0000_s1410" style="position:absolute;left:6195;top:1820;width:1324;height:3012;visibility:visible;mso-wrap-style:square;v-text-anchor:top" coordsize="132398,301148" o:spt="100" o:gfxdata="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" adj="0,,0" path="m132398,r,70174l122543,72513c100940,84159,89903,112048,89903,148824v,41272,11945,67835,33781,78537l132398,229229r,71919l115911,299937c40469,288167,,235727,,149917,,70296,35870,14876,105797,2265l132398,xe" fillcolor="#4e4d48" stroked="f" strokeweight="0">
-            <v:stroke miterlimit="83231f" joinstyle="miter"/>
-            <v:formulas/>
-            <v:path arrowok="t" o:connecttype="segments" textboxrect="0,0,132398,301148"/>
-          </v:shape>
-          <v:shape id="Shape 135" o:spid="_x0000_s1411" style="position:absolute;left:7519;top:503;width:1323;height:4342;visibility:visible;mso-wrap-style:square;v-text-anchor:top" coordsize="132398,434251" o:spt="100" o:gfxdata="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" adj="0,,0" path="m42494,r89904,l132398,413004c109512,424993,65926,434251,17971,434251l,432930,,361011r16345,3504c26149,364515,37592,362877,42494,360693r,-158001c37592,200508,25603,198336,15253,198336l,201956,,131782r5448,-464c18517,131318,34315,134036,42494,136766l42494,xe" fillcolor="#4e4d48" stroked="f" strokeweight="0">
-            <v:stroke miterlimit="83231f" joinstyle="miter"/>
-            <v:formulas/>
-            <v:path arrowok="t" o:connecttype="segments" textboxrect="0,0,132398,434251"/>
-          </v:shape>
-          <v:shape id="Shape 136" o:spid="_x0000_s1412" style="position:absolute;left:9456;top:1777;width:1324;height:4174;visibility:visible;mso-wrap-style:square;v-text-anchor:top" coordsize="132404,417373" o:spt="100" o:gfxdata="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" adj="0,,0" path="m114414,r17990,1322l132404,72162,116053,68656v-10338,,-20701,2185,-26150,4356l89903,231026v4902,2184,16345,4356,26696,4356l132404,231591r,70844l126403,302946v-13068,,-28334,-2185,-36500,-4902l89903,417373,,417373,,21260c23432,9271,67018,,114414,xe" fillcolor="#4e4d48" stroked="f" strokeweight="0">
-            <v:stroke miterlimit="83231f" joinstyle="miter"/>
-            <v:formulas/>
-            <v:path arrowok="t" o:connecttype="segments" textboxrect="0,0,132404,417373"/>
-          </v:shape>
-          <v:shape id="Shape 137" o:spid="_x0000_s1413" style="position:absolute;left:10780;top:1791;width:1324;height:3011;visibility:visible;mso-wrap-style:square;v-text-anchor:top" coordsize="132404,301113" o:spt="100" o:gfxdata="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" adj="0,,0" path="m,l16476,1211c91935,12983,132404,65432,132404,151243v,79621,-36298,135040,-106332,147651l,301113,,230268r9395,-2253c31156,216215,42501,188019,42501,151243,42501,109971,30549,83408,8709,72706l,70839,,xe" fillcolor="#4e4d48" stroked="f" strokeweight="0">
-            <v:stroke miterlimit="83231f" joinstyle="miter"/>
-            <v:formulas/>
-            <v:path arrowok="t" o:connecttype="segments" textboxrect="0,0,132404,301113"/>
-          </v:shape>
-          <v:shape id="Shape 138" o:spid="_x0000_s1414" style="position:absolute;left:12594;top:1777;width:1700;height:3003;visibility:visible;mso-wrap-style:square;v-text-anchor:top" coordsize="169989,300215" o:spt="100" o:gfxdata="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" adj="0,,0" path="m127495,v17437,,32157,1638,42494,3277l153657,76289v-8725,-3277,-21259,-5448,-33236,-5448c108966,70841,98069,72466,89891,75743r,224472l,300215,,21260c32702,8725,75730,,127495,xe" fillcolor="#4e4d48" stroked="f" strokeweight="0">
-            <v:stroke miterlimit="83231f" joinstyle="miter"/>
-            <v:formulas/>
-            <v:path arrowok="t" o:connecttype="segments" textboxrect="0,0,169989,300215"/>
-          </v:shape>
-          <v:shape id="Shape 139" o:spid="_x0000_s1415" style="position:absolute;left:14468;top:1777;width:1379;height:3068;visibility:visible;mso-wrap-style:square;v-text-anchor:top" coordsize="137846,306769" o:spt="100" o:gfxdata="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" adj="0,,0" path="m137846,r,69748c106248,69748,89903,98082,89903,152032v,53937,16345,82816,47943,82816l137846,306769c50127,306769,,240830,,153111,,65392,50127,,137846,xe" fillcolor="#4e4d48" stroked="f" strokeweight="0">
-            <v:stroke miterlimit="83231f" joinstyle="miter"/>
-            <v:formulas/>
-            <v:path arrowok="t" o:connecttype="segments" textboxrect="0,0,137846,306769"/>
-          </v:shape>
-          <v:shape id="Shape 140" o:spid="_x0000_s1416" style="position:absolute;left:15847;top:1777;width:1378;height:3068;visibility:visible;mso-wrap-style:square;v-text-anchor:top" coordsize="137846,306769" o:spt="100" o:gfxdata="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" adj="0,,0" path="m,c87719,,137846,65392,137846,153111,137846,240830,87719,306769,,306769l,234848v31598,,47942,-28879,47942,-82816c47942,98082,31598,69748,,69748l,xe" fillcolor="#4e4d48" stroked="f" strokeweight="0">
-            <v:stroke miterlimit="83231f" joinstyle="miter"/>
-            <v:formulas/>
-            <v:path arrowok="t" o:connecttype="segments" textboxrect="0,0,137846,306769"/>
-          </v:shape>
-          <v:shape id="Shape 1349" o:spid="_x0000_s1417" style="position:absolute;left:17721;top:503;width:899;height:4277;visibility:visible;mso-wrap-style:square;v-text-anchor:top" coordsize="89903,427710" o:spt="100" o:gfxdata="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" adj="0,,0" path="m,l89903,r,427710l,427710,,e" fillcolor="#4e4d48" stroked="f" strokeweight="0">
-            <v:stroke miterlimit="83231f" joinstyle="miter"/>
-            <v:formulas/>
-            <v:path arrowok="t" o:connecttype="segments" textboxrect="0,0,89903,427710"/>
-          </v:shape>
-          <v:shape id="Shape 142" o:spid="_x0000_s1418" style="position:absolute;left:9096;top:503;width:899;height:1078;visibility:visible;mso-wrap-style:square;v-text-anchor:top" coordsize="89903,107886" o:spt="100" o:gfxdata="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" adj="0,,0" path="m35966,c65761,,89903,24155,89903,53950v,29781,-24142,53936,-53937,53936l35966,71920c16104,71920,,55829,,35966,,16104,16104,,35966,xe" fillcolor="#4e4d48" stroked="f" strokeweight="0">
-            <v:stroke miterlimit="83231f" joinstyle="miter"/>
-            <v:formulas/>
-            <v:path arrowok="t" o:connecttype="segments" textboxrect="0,0,89903,107886"/>
-          </v:shape>
-          <v:shape id="Shape 143" o:spid="_x0000_s1419" style="position:absolute;left:2648;top:1295;width:1323;height:3991;visibility:visible;mso-wrap-style:square;v-text-anchor:top" coordsize="132391,399174" o:spt="100" o:gfxdata="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" adj="0,,0" path="m,l89891,r,101676c98069,98958,113868,96228,126949,96228r5442,463l132391,166866r-15246,-3620c106782,163246,94806,165430,89891,167615r,158000c94806,327800,106236,329425,116053,329425r16338,-3502l132391,397852r-17977,1322c66459,399174,22885,389903,,377927l,xe" fillcolor="#24613a" stroked="f" strokeweight="0">
-            <v:stroke miterlimit="83231f" joinstyle="miter"/>
-            <v:formulas/>
-            <v:path arrowok="t" o:connecttype="segments" textboxrect="0,0,132391,399174"/>
-          </v:shape>
-          <v:shape id="Shape 144" o:spid="_x0000_s1420" style="position:absolute;left:3971;top:2262;width:1324;height:3011;visibility:visible;mso-wrap-style:square;v-text-anchor:top" coordsize="132404,301161" o:spt="100" o:gfxdata="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" adj="0,,0" path="m,l26603,2266c96524,14879,132404,70307,132404,149917v,85811,-40469,138260,-115919,150032l,301161,,229231r8714,-1868c30549,216664,42501,190106,42501,148825,42501,112058,31463,84164,9861,72515l,70174,,xe" fillcolor="#24613a" stroked="f" strokeweight="0">
-            <v:stroke miterlimit="83231f" joinstyle="miter"/>
-            <v:formulas/>
-            <v:path arrowok="t" o:connecttype="segments" textboxrect="0,0,132404,301161"/>
-          </v:shape>
-          <v:shape id="Shape 145" o:spid="_x0000_s1421" style="position:absolute;top:726;width:1323;height:3012;visibility:visible;mso-wrap-style:square;v-text-anchor:top" coordsize="132391,301114" o:spt="100" o:gfxdata="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" adj="0,,0" path="m132391,r,70840l123688,72706c101849,83408,89891,109971,89891,151243v,36776,11344,64972,33106,76772l132391,230268r,70846l106311,298894c36288,286283,,230864,,151243,,65432,40459,12983,115916,1211l132391,xe" fillcolor="#017841" stroked="f" strokeweight="0">
-            <v:stroke miterlimit="83231f" joinstyle="miter"/>
-            <v:formulas/>
-            <v:path arrowok="t" o:connecttype="segments" textboxrect="0,0,132391,301114"/>
-          </v:shape>
-          <v:shape id="Shape 146" o:spid="_x0000_s1422" style="position:absolute;left:1323;top:713;width:1324;height:3921;visibility:visible;mso-wrap-style:square;v-text-anchor:top" coordsize="132404,392125" o:spt="100" o:gfxdata="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" adj="0,,0" path="m17990,v47396,,90995,9271,114414,21260l132404,392125r-89903,l42501,298044v-8167,2717,-23419,4902,-36513,4902l,302436,,231591r15805,3791c26156,235382,37598,233210,42501,231026r,-158014c37065,70828,26702,68656,16351,68656l,72162,,1322,17990,xe" fillcolor="#017841" stroked="f" strokeweight="0">
-            <v:stroke miterlimit="83231f" joinstyle="miter"/>
-            <v:formulas/>
-            <v:path arrowok="t" o:connecttype="segments" textboxrect="0,0,132404,392125"/>
-          </v:shape>
-          <v:shape id="Shape 147" o:spid="_x0000_s1423" style="position:absolute;top:1838;width:1323;height:3012;visibility:visible;mso-wrap-style:square;v-text-anchor:top" coordsize="132391,301148" o:spt="100" o:gfxdata="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" adj="0,,0" path="m132391,r,70161l122530,72501c100928,84148,89891,112039,89891,148825v,41272,11951,67835,33786,78537l132391,229230r,71918l115907,299937c40459,288168,,235728,,149917,,70296,35870,14877,105789,2266l132391,xe" fillcolor="#24613a" stroked="f" strokeweight="0">
-            <v:stroke miterlimit="83231f" joinstyle="miter"/>
-            <v:formulas/>
-            <v:path arrowok="t" o:connecttype="segments" textboxrect="0,0,132391,301148"/>
-          </v:shape>
-          <v:shape id="Shape 148" o:spid="_x0000_s1424" style="position:absolute;left:1323;width:1325;height:4863;visibility:visible;mso-wrap-style:square;v-text-anchor:top" coordsize="132404,486336" o:spt="100" o:gfxdata="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" adj="0,,0" path="m98950,2806c115145,,132404,11909,132404,30940r,434149c109506,477078,65932,486336,17977,486336l,485015,,413097r16339,3503c26156,416600,37586,414962,42501,412778r,-158001c37586,252593,25610,250408,15246,250408l,254027,,183867r5442,-464c18523,183403,34322,186121,42501,188851r,-136766l83788,10797c88271,6311,93551,3741,98950,2806xe" fillcolor="#24613a" stroked="f" strokeweight="0">
-            <v:stroke miterlimit="83231f" joinstyle="miter"/>
-            <v:formulas/>
-            <v:path arrowok="t" o:connecttype="segments" textboxrect="0,0,132404,486336"/>
-          </v:shape>
-          <v:shape id="Shape 149" o:spid="_x0000_s1425" style="position:absolute;left:2647;top:1081;width:1324;height:4943;visibility:visible;mso-wrap-style:square;v-text-anchor:top" coordsize="132398,494322" o:spt="100" o:gfxdata="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" adj="0,,0" path="m114414,r17984,1322l132398,72161,116053,68656v-10351,,-20701,2172,-26162,4356l89891,231026v4915,2184,16357,4356,26708,4356l132398,231592r,70844l126403,302946v-13081,,-28334,-2185,-36512,-4902l89891,456247v,25362,-30658,38075,-48603,20130l,435089,,21260c23432,9271,67018,,114414,xe" fillcolor="#017841" stroked="f" strokeweight="0">
-            <v:stroke miterlimit="83231f" joinstyle="miter"/>
-            <v:formulas/>
-            <v:path arrowok="t" o:connecttype="segments" textboxrect="0,0,132398,494322"/>
-          </v:shape>
-          <v:shape id="Shape 150" o:spid="_x0000_s1426" style="position:absolute;left:3971;top:1094;width:1325;height:3011;visibility:visible;mso-wrap-style:square;v-text-anchor:top" coordsize="132410,301114" o:spt="100" o:gfxdata="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" adj="0,,0" path="m,l16483,1211c91941,12983,132410,65433,132410,151243v,79622,-36307,135041,-106335,147652l,301114,,230270r9401,-2255c31163,216216,42507,188019,42507,151243,42507,109971,30548,83409,8710,72707l,70839,,xe" fillcolor="#017841" stroked="f" strokeweight="0">
-            <v:stroke miterlimit="83231f" joinstyle="miter"/>
-            <v:formulas/>
-            <v:path arrowok="t" o:connecttype="segments" textboxrect="0,0,132410,301114"/>
-          </v:shape>
-          <v:shape id="Shape 151" o:spid="_x0000_s1427" style="position:absolute;left:77570;top:1557;width:451;height:1335;visibility:visible;mso-wrap-style:square;v-text-anchor:top" coordsize="45123,133591" o:spt="100" o:gfxdata="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" adj="0,,0" path="m,l42545,r2578,432l45123,18256r-2578,-895l19076,17361r,52489l42545,69850r2578,-883l45123,86783r-2578,428l19076,87211r,46380l,133591,,xe" fillcolor="#4e4d48" stroked="f" strokeweight="0">
-            <v:stroke miterlimit="83231f" joinstyle="miter"/>
-            <v:formulas/>
-            <v:path arrowok="t" o:connecttype="segments" textboxrect="0,0,45123,133591"/>
-          </v:shape>
-          <v:shape id="Shape 152" o:spid="_x0000_s1428" style="position:absolute;left:78021;top:1561;width:457;height:863;visibility:visible;mso-wrap-style:square;v-text-anchor:top" coordsize="45707,86351" o:spt="100" o:gfxdata="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" adj="0,,0" path="m,l17691,2962c35513,9529,45707,24952,45707,43269v,18317,-10194,33633,-28016,40146l,86351,,68535,18465,62211v4913,-4581,7583,-11119,7583,-18942c26048,35446,23378,28861,18465,24232l,17824,,xe" fillcolor="#4e4d48" stroked="f" strokeweight="0">
-            <v:stroke miterlimit="83231f" joinstyle="miter"/>
-            <v:formulas/>
-            <v:path arrowok="t" o:connecttype="segments" textboxrect="0,0,45707,86351"/>
-          </v:shape>
-          <v:shape id="Shape 153" o:spid="_x0000_s1429" style="position:absolute;left:78679;top:1902;width:496;height:990;visibility:visible;mso-wrap-style:square;v-text-anchor:top" coordsize="49619,99047" o:spt="100" o:gfxdata="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" adj="0,,0" path="m49619,r,19660c20993,16218,17361,37973,17361,55728r,43319l,99047,,2286r17361,l17361,19075c23863,6109,37211,,49619,xe" fillcolor="#4e4d48" stroked="f" strokeweight="0">
-            <v:stroke miterlimit="83231f" joinstyle="miter"/>
-            <v:formulas/>
-            <v:path arrowok="t" o:connecttype="segments" textboxrect="0,0,49619,99047"/>
-          </v:shape>
-          <v:shape id="Shape 154" o:spid="_x0000_s1430" style="position:absolute;left:79271;top:1902;width:508;height:1015;visibility:visible;mso-wrap-style:square;v-text-anchor:top" coordsize="50857,101524" o:spt="100" o:gfxdata="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" adj="0,,0" path="m50762,r95,19l50857,16427r-95,-19c31673,16408,17932,30925,17932,50762v,19660,13741,34163,32830,34163l50857,84906r,16599l50762,101524c21577,101524,,78626,,50762,,22898,21577,,50762,xe" fillcolor="#4e4d48" stroked="f" strokeweight="0">
-            <v:stroke miterlimit="83231f" joinstyle="miter"/>
-            <v:formulas/>
-            <v:path arrowok="t" o:connecttype="segments" textboxrect="0,0,50857,101524"/>
-          </v:shape>
-          <v:shape id="Shape 155" o:spid="_x0000_s1431" style="position:absolute;left:79779;top:1902;width:507;height:1015;visibility:visible;mso-wrap-style:square;v-text-anchor:top" coordsize="50667,101486" o:spt="100" o:gfxdata="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" adj="0,,0" path="m,l20155,3994v18381,7747,30512,25851,30512,46749c50667,71641,38536,89746,20155,97492l,101486,,84888,13118,82333c25088,77332,32925,65488,32925,50743v,-14878,-7837,-26763,-19807,-31775l,16408,,xe" fillcolor="#4e4d48" stroked="f" strokeweight="0">
-            <v:stroke miterlimit="83231f" joinstyle="miter"/>
-            <v:formulas/>
-            <v:path arrowok="t" o:connecttype="segments" textboxrect="0,0,50667,101486"/>
-          </v:shape>
-          <v:shape id="Shape 156" o:spid="_x0000_s1432" style="position:absolute;left:80252;top:1925;width:400;height:1321;visibility:visible;mso-wrap-style:square;v-text-anchor:top" coordsize="40081,132067" o:spt="100" o:gfxdata="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" adj="0,,0" path="m22707,l40081,r,98476c40081,116599,29972,132067,6490,132067v-2477,,-4572,-190,-6490,-393l,116218v18517,584,22707,-8204,22707,-21184l22707,xe" fillcolor="#4e4d48" stroked="f" strokeweight="0">
-            <v:stroke miterlimit="83231f" joinstyle="miter"/>
-            <v:formulas/>
-            <v:path arrowok="t" o:connecttype="segments" textboxrect="0,0,40081,132067"/>
-          </v:shape>
-          <v:shape id="Shape 157" o:spid="_x0000_s1433" style="position:absolute;left:80465;top:1555;width:199;height:198;visibility:visible;mso-wrap-style:square;v-text-anchor:top" coordsize="19850,19850" o:spt="100" o:gfxdata="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" adj="0,,0" path="m9931,v5538,,9919,4585,9919,9919c19850,15456,15469,19850,9931,19850,4585,19850,,15456,,9919,,4585,4585,,9931,xe" fillcolor="#4e4d48" stroked="f" strokeweight="0">
-            <v:stroke miterlimit="83231f" joinstyle="miter"/>
-            <v:formulas/>
-            <v:path arrowok="t" o:connecttype="segments" textboxrect="0,0,19850,19850"/>
-          </v:shape>
-          <v:shape id="Shape 158" o:spid="_x0000_s1434" style="position:absolute;left:80843;top:1904;width:482;height:1006;visibility:visible;mso-wrap-style:square;v-text-anchor:top" coordsize="48190,100657" o:spt="100" o:gfxdata="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" adj="0,,0" path="m48190,r,16545l28557,23679c23333,28403,19850,35131,18517,43145r29673,l48190,58029r-29673,c19850,65948,23476,72628,29130,77328r19060,6208l48190,100657,30282,97336c11173,89589,,71485,,50587,,29689,11594,11584,29387,3838l48190,xe" fillcolor="#4e4d48" stroked="f" strokeweight="0">
-            <v:stroke miterlimit="83231f" joinstyle="miter"/>
-            <v:formulas/>
-            <v:path arrowok="t" o:connecttype="segments" textboxrect="0,0,48190,100657"/>
-          </v:shape>
-          <v:shape id="Shape 159" o:spid="_x0000_s1435" style="position:absolute;left:81325;top:2642;width:434;height:275;visibility:visible;mso-wrap-style:square;v-text-anchor:top" coordsize="43414,27483" o:spt="100" o:gfxdata="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" adj="0,,0" path="m29102,l43414,9169c34830,20803,20707,27483,3727,27483l,26791,,9670r3727,1214c14218,10884,23755,6871,29102,xe" fillcolor="#4e4d48" stroked="f" strokeweight="0">
-            <v:stroke miterlimit="83231f" joinstyle="miter"/>
-            <v:formulas/>
-            <v:path arrowok="t" o:connecttype="segments" textboxrect="0,0,43414,27483"/>
-          </v:shape>
-          <v:shape id="Shape 160" o:spid="_x0000_s1436" style="position:absolute;left:81325;top:1902;width:518;height:582;visibility:visible;mso-wrap-style:square;v-text-anchor:top" coordsize="51809,58204" o:spt="100" o:gfxdata="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" adj="0,,0" path="m857,c27197,,51809,22136,47237,58204l,58204,,43320r29673,c27387,26911,17266,16408,857,16408l,16720,,175,857,xe" fillcolor="#4e4d48" stroked="f" strokeweight="0">
-            <v:stroke miterlimit="83231f" joinstyle="miter"/>
-            <v:formulas/>
-            <v:path arrowok="t" o:connecttype="segments" textboxrect="0,0,51809,58204"/>
-          </v:shape>
-          <v:shape id="Shape 161" o:spid="_x0000_s1437" style="position:absolute;left:81908;top:1723;width:548;height:1179;visibility:visible;mso-wrap-style:square;v-text-anchor:top" coordsize="54775,117932" o:spt="100" o:gfxdata="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" adj="0,,0" path="m15075,l32448,r,20218l54775,20218r,16612l32448,36830r,42367c32448,92939,32639,102095,47714,102095v2857,,4966,-190,7061,-381l54775,116980v-2489,571,-5537,952,-9360,952c24422,117932,15075,106680,15075,85496r,-48666l,36830,,20218r15075,l15075,xe" fillcolor="#4e4d48" stroked="f" strokeweight="0">
-            <v:stroke miterlimit="83231f" joinstyle="miter"/>
-            <v:formulas/>
-            <v:path arrowok="t" o:connecttype="segments" textboxrect="0,0,54775,117932"/>
-          </v:shape>
-          <v:shape id="Shape 162" o:spid="_x0000_s1438" style="position:absolute;left:82599;top:1902;width:509;height:1015;visibility:visible;mso-wrap-style:square;v-text-anchor:top" coordsize="50870,101524" o:spt="100" o:gfxdata="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" adj="0,,0" path="m50775,r95,19l50870,16427r-95,-19c31686,16408,17945,30925,17945,50762v,19660,13741,34163,32830,34163l50870,84906r,16599l50775,101524c21578,101524,,78626,,50762,,22898,21578,,50775,xe" fillcolor="#4e4d48" stroked="f" strokeweight="0">
-            <v:stroke miterlimit="83231f" joinstyle="miter"/>
-            <v:formulas/>
-            <v:path arrowok="t" o:connecttype="segments" textboxrect="0,0,50870,101524"/>
-          </v:shape>
-          <v:shape id="Shape 163" o:spid="_x0000_s1439" style="position:absolute;left:83108;top:1902;width:506;height:1015;visibility:visible;mso-wrap-style:square;v-text-anchor:top" coordsize="50667,101486" o:spt="100" o:gfxdata="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" adj="0,,0" path="m,l20155,3994v18381,7747,30512,25851,30512,46749c50667,71641,38536,89746,20155,97492l,101486,,84888,13112,82333c25081,77332,32925,65488,32925,50743v,-14878,-7844,-26763,-19813,-31775l,16408,,xe" fillcolor="#4e4d48" stroked="f" strokeweight="0">
-            <v:stroke miterlimit="83231f" joinstyle="miter"/>
-            <v:formulas/>
-            <v:path arrowok="t" o:connecttype="segments" textboxrect="0,0,50667,101486"/>
-          </v:shape>
-          <v:shape id="Shape 164" o:spid="_x0000_s1440" style="position:absolute;left:83719;top:1902;width:770;height:1015;visibility:visible;mso-wrap-style:square;v-text-anchor:top" coordsize="76912,101524" o:spt="100" o:gfxdata="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" adj="0,,0" path="m39116,c54776,,68707,8026,72137,22327l55931,26721c54204,21374,48476,15659,37592,15659v-9537,,-16586,5334,-16586,13360c21006,39891,34354,40653,45428,42939v23660,4965,31484,12598,31484,27101c76912,87224,64695,101524,38939,101524,19851,101524,3823,93891,,79388l16980,73673v1537,4953,6693,11823,22339,11823c51905,85496,58979,80353,58979,71755,58979,60503,42761,60503,29401,57442,11265,53442,3442,44653,3442,30353,3442,12598,18136,,39116,xe" fillcolor="#4e4d48" stroked="f" strokeweight="0">
-            <v:stroke miterlimit="83231f" joinstyle="miter"/>
-            <v:formulas/>
-            <v:path arrowok="t" o:connecttype="segments" textboxrect="0,0,76912,101524"/>
-          </v:shape>
-          <v:shape id="Shape 165" o:spid="_x0000_s1441" style="position:absolute;left:84584;top:2677;width:332;height:427;visibility:visible;mso-wrap-style:square;v-text-anchor:top" coordsize="33210,42748" o:spt="100" o:gfxdata="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" adj="0,,0" path="m17170,l33210,9157,11252,42748,,36259,17170,xe" fillcolor="#4e4d48" stroked="f" strokeweight="0">
-            <v:stroke miterlimit="83231f" joinstyle="miter"/>
-            <v:formulas/>
-            <v:path arrowok="t" o:connecttype="segments" textboxrect="0,0,33210,42748"/>
-          </v:shape>
-          <v:shape id="Shape 166" o:spid="_x0000_s1442" style="position:absolute;left:85565;top:1902;width:769;height:1015;visibility:visible;mso-wrap-style:square;v-text-anchor:top" coordsize="76912,101524" o:spt="100" o:gfxdata="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" adj="0,,0" path="m39116,c54776,,68707,8026,72137,22327l55931,26721c54204,21374,48476,15659,37592,15659v-9537,,-16586,5334,-16586,13360c21006,39891,34354,40653,45428,42939v23660,4965,31484,12598,31484,27101c76912,87224,64695,101524,38939,101524,19851,101524,3823,93891,,79388l16980,73673v1537,4953,6693,11823,22339,11823c51905,85496,58979,80353,58979,71755,58979,60503,42761,60503,29401,57442,11265,53442,3442,44653,3442,30353,3442,12598,18136,,39116,xe" fillcolor="#4e4d48" stroked="f" strokeweight="0">
-            <v:stroke miterlimit="83231f" joinstyle="miter"/>
-            <v:formulas/>
-            <v:path arrowok="t" o:connecttype="segments" textboxrect="0,0,76912,101524"/>
-          </v:shape>
-          <v:shape id="Shape 167" o:spid="_x0000_s1443" style="position:absolute;left:86458;top:1904;width:482;height:1006;visibility:visible;mso-wrap-style:square;v-text-anchor:top" coordsize="48190,100660" o:spt="100" o:gfxdata="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" adj="0,,0" path="m48190,r,16545l28557,23679c23333,28403,19850,35131,18517,43145r29673,l48190,58029r-29673,c19850,65948,23476,72628,29128,77328r19062,6212l48190,100660,30272,97336c11165,89589,,71485,,50587,,29689,11594,11584,29387,3838l48190,xe" fillcolor="#4e4d48" stroked="f" strokeweight="0">
-            <v:stroke miterlimit="83231f" joinstyle="miter"/>
-            <v:formulas/>
-            <v:path arrowok="t" o:connecttype="segments" textboxrect="0,0,48190,100660"/>
-          </v:shape>
-          <v:shape id="Shape 168" o:spid="_x0000_s1444" style="position:absolute;left:86940;top:2642;width:434;height:275;visibility:visible;mso-wrap-style:square;v-text-anchor:top" coordsize="43414,27483" o:spt="100" o:gfxdata="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" adj="0,,0" path="m29102,l43414,9169c34830,20803,20707,27483,3715,27483l,26794,,9674r3715,1210c14218,10884,23755,6871,29102,xe" fillcolor="#4e4d48" stroked="f" strokeweight="0">
-            <v:stroke miterlimit="83231f" joinstyle="miter"/>
-            <v:formulas/>
-            <v:path arrowok="t" o:connecttype="segments" textboxrect="0,0,43414,27483"/>
-          </v:shape>
-          <v:shape id="Shape 169" o:spid="_x0000_s1445" style="position:absolute;left:86940;top:1902;width:518;height:582;visibility:visible;mso-wrap-style:square;v-text-anchor:top" coordsize="51809,58204" o:spt="100" o:gfxdata="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" adj="0,,0" path="m857,c27197,,51809,22136,47237,58204l,58204,,43320r29673,c27374,26911,17266,16408,857,16408l,16720,,175,857,xe" fillcolor="#4e4d48" stroked="f" strokeweight="0">
-            <v:stroke miterlimit="83231f" joinstyle="miter"/>
-            <v:formulas/>
-            <v:path arrowok="t" o:connecttype="segments" textboxrect="0,0,51809,58204"/>
-          </v:shape>
-          <v:shape id="Shape 170" o:spid="_x0000_s1446" style="position:absolute;left:87609;top:1902;width:496;height:990;visibility:visible;mso-wrap-style:square;v-text-anchor:top" coordsize="49606,99047" o:spt="100" o:gfxdata="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" adj="0,,0" path="m49606,r,19660c20980,16218,17361,37973,17361,55728r,43319l,99047,,2286r17361,l17361,19075c23850,6109,37199,,49606,xe" fillcolor="#4e4d48" stroked="f" strokeweight="0">
-            <v:stroke miterlimit="83231f" joinstyle="miter"/>
-            <v:formulas/>
-            <v:path arrowok="t" o:connecttype="segments" textboxrect="0,0,49606,99047"/>
-          </v:shape>
-          <v:shape id="Shape 171" o:spid="_x0000_s1447" style="position:absolute;left:88210;top:1925;width:951;height:967;visibility:visible;mso-wrap-style:square;v-text-anchor:top" coordsize="95034,96761" o:spt="100" o:gfxdata="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" adj="0,,0" path="m,l19469,,47523,75959,75755,,95034,,57441,96761r-19836,l,xe" fillcolor="#4e4d48" stroked="f" strokeweight="0">
-            <v:stroke miterlimit="83231f" joinstyle="miter"/>
-            <v:formulas/>
-            <v:path arrowok="t" o:connecttype="segments" textboxrect="0,0,95034,96761"/>
-          </v:shape>
-          <v:shape id="Shape 1350" o:spid="_x0000_s1448" style="position:absolute;left:89323;top:1925;width:176;height:967;visibility:visible;mso-wrap-style:square;v-text-anchor:top" coordsize="17564,96762" o:spt="100" o:gfxdata="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" adj="0,,0" path="m,l17564,r,96762l,96762,,e" fillcolor="#4e4d48" stroked="f" strokeweight="0">
-            <v:stroke miterlimit="83231f" joinstyle="miter"/>
-            <v:formulas/>
-            <v:path arrowok="t" o:connecttype="segments" textboxrect="0,0,17564,96762"/>
-          </v:shape>
-          <v:shape id="Shape 173" o:spid="_x0000_s1449" style="position:absolute;left:89312;top:1555;width:198;height:198;visibility:visible;mso-wrap-style:square;v-text-anchor:top" coordsize="19850,19850" o:spt="100" o:gfxdata="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" adj="0,,0" path="m9919,v5537,,9931,4585,9931,9931c19850,15456,15456,19850,9919,19850,4394,19850,,15456,,9931,,4585,4394,,9919,xe" fillcolor="#4e4d48" stroked="f" strokeweight="0">
-            <v:stroke miterlimit="83231f" joinstyle="miter"/>
-            <v:formulas/>
-            <v:path arrowok="t" o:connecttype="segments" textboxrect="0,0,19850,19850"/>
-          </v:shape>
-          <v:shape id="Shape 174" o:spid="_x0000_s1450" style="position:absolute;left:89690;top:1902;width:937;height:1471;visibility:visible;mso-wrap-style:square;v-text-anchor:top" coordsize="93700,147142" o:spt="100" o:gfxdata="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" adj="0,,0" path="m50762,c69647,,84912,9741,93700,23863l78816,32068c73089,22517,62967,16408,50762,16408v-19088,,-33020,14517,-33020,34354c17742,70422,31674,84925,50762,84925v12205,,22327,-5918,28054,-15456l93700,77483c84912,91796,69647,101524,50762,101524r-775,l46368,108598v11633,-1143,22136,4000,22136,17742c68504,138176,59347,147142,45034,147142v-6693,,-12598,-1905,-16612,-4203l34341,132258v1905,1143,5347,2476,9550,2476c51715,134734,56108,130924,56108,125006v,-5537,-3454,-8585,-9550,-8585c43307,116421,39891,117564,38164,118516r-4395,-5918l39891,100393c16408,95415,,75006,,50762,,22898,21552,,50762,xe" fillcolor="#4e4d48" stroked="f" strokeweight="0">
-            <v:stroke miterlimit="83231f" joinstyle="miter"/>
-            <v:formulas/>
-            <v:path arrowok="t" o:connecttype="segments" textboxrect="0,0,93700,147142"/>
-          </v:shape>
-          <v:shape id="Shape 175" o:spid="_x0000_s1451" style="position:absolute;left:90713;top:1902;width:508;height:1015;visibility:visible;mso-wrap-style:square;v-text-anchor:top" coordsize="50864,101524" o:spt="100" o:gfxdata="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" adj="0,,0" path="m50762,r102,20l50864,16428r-102,-20c31686,16408,17945,30925,17945,50762v,19660,13741,34163,32817,34163l50864,84905r,16599l50762,101524c21577,101524,,78626,,50762,,22898,21577,,50762,xe" fillcolor="#4e4d48" stroked="f" strokeweight="0">
-            <v:stroke miterlimit="83231f" joinstyle="miter"/>
-            <v:formulas/>
-            <v:path arrowok="t" o:connecttype="segments" textboxrect="0,0,50864,101524"/>
-          </v:shape>
-          <v:shape id="Shape 176" o:spid="_x0000_s1452" style="position:absolute;left:91221;top:1902;width:507;height:1015;visibility:visible;mso-wrap-style:square;v-text-anchor:top" coordsize="50660,101484" o:spt="100" o:gfxdata="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" adj="0,,0" path="m,l20153,3993v18384,7746,30507,25851,30507,46749c50660,71640,38537,89744,20153,97491l,101484,,84885,13111,82331c25081,77331,32918,65487,32918,50742v,-14878,-7837,-26763,-19807,-31776l,16408,,xe" fillcolor="#4e4d48" stroked="f" strokeweight="0">
-            <v:stroke miterlimit="83231f" joinstyle="miter"/>
-            <v:formulas/>
-            <v:path arrowok="t" o:connecttype="segments" textboxrect="0,0,50660,101484"/>
-          </v:shape>
-          <v:shape id="Shape 177" o:spid="_x0000_s1453" style="position:absolute;left:91833;top:1902;width:769;height:1015;visibility:visible;mso-wrap-style:square;v-text-anchor:top" coordsize="76912,101524" o:spt="100" o:gfxdata="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" adj="0,,0" path="m39116,c54776,,68707,8026,72137,22327l55918,26721c54204,21374,48476,15659,37592,15659v-9537,,-16599,5334,-16599,13360c20993,39891,34341,40653,45428,42939v23660,4965,31484,12598,31484,27101c76912,87224,64695,101524,38939,101524,19851,101524,3811,93891,,79388l16980,73673v1524,4953,6693,11823,22339,11823c51905,85496,58966,80353,58966,71755,58966,60503,42761,60503,29388,57442,11265,53442,3442,44653,3442,30353,3442,12598,18136,,39116,xe" fillcolor="#4e4d48" stroked="f" strokeweight="0">
-            <v:stroke miterlimit="83231f" joinstyle="miter"/>
-            <v:formulas/>
-            <v:path arrowok="t" o:connecttype="segments" textboxrect="0,0,76912,101524"/>
-          </v:shape>
-          <v:shape id="Shape 178" o:spid="_x0000_s1454" style="position:absolute;left:81106;top:3605;width:482;height:1007;visibility:visible;mso-wrap-style:square;v-text-anchor:top" coordsize="48190,100658" o:spt="100" o:gfxdata="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" adj="0,,0" path="m48190,r,16545l28557,23674c23333,28397,19850,35125,18517,43145r29673,l48190,58029r-29673,c19850,65948,23475,72625,29130,77322r19060,6202l48190,100658,30282,97336c11172,89589,,71485,,50587,,29689,11594,11584,29387,3838l48190,xe" fillcolor="#4e4d48" stroked="f" strokeweight="0">
-            <v:stroke miterlimit="83231f" joinstyle="miter"/>
-            <v:formulas/>
-            <v:path arrowok="t" o:connecttype="segments" textboxrect="0,0,48190,100658"/>
-          </v:shape>
-          <v:shape id="Shape 179" o:spid="_x0000_s1455" style="position:absolute;left:81588;top:4344;width:434;height:275;visibility:visible;mso-wrap-style:square;v-text-anchor:top" coordsize="43414,27483" o:spt="100" o:gfxdata="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" adj="0,,0" path="m29102,l43414,9157c34830,20803,20707,27483,3727,27483l,26791,,9658r3727,1213c14218,10871,23755,6871,29102,xe" fillcolor="#4e4d48" stroked="f" strokeweight="0">
-            <v:stroke miterlimit="83231f" joinstyle="miter"/>
-            <v:formulas/>
-            <v:path arrowok="t" o:connecttype="segments" textboxrect="0,0,43414,27483"/>
-          </v:shape>
-          <v:shape id="Shape 180" o:spid="_x0000_s1456" style="position:absolute;left:81588;top:3603;width:518;height:583;visibility:visible;mso-wrap-style:square;v-text-anchor:top" coordsize="51809,58204" o:spt="100" o:gfxdata="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" adj="0,,0" path="m857,c27197,,51809,22136,47237,58204l,58204,,43320r29673,c27387,26911,17266,16408,857,16408l,16720,,175,857,xe" fillcolor="#4e4d48" stroked="f" strokeweight="0">
-            <v:stroke miterlimit="83231f" joinstyle="miter"/>
-            <v:formulas/>
-            <v:path arrowok="t" o:connecttype="segments" textboxrect="0,0,51809,58204"/>
-          </v:shape>
-          <v:shape id="Shape 181" o:spid="_x0000_s1457" style="position:absolute;left:82706;top:3424;width:548;height:1179;visibility:visible;mso-wrap-style:square;v-text-anchor:top" coordsize="54775,117932" o:spt="100" o:gfxdata="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" adj="0,,0" path="m15087,l32448,r,20231l54775,20231r,16599l32448,36830r,42367c32448,92939,32651,102095,47714,102095v2870,,4966,-177,7061,-381l54775,116992v-2489,559,-5537,940,-9348,940c24435,117932,15087,106680,15087,85496r,-48666l,36830,,20231r15087,l15087,xe" fillcolor="#4e4d48" stroked="f" strokeweight="0">
-            <v:stroke miterlimit="83231f" joinstyle="miter"/>
-            <v:formulas/>
-            <v:path arrowok="t" o:connecttype="segments" textboxrect="0,0,54775,117932"/>
-          </v:shape>
-          <v:shape id="Shape 182" o:spid="_x0000_s1458" style="position:absolute;left:83397;top:3605;width:482;height:1007;visibility:visible;mso-wrap-style:square;v-text-anchor:top" coordsize="48190,100658" o:spt="100" o:gfxdata="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" adj="0,,0" path="m48190,r,16545l28557,23674c23333,28397,19850,35125,18517,43145r29673,l48190,58029r-29673,c19850,65948,23476,72625,29130,77322r19060,6202l48190,100658,30276,97336c11165,89589,,71485,,50587,,29689,11594,11584,29387,3838l48190,xe" fillcolor="#4e4d48" stroked="f" strokeweight="0">
-            <v:stroke miterlimit="83231f" joinstyle="miter"/>
-            <v:formulas/>
-            <v:path arrowok="t" o:connecttype="segments" textboxrect="0,0,48190,100658"/>
-          </v:shape>
-          <v:shape id="Shape 183" o:spid="_x0000_s1459" style="position:absolute;left:83879;top:4344;width:434;height:275;visibility:visible;mso-wrap-style:square;v-text-anchor:top" coordsize="43414,27483" o:spt="100" o:gfxdata="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" adj="0,,0" path="m29102,l43414,9157c34830,20803,20707,27483,3727,27483l,26792,,9658r3727,1213c14218,10871,23755,6871,29102,xe" fillcolor="#4e4d48" stroked="f" strokeweight="0">
-            <v:stroke miterlimit="83231f" joinstyle="miter"/>
-            <v:formulas/>
-            <v:path arrowok="t" o:connecttype="segments" textboxrect="0,0,43414,27483"/>
-          </v:shape>
-          <v:shape id="Shape 184" o:spid="_x0000_s1460" style="position:absolute;left:83879;top:3603;width:518;height:583;visibility:visible;mso-wrap-style:square;v-text-anchor:top" coordsize="51809,58204" o:spt="100" o:gfxdata="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" adj="0,,0" path="m857,c27197,,51809,22136,47237,58204l,58204,,43320r29673,c27387,26911,17266,16408,857,16408l,16720,,175,857,xe" fillcolor="#4e4d48" stroked="f" strokeweight="0">
-            <v:stroke miterlimit="83231f" joinstyle="miter"/>
-            <v:formulas/>
-            <v:path arrowok="t" o:connecttype="segments" textboxrect="0,0,51809,58204"/>
-          </v:shape>
-          <v:shape id="Shape 185" o:spid="_x0000_s1461" style="position:absolute;left:84490;top:3603;width:937;height:1016;visibility:visible;mso-wrap-style:square;v-text-anchor:top" coordsize="93700,101524" o:spt="100" o:gfxdata="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" adj="0,,0" path="m50762,c69659,,84925,9728,93700,23851l78816,32055c73101,22517,62979,16408,50762,16408v-19076,,-33020,14504,-33020,34354c17742,70421,31686,84912,50762,84912v12217,,22339,-5918,28054,-15456l93700,77470c84925,91783,69659,101524,50762,101524,21565,101524,,78626,,50762,,22898,21565,,50762,xe" fillcolor="#4e4d48" stroked="f" strokeweight="0">
-            <v:stroke miterlimit="83231f" joinstyle="miter"/>
-            <v:formulas/>
-            <v:path arrowok="t" o:connecttype="segments" textboxrect="0,0,93700,101524"/>
-          </v:shape>
-          <v:shape id="Shape 186" o:spid="_x0000_s1462" style="position:absolute;left:85590;top:3603;width:843;height:991;visibility:visible;mso-wrap-style:square;v-text-anchor:top" coordsize="84366,99047" o:spt="100" o:gfxdata="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" adj="0,,0" path="m47346,c69100,,84366,18123,84366,38545r,60502l67005,99047r,-55537c67005,29959,61278,16408,43142,16408v-18313,,-25755,15837,-25755,27102l17387,99047,,99047,,2286r17387,l17387,15837c23102,7252,32651,,47346,xe" fillcolor="#4e4d48" stroked="f" strokeweight="0">
-            <v:stroke miterlimit="83231f" joinstyle="miter"/>
-            <v:formulas/>
-            <v:path arrowok="t" o:connecttype="segments" textboxrect="0,0,84366,99047"/>
-          </v:shape>
-          <v:shape id="Shape 187" o:spid="_x0000_s1463" style="position:absolute;left:86624;top:3603;width:509;height:1016;visibility:visible;mso-wrap-style:square;v-text-anchor:top" coordsize="50870,101524" o:spt="100" o:gfxdata="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" adj="0,,0" path="m50762,r108,21l50870,16429r-108,-21c31686,16408,17945,30912,17945,50762v,19659,13741,34150,32817,34150l50870,84891r,16612l50762,101524c21578,101524,,78626,,50762,,22898,21578,,50762,xe" fillcolor="#4e4d48" stroked="f" strokeweight="0">
-            <v:stroke miterlimit="83231f" joinstyle="miter"/>
-            <v:formulas/>
-            <v:path arrowok="t" o:connecttype="segments" textboxrect="0,0,50870,101524"/>
-          </v:shape>
-          <v:shape id="Shape 188" o:spid="_x0000_s1464" style="position:absolute;left:87133;top:3604;width:506;height:1014;visibility:visible;mso-wrap-style:square;v-text-anchor:top" coordsize="50654,101481" o:spt="100" o:gfxdata="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" adj="0,,0" path="m,l20147,3992v18384,7746,30507,25851,30507,46749c50654,71638,38531,89743,20147,97489l,101481,,84870,13106,82320c25081,77323,32925,65485,32925,50741v,-14888,-7844,-26768,-19819,-31778l,16408,,xe" fillcolor="#4e4d48" stroked="f" strokeweight="0">
-            <v:stroke miterlimit="83231f" joinstyle="miter"/>
-            <v:formulas/>
-            <v:path arrowok="t" o:connecttype="segments" textboxrect="0,0,50654,101481"/>
-          </v:shape>
-          <v:shape id="Shape 1351" o:spid="_x0000_s1465" style="position:absolute;left:87831;top:3258;width:173;height:1336;visibility:visible;mso-wrap-style:square;v-text-anchor:top" coordsize="17361,133591" o:spt="100" o:gfxdata="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" adj="0,,0" path="m,l17361,r,133591l,133591,,e" fillcolor="#4e4d48" stroked="f" strokeweight="0">
-            <v:stroke miterlimit="83231f" joinstyle="miter"/>
-            <v:formulas/>
-            <v:path arrowok="t" o:connecttype="segments" textboxrect="0,0,17361,133591"/>
-          </v:shape>
-          <v:shape id="Shape 190" o:spid="_x0000_s1466" style="position:absolute;left:88195;top:3603;width:509;height:1016;visibility:visible;mso-wrap-style:square;v-text-anchor:top" coordsize="50857,101524" o:spt="100" o:gfxdata="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" adj="0,,0" path="m50749,r108,21l50857,16429r-108,-21c31673,16408,17932,30912,17932,50762v,19659,13741,34150,32817,34150l50857,84891r,16612l50749,101524c21565,101524,,78626,,50762,,22898,21565,,50749,xe" fillcolor="#4e4d48" stroked="f" strokeweight="0">
-            <v:stroke miterlimit="83231f" joinstyle="miter"/>
-            <v:formulas/>
-            <v:path arrowok="t" o:connecttype="segments" textboxrect="0,0,50857,101524"/>
-          </v:shape>
-          <v:shape id="Shape 191" o:spid="_x0000_s1467" style="position:absolute;left:88704;top:3604;width:506;height:1014;visibility:visible;mso-wrap-style:square;v-text-anchor:top" coordsize="50667,101481" o:spt="100" o:gfxdata="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" adj="0,,0" path="m,l20148,3992v18388,7746,30519,25851,30519,46749c50667,71638,38536,89743,20148,97489l,101481,,84870,13106,82320c25081,77323,32925,65485,32925,50741v,-14888,-7844,-26768,-19819,-31778l,16408,,xe" fillcolor="#4e4d48" stroked="f" strokeweight="0">
-            <v:stroke miterlimit="83231f" joinstyle="miter"/>
-            <v:formulas/>
-            <v:path arrowok="t" o:connecttype="segments" textboxrect="0,0,50667,101481"/>
-          </v:shape>
-          <v:shape id="Shape 192" o:spid="_x0000_s1468" style="position:absolute;left:89396;top:4697;width:443;height:282;visibility:visible;mso-wrap-style:square;v-text-anchor:top" coordsize="44368,28257" o:spt="100" o:gfxdata="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" adj="0,,0" path="m14884,v3633,5347,12980,11836,29007,11836l44368,11752r,16426l43891,28257c24816,28257,7824,20625,,8788l14884,xe" fillcolor="#4e4d48" stroked="f" strokeweight="0">
-            <v:stroke miterlimit="83231f" joinstyle="miter"/>
-            <v:formulas/>
-            <v:path arrowok="t" o:connecttype="segments" textboxrect="0,0,44368,28257"/>
-          </v:shape>
-          <v:shape id="Shape 193" o:spid="_x0000_s1469" style="position:absolute;left:89344;top:3603;width:495;height:964;visibility:visible;mso-wrap-style:square;v-text-anchor:top" coordsize="49524,96380" o:spt="100" o:gfxdata="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" adj="0,,0" path="m48285,r1239,297l49524,16499,37344,18809c25777,23470,17933,34493,17933,48095v,13735,7844,24798,19411,29471l49524,79881r,16201l48285,96380c19851,96380,,72149,,48095,,24244,19851,,48285,xe" fillcolor="#4e4d48" stroked="f" strokeweight="0">
-            <v:stroke miterlimit="83231f" joinstyle="miter"/>
-            <v:formulas/>
-            <v:path arrowok="t" o:connecttype="segments" textboxrect="0,0,49524,96380"/>
-          </v:shape>
-          <v:shape id="Shape 194" o:spid="_x0000_s1470" style="position:absolute;left:89839;top:3606;width:492;height:1373;visibility:visible;mso-wrap-style:square;v-text-anchor:top" coordsize="49143,137229" o:spt="100" o:gfxdata="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" adj="0,,0" path="m,l18676,4474v5416,2957,9664,7059,12915,11638l31591,2002r17552,l49143,88641v,20613,-8266,37681,-27133,44927l,137229,,120803r14274,-2513c26541,113254,31591,101376,31591,86927r,-7442c28340,84158,24092,88308,18676,91289l,95785,,79585r476,90c18993,79675,31591,66112,31591,47798,31591,29663,18993,16112,476,16112l,16202,,xe" fillcolor="#4e4d48" stroked="f" strokeweight="0">
-            <v:stroke miterlimit="83231f" joinstyle="miter"/>
-            <v:formulas/>
-            <v:path arrowok="t" o:connecttype="segments" textboxrect="0,0,49143,137229"/>
-          </v:shape>
-          <v:shape id="Shape 1352" o:spid="_x0000_s1471" style="position:absolute;left:90579;top:3626;width:176;height:968;visibility:visible;mso-wrap-style:square;v-text-anchor:top" coordsize="17564,96762" o:spt="100" o:gfxdata="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" adj="0,,0" path="m,l17564,r,96762l,96762,,e" fillcolor="#4e4d48" stroked="f" strokeweight="0">
-            <v:stroke miterlimit="83231f" joinstyle="miter"/>
-            <v:formulas/>
-            <v:path arrowok="t" o:connecttype="segments" textboxrect="0,0,17564,96762"/>
-          </v:shape>
-          <v:shape id="Shape 196" o:spid="_x0000_s1472" style="position:absolute;left:90567;top:3256;width:199;height:199;visibility:visible;mso-wrap-style:square;v-text-anchor:top" coordsize="19850,19838" o:spt="100" o:gfxdata="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" adj="0,,0" path="m9919,v5550,,9931,4572,9931,9919c19850,15456,15469,19838,9919,19838,4394,19838,,15456,,9919,,4572,4394,,9919,xe" fillcolor="#4e4d48" stroked="f" strokeweight="0">
-            <v:stroke miterlimit="83231f" joinstyle="miter"/>
-            <v:formulas/>
-            <v:path arrowok="t" o:connecttype="segments" textboxrect="0,0,19850,19838"/>
-          </v:shape>
-          <v:shape id="Shape 197" o:spid="_x0000_s1473" style="position:absolute;left:90945;top:4027;width:420;height:592;visibility:visible;mso-wrap-style:square;v-text-anchor:top" coordsize="41986,59184" o:spt="100" o:gfxdata="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" adj="0,,0" path="m41986,r,14468l31923,15211c23813,17286,17945,21484,17945,29974v,7454,4762,15087,20231,15087l41986,43830r,13386l34353,59184c16027,59184,,48109,,30736,,7980,20717,1863,36797,226l41986,xe" fillcolor="#4e4d48" stroked="f" strokeweight="0">
-            <v:stroke miterlimit="83231f" joinstyle="miter"/>
-            <v:formulas/>
-            <v:path arrowok="t" o:connecttype="segments" textboxrect="0,0,41986,59184"/>
-          </v:shape>
-          <v:shape id="Shape 198" o:spid="_x0000_s1474" style="position:absolute;left:91003;top:3611;width:362;height:237;visibility:visible;mso-wrap-style:square;v-text-anchor:top" coordsize="36258,23662" o:spt="100" o:gfxdata="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" adj="0,,0" path="m36258,r,15271l22495,18078v-4461,1716,-8182,3863,-10278,5584l,14302c5340,9438,11684,5669,18600,3116l36258,xe" fillcolor="#4e4d48" stroked="f" strokeweight="0">
-            <v:stroke miterlimit="83231f" joinstyle="miter"/>
-            <v:formulas/>
-            <v:path arrowok="t" o:connecttype="segments" textboxrect="0,0,36258,23662"/>
-          </v:shape>
-          <v:shape id="Shape 199" o:spid="_x0000_s1475" style="position:absolute;left:91365;top:3603;width:414;height:996;visibility:visible;mso-wrap-style:square;v-text-anchor:top" coordsize="41402,99569" o:spt="100" o:gfxdata="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" adj="0,,0" path="m4382,c32245,,41402,17564,41402,40653r,58394l24041,99047r,-13347c21844,89414,17742,93374,12281,96404l,99569,,86183,15907,81042v4746,-3461,7562,-7471,8134,-9668l24041,55537r-6668,l,56821,,42353r8407,-367l24041,41986c24041,27292,20993,15850,953,15850l,16044,,773,4382,xe" fillcolor="#4e4d48" stroked="f" strokeweight="0">
-            <v:stroke miterlimit="83231f" joinstyle="miter"/>
-            <v:formulas/>
-            <v:path arrowok="t" o:connecttype="segments" textboxrect="0,0,41402,99569"/>
-          </v:shape>
-          <v:shape id="Shape 200" o:spid="_x0000_s1476" style="position:absolute;left:91942;top:3603;width:769;height:1016;visibility:visible;mso-wrap-style:square;v-text-anchor:top" coordsize="76912,101524" o:spt="100" o:gfxdata="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" adj="0,,0" path="m39129,c54776,,68707,8014,72137,22327l55931,26721c54204,21374,48489,15646,37592,15646v-9537,,-16586,5347,-16586,13361c21006,39891,34354,40653,45428,42939v23660,4965,31484,12598,31484,27101c76912,87224,64695,101524,38939,101524,19851,101524,3823,93891,,79388l16980,73673v1537,4953,6693,11823,22339,11823c51905,85496,58979,80353,58979,71755,58979,60503,42761,60503,29401,57442,11265,53442,3442,44653,3442,30353,3442,12598,18136,,39129,xe" fillcolor="#4e4d48" stroked="f" strokeweight="0">
-            <v:stroke miterlimit="83231f" joinstyle="miter"/>
-            <v:formulas/>
-            <v:path arrowok="t" o:connecttype="segments" textboxrect="0,0,76912,101524"/>
-          </v:shape>
-          <w10:wrap type="square"/>
-        </v:group>
-      </w:pict>
-    </w:r>
-  </w:p>
-  <w:p>
-    <w:r>
-      <w:rPr>
-        <w:noProof/>
-      </w:rPr>
-      <w:pict w14:anchorId="1DB73917">
-        <v:group id="_x0000_s1399" style="position:absolute;left:0;text-align:left;margin-left:267.75pt;margin-top:140.25pt;width:322.7pt;height:365.65pt;z-index:251686912" coordsize="40980,46436" o:gfxdata="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">
-          <v:shape id="Shape 201" o:spid="_x0000_s1400" style="position:absolute;left:20490;top:9840;width:10245;height:30888;visibility:visible;mso-wrap-style:square;v-text-anchor:top" coordsize="1024515,3088805" o:spt="100" o:gfxdata="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" adj="0,,0" path="m,l695655,r,786816c758889,765721,881164,744652,982358,744652r42157,1756l1024515,1279357r-14113,-4346c978006,1267237,943354,1263218,906463,1263218v-80099,,-172860,16866,-210808,33744l695655,2519642v37948,16866,126492,29502,202375,29502c934395,2549144,968783,2545653,1001121,2538711r23394,-6474l1024515,3083693r-1696,192c978367,3087159,932549,3088805,885380,3088805,514376,3088805,177076,3017152,,2924391l,xe" fillcolor="#24613a" stroked="f" strokeweight="0">
-            <v:stroke miterlimit="83231f" joinstyle="miter"/>
-            <v:formulas/>
-            <v:path arrowok="t" o:connecttype="segments" textboxrect="0,0,1024515,3088805"/>
-          </v:shape>
-          <v:shape id="Shape 202" o:spid="_x0000_s1401" style="position:absolute;left:30735;top:17304;width:10245;height:23373;visibility:visible;mso-wrap-style:square;v-text-anchor:top" coordsize="1024516,2337284" o:spt="100" o:gfxdata="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" adj="0,,0" path="m,l85854,3577v619994,53066,938662,498222,938662,1158317c1024516,1825932,711411,2231726,127546,2322799l,2337284,,1785829r23565,-6521c220313,1711829,328861,1499447,328861,1153448,328861,845145,228663,617554,32786,543046l,532949,,xe" fillcolor="#24613a" stroked="f" strokeweight="0">
-            <v:stroke miterlimit="83231f" joinstyle="miter"/>
-            <v:formulas/>
-            <v:path arrowok="t" o:connecttype="segments" textboxrect="0,0,1024516,2337284"/>
-          </v:shape>
-          <v:shape id="Shape 203" o:spid="_x0000_s1402" style="position:absolute;top:5393;width:10245;height:23372;visibility:visible;mso-wrap-style:square;v-text-anchor:top" coordsize="1024515,2337147" o:spt="100" o:gfxdata="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" adj="0,,0" path="m1024515,r,543035l1000950,549557c804202,617039,695655,829428,695655,1175416v,308303,102981,538678,299895,614229l1024515,1798655r,538492l942830,2333745c322373,2280678,,1835510,,1175416,,511366,313104,105561,896969,14486l1024515,xe" fillcolor="#017841" stroked="f" strokeweight="0">
-            <v:stroke miterlimit="83231f" joinstyle="miter"/>
-            <v:formulas/>
-            <v:path arrowok="t" o:connecttype="segments" textboxrect="0,0,1024515,2337147"/>
-          </v:shape>
-          <v:shape id="Shape 204" o:spid="_x0000_s1403" style="position:absolute;left:10245;top:5342;width:10245;height:30343;visibility:visible;mso-wrap-style:square;v-text-anchor:top" coordsize="1024515,3034310" o:spt="100" o:gfxdata="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" adj="0,,0" path="m139135,v366788,,704088,71692,885380,164440l1024515,3034310r-695655,l328860,2306244v-63246,21082,-181292,37947,-282486,37947l,2342260,,1803768r18140,5642c50650,1817299,85366,1821383,122256,1821383v80112,,168656,-16865,206604,-33731l328860,564972c286696,548107,206585,531241,126486,531241v-36365,,-70754,3492,-103092,10433l,548148,,5113,1696,4920c46148,1647,91966,,139135,xe" fillcolor="#017841" stroked="f" strokeweight="0">
-            <v:stroke miterlimit="83231f" joinstyle="miter"/>
-            <v:formulas/>
-            <v:path arrowok="t" o:connecttype="segments" textboxrect="0,0,1024515,3034310"/>
-          </v:shape>
-          <v:shape id="Shape 205" o:spid="_x0000_s1404" style="position:absolute;top:14028;width:10245;height:23373;visibility:visible;mso-wrap-style:square;v-text-anchor:top" coordsize="1024515,2337297" o:spt="100" o:gfxdata="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" adj="0,,0" path="m1024515,r,532959l991723,543059c795852,617567,695655,845157,695655,1153461v,345988,108547,558368,305288,625848l1024515,1785832r,551465l896969,2322811c313105,2231736,,1825934,,1161907,,501812,318667,56644,938661,3577l1024515,xe" fillcolor="#24613a" stroked="f" strokeweight="0">
-            <v:stroke miterlimit="83231f" joinstyle="miter"/>
-            <v:formulas/>
-            <v:path arrowok="t" o:connecttype="segments" textboxrect="0,0,1024515,2337297"/>
-          </v:shape>
-          <v:shape id="Shape 206" o:spid="_x0000_s1405" style="position:absolute;left:10245;width:10245;height:37452;visibility:visible;mso-wrap-style:square;v-text-anchor:top" coordsize="1024515,3745242" o:spt="100" o:gfxdata="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" adj="0,,0" path="m781372,1541c797092,,812848,200,828363,2025v103432,12167,196152,96586,196152,219284l1024515,3580828v-177076,92748,-514375,164414,-885380,164414c91966,3745242,46148,3743595,1696,3740322l,3740129,,3188664r23386,6472c55723,3202077,90110,3205568,126473,3205568v75895,,164439,-12636,202387,-29502l328860,1953386v-37948,-16865,-130708,-33731,-210820,-33731c81150,1919655,46499,1923674,14105,1931447l,1935791,,1402832r42158,-1756c143351,1401076,265614,1422158,328860,1443240r,-1058266l648329,65493c687373,26449,734212,6163,781372,1541xe" fillcolor="#24613a" stroked="f" strokeweight="0">
-            <v:stroke miterlimit="83231f" joinstyle="miter"/>
-            <v:formulas/>
-            <v:path arrowok="t" o:connecttype="segments" textboxrect="0,0,1024515,3745242"/>
-          </v:shape>
-          <v:shape id="Shape 207" o:spid="_x0000_s1406" style="position:absolute;left:20490;top:8186;width:10245;height:38250;visibility:visible;mso-wrap-style:square;v-text-anchor:top" coordsize="1024515,3824999" o:spt="100" o:gfxdata="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" adj="0,,0" path="m885393,v47169,,92987,1647,137439,4920l1024515,5111r,543037l1001121,541674c968783,534732,934395,531241,898030,531241v-80099,,-160198,16853,-202375,33719l695655,1787639v37960,16866,126492,33731,206604,33731c939149,1821370,973866,1817286,1006375,1809397r18140,-5642l1024515,2342248r-46361,1931c876960,2344179,758901,2327313,695655,2306231r,1224192c695655,3726701,458356,3824999,319557,3686201l,3366643,,164427c181280,71679,518592,,885393,xe" fillcolor="#017841" stroked="f" strokeweight="0">
-            <v:stroke miterlimit="83231f" joinstyle="miter"/>
-            <v:formulas/>
-            <v:path arrowok="t" o:connecttype="segments" textboxrect="0,0,1024515,3824999"/>
-          </v:shape>
-          <v:shape id="Shape 208" o:spid="_x0000_s1407" style="position:absolute;left:30735;top:8237;width:10245;height:23372;visibility:visible;mso-wrap-style:square;v-text-anchor:top" coordsize="1024528,2337137" o:spt="100" o:gfxdata="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" adj="0,,0" path="m,l127560,14487v583864,91076,896968,496880,896968,1160930c1024528,1835512,702144,2280668,81695,2333735l,2337137,,1798644r28965,-9010c225880,1714083,328860,1483710,328860,1175417,328860,829419,220313,617037,23565,549557l,543036,,xe" fillcolor="#017841" stroked="f" strokeweight="0">
-            <v:stroke miterlimit="83231f" joinstyle="miter"/>
-            <v:formulas/>
-            <v:path arrowok="t" o:connecttype="segments" textboxrect="0,0,1024528,2337137"/>
-          </v:shape>
-        </v:group>
-      </w:pict>
-    </w:r>
-    <w:r>
-      <w:rPr>
-        <w:noProof/>
-      </w:rPr>
-      <w:pict w14:anchorId="1915E2A9">
-        <v:group id="_x0000_s1390" style="position:absolute;left:0;text-align:left;margin-left:267.75pt;margin-top:140.25pt;width:322.7pt;height:365.65pt;z-index:251684864" coordsize="40980,46436" o:gfxdata="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">
-          <v:shape id="Shape 201" o:spid="_x0000_s1391" style="position:absolute;left:20490;top:9840;width:10245;height:30888;visibility:visible;mso-wrap-style:square;v-text-anchor:top" coordsize="1024515,3088805" o:spt="100" o:gfxdata="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" adj="0,,0" path="m,l695655,r,786816c758889,765721,881164,744652,982358,744652r42157,1756l1024515,1279357r-14113,-4346c978006,1267237,943354,1263218,906463,1263218v-80099,,-172860,16866,-210808,33744l695655,2519642v37948,16866,126492,29502,202375,29502c934395,2549144,968783,2545653,1001121,2538711r23394,-6474l1024515,3083693r-1696,192c978367,3087159,932549,3088805,885380,3088805,514376,3088805,177076,3017152,,2924391l,xe" fillcolor="#24613a" stroked="f" strokeweight="0">
-            <v:stroke miterlimit="83231f" joinstyle="miter"/>
-            <v:formulas/>
-            <v:path arrowok="t" o:connecttype="segments" textboxrect="0,0,1024515,3088805"/>
-          </v:shape>
-          <v:shape id="Shape 202" o:spid="_x0000_s1392" style="position:absolute;left:30735;top:17304;width:10245;height:23373;visibility:visible;mso-wrap-style:square;v-text-anchor:top" coordsize="1024516,2337284" o:spt="100" o:gfxdata="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" adj="0,,0" path="m,l85854,3577v619994,53066,938662,498222,938662,1158317c1024516,1825932,711411,2231726,127546,2322799l,2337284,,1785829r23565,-6521c220313,1711829,328861,1499447,328861,1153448,328861,845145,228663,617554,32786,543046l,532949,,xe" fillcolor="#24613a" stroked="f" strokeweight="0">
-            <v:stroke miterlimit="83231f" joinstyle="miter"/>
-            <v:formulas/>
-            <v:path arrowok="t" o:connecttype="segments" textboxrect="0,0,1024516,2337284"/>
-          </v:shape>
-          <v:shape id="Shape 203" o:spid="_x0000_s1393" style="position:absolute;top:5393;width:10245;height:23372;visibility:visible;mso-wrap-style:square;v-text-anchor:top" coordsize="1024515,2337147" o:spt="100" o:gfxdata="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" adj="0,,0" path="m1024515,r,543035l1000950,549557c804202,617039,695655,829428,695655,1175416v,308303,102981,538678,299895,614229l1024515,1798655r,538492l942830,2333745c322373,2280678,,1835510,,1175416,,511366,313104,105561,896969,14486l1024515,xe" fillcolor="#017841" stroked="f" strokeweight="0">
-            <v:stroke miterlimit="83231f" joinstyle="miter"/>
-            <v:formulas/>
-            <v:path arrowok="t" o:connecttype="segments" textboxrect="0,0,1024515,2337147"/>
-          </v:shape>
-          <v:shape id="Shape 204" o:spid="_x0000_s1394" style="position:absolute;left:10245;top:5342;width:10245;height:30343;visibility:visible;mso-wrap-style:square;v-text-anchor:top" coordsize="1024515,3034310" o:spt="100" o:gfxdata="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" adj="0,,0" path="m139135,v366788,,704088,71692,885380,164440l1024515,3034310r-695655,l328860,2306244v-63246,21082,-181292,37947,-282486,37947l,2342260,,1803768r18140,5642c50650,1817299,85366,1821383,122256,1821383v80112,,168656,-16865,206604,-33731l328860,564972c286696,548107,206585,531241,126486,531241v-36365,,-70754,3492,-103092,10433l,548148,,5113,1696,4920c46148,1647,91966,,139135,xe" fillcolor="#017841" stroked="f" strokeweight="0">
-            <v:stroke miterlimit="83231f" joinstyle="miter"/>
-            <v:formulas/>
-            <v:path arrowok="t" o:connecttype="segments" textboxrect="0,0,1024515,3034310"/>
-          </v:shape>
-          <v:shape id="Shape 205" o:spid="_x0000_s1395" style="position:absolute;top:14028;width:10245;height:23373;visibility:visible;mso-wrap-style:square;v-text-anchor:top" coordsize="1024515,2337297" o:spt="100" o:gfxdata="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" adj="0,,0" path="m1024515,r,532959l991723,543059c795852,617567,695655,845157,695655,1153461v,345988,108547,558368,305288,625848l1024515,1785832r,551465l896969,2322811c313105,2231736,,1825934,,1161907,,501812,318667,56644,938661,3577l1024515,xe" fillcolor="#24613a" stroked="f" strokeweight="0">
-            <v:stroke miterlimit="83231f" joinstyle="miter"/>
-            <v:formulas/>
-            <v:path arrowok="t" o:connecttype="segments" textboxrect="0,0,1024515,2337297"/>
-          </v:shape>
-          <v:shape id="Shape 206" o:spid="_x0000_s1396" style="position:absolute;left:10245;width:10245;height:37452;visibility:visible;mso-wrap-style:square;v-text-anchor:top" coordsize="1024515,3745242" o:spt="100" o:gfxdata="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" adj="0,,0" path="m781372,1541c797092,,812848,200,828363,2025v103432,12167,196152,96586,196152,219284l1024515,3580828v-177076,92748,-514375,164414,-885380,164414c91966,3745242,46148,3743595,1696,3740322l,3740129,,3188664r23386,6472c55723,3202077,90110,3205568,126473,3205568v75895,,164439,-12636,202387,-29502l328860,1953386v-37948,-16865,-130708,-33731,-210820,-33731c81150,1919655,46499,1923674,14105,1931447l,1935791,,1402832r42158,-1756c143351,1401076,265614,1422158,328860,1443240r,-1058266l648329,65493c687373,26449,734212,6163,781372,1541xe" fillcolor="#24613a" stroked="f" strokeweight="0">
-            <v:stroke miterlimit="83231f" joinstyle="miter"/>
-            <v:formulas/>
-            <v:path arrowok="t" o:connecttype="segments" textboxrect="0,0,1024515,3745242"/>
-          </v:shape>
-          <v:shape id="Shape 207" o:spid="_x0000_s1397" style="position:absolute;left:20490;top:8186;width:10245;height:38250;visibility:visible;mso-wrap-style:square;v-text-anchor:top" coordsize="1024515,3824999" o:spt="100" o:gfxdata="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" adj="0,,0" path="m885393,v47169,,92987,1647,137439,4920l1024515,5111r,543037l1001121,541674c968783,534732,934395,531241,898030,531241v-80099,,-160198,16853,-202375,33719l695655,1787639v37960,16866,126492,33731,206604,33731c939149,1821370,973866,1817286,1006375,1809397r18140,-5642l1024515,2342248r-46361,1931c876960,2344179,758901,2327313,695655,2306231r,1224192c695655,3726701,458356,3824999,319557,3686201l,3366643,,164427c181280,71679,518592,,885393,xe" fillcolor="#017841" stroked="f" strokeweight="0">
-            <v:stroke miterlimit="83231f" joinstyle="miter"/>
-            <v:formulas/>
-            <v:path arrowok="t" o:connecttype="segments" textboxrect="0,0,1024515,3824999"/>
-          </v:shape>
-          <v:shape id="Shape 208" o:spid="_x0000_s1398" style="position:absolute;left:30735;top:8237;width:10245;height:23372;visibility:visible;mso-wrap-style:square;v-text-anchor:top" coordsize="1024528,2337137" o:spt="100" o:gfxdata="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" adj="0,,0" path="m,l127560,14487v583864,91076,896968,496880,896968,1160930c1024528,1835512,702144,2280668,81695,2333735l,2337137,,1798644r28965,-9010c225880,1714083,328860,1483710,328860,1175417,328860,829419,220313,617037,23565,549557l,543036,,xe" fillcolor="#017841" stroked="f" strokeweight="0">
-            <v:stroke miterlimit="83231f" joinstyle="miter"/>
-            <v:formulas/>
-            <v:path arrowok="t" o:connecttype="segments" textboxrect="0,0,1024528,2337137"/>
-          </v:shape>
-        </v:group>
-      </w:pict>
-    </w:r>
-    <w:r>
-      <w:rPr>
-        <w:noProof/>
-      </w:rPr>
-      <w:pict w14:anchorId="77A53A88">
-        <v:group id="_x0000_s1381" style="position:absolute;left:0;text-align:left;margin-left:267.75pt;margin-top:140.25pt;width:322.7pt;height:365.65pt;z-index:251682816" coordsize="40980,46436" o:gfxdata="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">
-          <v:shape id="Shape 201" o:spid="_x0000_s1382" style="position:absolute;left:20490;top:9840;width:10245;height:30888;visibility:visible;mso-wrap-style:square;v-text-anchor:top" coordsize="1024515,3088805" o:spt="100" o:gfxdata="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" adj="0,,0" path="m,l695655,r,786816c758889,765721,881164,744652,982358,744652r42157,1756l1024515,1279357r-14113,-4346c978006,1267237,943354,1263218,906463,1263218v-80099,,-172860,16866,-210808,33744l695655,2519642v37948,16866,126492,29502,202375,29502c934395,2549144,968783,2545653,1001121,2538711r23394,-6474l1024515,3083693r-1696,192c978367,3087159,932549,3088805,885380,3088805,514376,3088805,177076,3017152,,2924391l,xe" fillcolor="#24613a" stroked="f" strokeweight="0">
-            <v:stroke miterlimit="83231f" joinstyle="miter"/>
-            <v:formulas/>
-            <v:path arrowok="t" o:connecttype="segments" textboxrect="0,0,1024515,3088805"/>
-          </v:shape>
-          <v:shape id="Shape 202" o:spid="_x0000_s1383" style="position:absolute;left:30735;top:17304;width:10245;height:23373;visibility:visible;mso-wrap-style:square;v-text-anchor:top" coordsize="1024516,2337284" o:spt="100" o:gfxdata="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" adj="0,,0" path="m,l85854,3577v619994,53066,938662,498222,938662,1158317c1024516,1825932,711411,2231726,127546,2322799l,2337284,,1785829r23565,-6521c220313,1711829,328861,1499447,328861,1153448,328861,845145,228663,617554,32786,543046l,532949,,xe" fillcolor="#24613a" stroked="f" strokeweight="0">
-            <v:stroke miterlimit="83231f" joinstyle="miter"/>
-            <v:formulas/>
-            <v:path arrowok="t" o:connecttype="segments" textboxrect="0,0,1024516,2337284"/>
-          </v:shape>
-          <v:shape id="Shape 203" o:spid="_x0000_s1384" style="position:absolute;top:5393;width:10245;height:23372;visibility:visible;mso-wrap-style:square;v-text-anchor:top" coordsize="1024515,2337147" o:spt="100" o:gfxdata="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" adj="0,,0" path="m1024515,r,543035l1000950,549557c804202,617039,695655,829428,695655,1175416v,308303,102981,538678,299895,614229l1024515,1798655r,538492l942830,2333745c322373,2280678,,1835510,,1175416,,511366,313104,105561,896969,14486l1024515,xe" fillcolor="#017841" stroked="f" strokeweight="0">
-            <v:stroke miterlimit="83231f" joinstyle="miter"/>
-            <v:formulas/>
-            <v:path arrowok="t" o:connecttype="segments" textboxrect="0,0,1024515,2337147"/>
-          </v:shape>
-          <v:shape id="Shape 204" o:spid="_x0000_s1385" style="position:absolute;left:10245;top:5342;width:10245;height:30343;visibility:visible;mso-wrap-style:square;v-text-anchor:top" coordsize="1024515,3034310" o:spt="100" o:gfxdata="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" adj="0,,0" path="m139135,v366788,,704088,71692,885380,164440l1024515,3034310r-695655,l328860,2306244v-63246,21082,-181292,37947,-282486,37947l,2342260,,1803768r18140,5642c50650,1817299,85366,1821383,122256,1821383v80112,,168656,-16865,206604,-33731l328860,564972c286696,548107,206585,531241,126486,531241v-36365,,-70754,3492,-103092,10433l,548148,,5113,1696,4920c46148,1647,91966,,139135,xe" fillcolor="#017841" stroked="f" strokeweight="0">
-            <v:stroke miterlimit="83231f" joinstyle="miter"/>
-            <v:formulas/>
-            <v:path arrowok="t" o:connecttype="segments" textboxrect="0,0,1024515,3034310"/>
-          </v:shape>
-          <v:shape id="Shape 205" o:spid="_x0000_s1386" style="position:absolute;top:14028;width:10245;height:23373;visibility:visible;mso-wrap-style:square;v-text-anchor:top" coordsize="1024515,2337297" o:spt="100" o:gfxdata="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" adj="0,,0" path="m1024515,r,532959l991723,543059c795852,617567,695655,845157,695655,1153461v,345988,108547,558368,305288,625848l1024515,1785832r,551465l896969,2322811c313105,2231736,,1825934,,1161907,,501812,318667,56644,938661,3577l1024515,xe" fillcolor="#24613a" stroked="f" strokeweight="0">
-            <v:stroke miterlimit="83231f" joinstyle="miter"/>
-            <v:formulas/>
-            <v:path arrowok="t" o:connecttype="segments" textboxrect="0,0,1024515,2337297"/>
-          </v:shape>
-          <v:shape id="Shape 206" o:spid="_x0000_s1387" style="position:absolute;left:10245;width:10245;height:37452;visibility:visible;mso-wrap-style:square;v-text-anchor:top" coordsize="1024515,3745242" o:spt="100" o:gfxdata="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" adj="0,,0" path="m781372,1541c797092,,812848,200,828363,2025v103432,12167,196152,96586,196152,219284l1024515,3580828v-177076,92748,-514375,164414,-885380,164414c91966,3745242,46148,3743595,1696,3740322l,3740129,,3188664r23386,6472c55723,3202077,90110,3205568,126473,3205568v75895,,164439,-12636,202387,-29502l328860,1953386v-37948,-16865,-130708,-33731,-210820,-33731c81150,1919655,46499,1923674,14105,1931447l,1935791,,1402832r42158,-1756c143351,1401076,265614,1422158,328860,1443240r,-1058266l648329,65493c687373,26449,734212,6163,781372,1541xe" fillcolor="#24613a" stroked="f" strokeweight="0">
-            <v:stroke miterlimit="83231f" joinstyle="miter"/>
-            <v:formulas/>
-            <v:path arrowok="t" o:connecttype="segments" textboxrect="0,0,1024515,3745242"/>
-          </v:shape>
-          <v:shape id="Shape 207" o:spid="_x0000_s1388" style="position:absolute;left:20490;top:8186;width:10245;height:38250;visibility:visible;mso-wrap-style:square;v-text-anchor:top" coordsize="1024515,3824999" o:spt="100" o:gfxdata="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" adj="0,,0" path="m885393,v47169,,92987,1647,137439,4920l1024515,5111r,543037l1001121,541674c968783,534732,934395,531241,898030,531241v-80099,,-160198,16853,-202375,33719l695655,1787639v37960,16866,126492,33731,206604,33731c939149,1821370,973866,1817286,1006375,1809397r18140,-5642l1024515,2342248r-46361,1931c876960,2344179,758901,2327313,695655,2306231r,1224192c695655,3726701,458356,3824999,319557,3686201l,3366643,,164427c181280,71679,518592,,885393,xe" fillcolor="#017841" stroked="f" strokeweight="0">
-            <v:stroke miterlimit="83231f" joinstyle="miter"/>
-            <v:formulas/>
-            <v:path arrowok="t" o:connecttype="segments" textboxrect="0,0,1024515,3824999"/>
-          </v:shape>
-          <v:shape id="Shape 208" o:spid="_x0000_s1389" style="position:absolute;left:30735;top:8237;width:10245;height:23372;visibility:visible;mso-wrap-style:square;v-text-anchor:top" coordsize="1024528,2337137" o:spt="100" o:gfxdata="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" adj="0,,0" path="m,l127560,14487v583864,91076,896968,496880,896968,1160930c1024528,1835512,702144,2280668,81695,2333735l,2337137,,1798644r28965,-9010c225880,1714083,328860,1483710,328860,1175417,328860,829419,220313,617037,23565,549557l,543036,,xe" fillcolor="#017841" stroked="f" strokeweight="0">
-            <v:stroke miterlimit="83231f" joinstyle="miter"/>
-            <v:formulas/>
-            <v:path arrowok="t" o:connecttype="segments" textboxrect="0,0,1024528,2337137"/>
-          </v:shape>
-        </v:group>
-      </w:pict>
-    </w:r>
-    <w:r>
-      <w:pict w14:anchorId="1A55AAA1">
-        <v:group id="Group 1091" o:spid="_x0000_s1372" style="width:322.7pt;height:365.65pt;mso-position-horizontal-relative:char;mso-position-vertical-relative:line" coordsize="40980,46436">
-          <v:shape id="Shape 201" o:spid="_x0000_s1373" style="position:absolute;left:20490;top:9840;width:10245;height:30888;visibility:visible;mso-wrap-style:square;v-text-anchor:top" coordsize="1024515,3088805" o:spt="100" o:gfxdata="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" adj="0,,0" path="m,l695655,r,786816c758889,765721,881164,744652,982358,744652r42157,1756l1024515,1279357r-14113,-4346c978006,1267237,943354,1263218,906463,1263218v-80099,,-172860,16866,-210808,33744l695655,2519642v37948,16866,126492,29502,202375,29502c934395,2549144,968783,2545653,1001121,2538711r23394,-6474l1024515,3083693r-1696,192c978367,3087159,932549,3088805,885380,3088805,514376,3088805,177076,3017152,,2924391l,xe" fillcolor="#24613a" stroked="f" strokeweight="0">
-            <v:stroke miterlimit="83231f" joinstyle="miter"/>
-            <v:formulas/>
-            <v:path arrowok="t" o:connecttype="segments" textboxrect="0,0,1024515,3088805"/>
-          </v:shape>
-          <v:shape id="Shape 202" o:spid="_x0000_s1374" style="position:absolute;left:30735;top:17304;width:10245;height:23373;visibility:visible;mso-wrap-style:square;v-text-anchor:top" coordsize="1024516,2337284" o:spt="100" o:gfxdata="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" adj="0,,0" path="m,l85854,3577v619994,53066,938662,498222,938662,1158317c1024516,1825932,711411,2231726,127546,2322799l,2337284,,1785829r23565,-6521c220313,1711829,328861,1499447,328861,1153448,328861,845145,228663,617554,32786,543046l,532949,,xe" fillcolor="#24613a" stroked="f" strokeweight="0">
-            <v:stroke miterlimit="83231f" joinstyle="miter"/>
-            <v:formulas/>
-            <v:path arrowok="t" o:connecttype="segments" textboxrect="0,0,1024516,2337284"/>
-          </v:shape>
-          <v:shape id="Shape 203" o:spid="_x0000_s1375" style="position:absolute;top:5393;width:10245;height:23372;visibility:visible;mso-wrap-style:square;v-text-anchor:top" coordsize="1024515,2337147" o:spt="100" o:gfxdata="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" adj="0,,0" path="m1024515,r,543035l1000950,549557c804202,617039,695655,829428,695655,1175416v,308303,102981,538678,299895,614229l1024515,1798655r,538492l942830,2333745c322373,2280678,,1835510,,1175416,,511366,313104,105561,896969,14486l1024515,xe" fillcolor="#017841" stroked="f" strokeweight="0">
-            <v:stroke miterlimit="83231f" joinstyle="miter"/>
-            <v:formulas/>
-            <v:path arrowok="t" o:connecttype="segments" textboxrect="0,0,1024515,2337147"/>
-          </v:shape>
-          <v:shape id="Shape 204" o:spid="_x0000_s1376" style="position:absolute;left:10245;top:5342;width:10245;height:30343;visibility:visible;mso-wrap-style:square;v-text-anchor:top" coordsize="1024515,3034310" o:spt="100" o:gfxdata="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" adj="0,,0" path="m139135,v366788,,704088,71692,885380,164440l1024515,3034310r-695655,l328860,2306244v-63246,21082,-181292,37947,-282486,37947l,2342260,,1803768r18140,5642c50650,1817299,85366,1821383,122256,1821383v80112,,168656,-16865,206604,-33731l328860,564972c286696,548107,206585,531241,126486,531241v-36365,,-70754,3492,-103092,10433l,548148,,5113,1696,4920c46148,1647,91966,,139135,xe" fillcolor="#017841" stroked="f" strokeweight="0">
-            <v:stroke miterlimit="83231f" joinstyle="miter"/>
-            <v:formulas/>
-            <v:path arrowok="t" o:connecttype="segments" textboxrect="0,0,1024515,3034310"/>
-          </v:shape>
-          <v:shape id="Shape 205" o:spid="_x0000_s1377" style="position:absolute;top:14028;width:10245;height:23373;visibility:visible;mso-wrap-style:square;v-text-anchor:top" coordsize="1024515,2337297" o:spt="100" o:gfxdata="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" adj="0,,0" path="m1024515,r,532959l991723,543059c795852,617567,695655,845157,695655,1153461v,345988,108547,558368,305288,625848l1024515,1785832r,551465l896969,2322811c313105,2231736,,1825934,,1161907,,501812,318667,56644,938661,3577l1024515,xe" fillcolor="#24613a" stroked="f" strokeweight="0">
-            <v:stroke miterlimit="83231f" joinstyle="miter"/>
-            <v:formulas/>
-            <v:path arrowok="t" o:connecttype="segments" textboxrect="0,0,1024515,2337297"/>
-          </v:shape>
-          <v:shape id="Shape 206" o:spid="_x0000_s1378" style="position:absolute;left:10245;width:10245;height:37452;visibility:visible;mso-wrap-style:square;v-text-anchor:top" coordsize="1024515,3745242" o:spt="100" o:gfxdata="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" adj="0,,0" path="m781372,1541c797092,,812848,200,828363,2025v103432,12167,196152,96586,196152,219284l1024515,3580828v-177076,92748,-514375,164414,-885380,164414c91966,3745242,46148,3743595,1696,3740322l,3740129,,3188664r23386,6472c55723,3202077,90110,3205568,126473,3205568v75895,,164439,-12636,202387,-29502l328860,1953386v-37948,-16865,-130708,-33731,-210820,-33731c81150,1919655,46499,1923674,14105,1931447l,1935791,,1402832r42158,-1756c143351,1401076,265614,1422158,328860,1443240r,-1058266l648329,65493c687373,26449,734212,6163,781372,1541xe" fillcolor="#24613a" stroked="f" strokeweight="0">
-            <v:stroke miterlimit="83231f" joinstyle="miter"/>
-            <v:formulas/>
-            <v:path arrowok="t" o:connecttype="segments" textboxrect="0,0,1024515,3745242"/>
-          </v:shape>
-          <v:shape id="Shape 207" o:spid="_x0000_s1379" style="position:absolute;left:20490;top:8186;width:10245;height:38250;visibility:visible;mso-wrap-style:square;v-text-anchor:top" coordsize="1024515,3824999" o:spt="100" o:gfxdata="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" adj="0,,0" path="m885393,v47169,,92987,1647,137439,4920l1024515,5111r,543037l1001121,541674c968783,534732,934395,531241,898030,531241v-80099,,-160198,16853,-202375,33719l695655,1787639v37960,16866,126492,33731,206604,33731c939149,1821370,973866,1817286,1006375,1809397r18140,-5642l1024515,2342248r-46361,1931c876960,2344179,758901,2327313,695655,2306231r,1224192c695655,3726701,458356,3824999,319557,3686201l,3366643,,164427c181280,71679,518592,,885393,xe" fillcolor="#017841" stroked="f" strokeweight="0">
-            <v:stroke miterlimit="83231f" joinstyle="miter"/>
-            <v:formulas/>
-            <v:path arrowok="t" o:connecttype="segments" textboxrect="0,0,1024515,3824999"/>
-          </v:shape>
-          <v:shape id="Shape 208" o:spid="_x0000_s1380" style="position:absolute;left:30735;top:8237;width:10245;height:23372;visibility:visible;mso-wrap-style:square;v-text-anchor:top" coordsize="1024528,2337137" o:spt="100" o:gfxdata="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" adj="0,,0" path="m,l127560,14487v583864,91076,896968,496880,896968,1160930c1024528,1835512,702144,2280668,81695,2333735l,2337137,,1798644r28965,-9010c225880,1714083,328860,1483710,328860,1175417,328860,829419,220313,617037,23565,549557l,543036,,xe" fillcolor="#017841" stroked="f" strokeweight="0">
-            <v:stroke miterlimit="83231f" joinstyle="miter"/>
-            <v:formulas/>
-            <v:path arrowok="t" o:connecttype="segments" textboxrect="0,0,1024528,2337137"/>
-          </v:shape>
-          <w10:anchorlock/>
-        </v:group>
-      </w:pict>
-    </w:r>
-    <w:r>
-      <w:pict w14:anchorId="3557A079">
-        <v:group id="_x0000_s1363" style="width:322.7pt;height:365.65pt;mso-position-horizontal-relative:char;mso-position-vertical-relative:line" coordsize="40980,46436">
-          <v:shape id="Shape 201" o:spid="_x0000_s1364" style="position:absolute;left:20490;top:9840;width:10245;height:30888;visibility:visible;mso-wrap-style:square;v-text-anchor:top" coordsize="1024515,3088805" o:spt="100" o:gfxdata="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" adj="0,,0" path="m,l695655,r,786816c758889,765721,881164,744652,982358,744652r42157,1756l1024515,1279357r-14113,-4346c978006,1267237,943354,1263218,906463,1263218v-80099,,-172860,16866,-210808,33744l695655,2519642v37948,16866,126492,29502,202375,29502c934395,2549144,968783,2545653,1001121,2538711r23394,-6474l1024515,3083693r-1696,192c978367,3087159,932549,3088805,885380,3088805,514376,3088805,177076,3017152,,2924391l,xe" fillcolor="#24613a" stroked="f" strokeweight="0">
-            <v:stroke miterlimit="83231f" joinstyle="miter"/>
-            <v:formulas/>
-            <v:path arrowok="t" o:connecttype="segments" textboxrect="0,0,1024515,3088805"/>
-          </v:shape>
-          <v:shape id="Shape 202" o:spid="_x0000_s1365" style="position:absolute;left:30735;top:17304;width:10245;height:23373;visibility:visible;mso-wrap-style:square;v-text-anchor:top" coordsize="1024516,2337284" o:spt="100" o:gfxdata="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" adj="0,,0" path="m,l85854,3577v619994,53066,938662,498222,938662,1158317c1024516,1825932,711411,2231726,127546,2322799l,2337284,,1785829r23565,-6521c220313,1711829,328861,1499447,328861,1153448,328861,845145,228663,617554,32786,543046l,532949,,xe" fillcolor="#24613a" stroked="f" strokeweight="0">
-            <v:stroke miterlimit="83231f" joinstyle="miter"/>
-            <v:formulas/>
-            <v:path arrowok="t" o:connecttype="segments" textboxrect="0,0,1024516,2337284"/>
-          </v:shape>
-          <v:shape id="Shape 203" o:spid="_x0000_s1366" style="position:absolute;top:5393;width:10245;height:23372;visibility:visible;mso-wrap-style:square;v-text-anchor:top" coordsize="1024515,2337147" o:spt="100" o:gfxdata="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" adj="0,,0" path="m1024515,r,543035l1000950,549557c804202,617039,695655,829428,695655,1175416v,308303,102981,538678,299895,614229l1024515,1798655r,538492l942830,2333745c322373,2280678,,1835510,,1175416,,511366,313104,105561,896969,14486l1024515,xe" fillcolor="#017841" stroked="f" strokeweight="0">
-            <v:stroke miterlimit="83231f" joinstyle="miter"/>
-            <v:formulas/>
-            <v:path arrowok="t" o:connecttype="segments" textboxrect="0,0,1024515,2337147"/>
-          </v:shape>
-          <v:shape id="Shape 204" o:spid="_x0000_s1367" style="position:absolute;left:10245;top:5342;width:10245;height:30343;visibility:visible;mso-wrap-style:square;v-text-anchor:top" coordsize="1024515,3034310" o:spt="100" o:gfxdata="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" adj="0,,0" path="m139135,v366788,,704088,71692,885380,164440l1024515,3034310r-695655,l328860,2306244v-63246,21082,-181292,37947,-282486,37947l,2342260,,1803768r18140,5642c50650,1817299,85366,1821383,122256,1821383v80112,,168656,-16865,206604,-33731l328860,564972c286696,548107,206585,531241,126486,531241v-36365,,-70754,3492,-103092,10433l,548148,,5113,1696,4920c46148,1647,91966,,139135,xe" fillcolor="#017841" stroked="f" strokeweight="0">
-            <v:stroke miterlimit="83231f" joinstyle="miter"/>
-            <v:formulas/>
-            <v:path arrowok="t" o:connecttype="segments" textboxrect="0,0,1024515,3034310"/>
-          </v:shape>
-          <v:shape id="Shape 205" o:spid="_x0000_s1368" style="position:absolute;top:14028;width:10245;height:23373;visibility:visible;mso-wrap-style:square;v-text-anchor:top" coordsize="1024515,2337297" o:spt="100" o:gfxdata="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" adj="0,,0" path="m1024515,r,532959l991723,543059c795852,617567,695655,845157,695655,1153461v,345988,108547,558368,305288,625848l1024515,1785832r,551465l896969,2322811c313105,2231736,,1825934,,1161907,,501812,318667,56644,938661,3577l1024515,xe" fillcolor="#24613a" stroked="f" strokeweight="0">
-            <v:stroke miterlimit="83231f" joinstyle="miter"/>
-            <v:formulas/>
-            <v:path arrowok="t" o:connecttype="segments" textboxrect="0,0,1024515,2337297"/>
-          </v:shape>
-          <v:shape id="Shape 206" o:spid="_x0000_s1369" style="position:absolute;left:10245;width:10245;height:37452;visibility:visible;mso-wrap-style:square;v-text-anchor:top" coordsize="1024515,3745242" o:spt="100" o:gfxdata="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" adj="0,,0" path="m781372,1541c797092,,812848,200,828363,2025v103432,12167,196152,96586,196152,219284l1024515,3580828v-177076,92748,-514375,164414,-885380,164414c91966,3745242,46148,3743595,1696,3740322l,3740129,,3188664r23386,6472c55723,3202077,90110,3205568,126473,3205568v75895,,164439,-12636,202387,-29502l328860,1953386v-37948,-16865,-130708,-33731,-210820,-33731c81150,1919655,46499,1923674,14105,1931447l,1935791,,1402832r42158,-1756c143351,1401076,265614,1422158,328860,1443240r,-1058266l648329,65493c687373,26449,734212,6163,781372,1541xe" fillcolor="#24613a" stroked="f" strokeweight="0">
-            <v:stroke miterlimit="83231f" joinstyle="miter"/>
-            <v:formulas/>
-            <v:path arrowok="t" o:connecttype="segments" textboxrect="0,0,1024515,3745242"/>
-          </v:shape>
-          <v:shape id="Shape 207" o:spid="_x0000_s1370" style="position:absolute;left:20490;top:8186;width:10245;height:38250;visibility:visible;mso-wrap-style:square;v-text-anchor:top" coordsize="1024515,3824999" o:spt="100" o:gfxdata="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" adj="0,,0" path="m885393,v47169,,92987,1647,137439,4920l1024515,5111r,543037l1001121,541674c968783,534732,934395,531241,898030,531241v-80099,,-160198,16853,-202375,33719l695655,1787639v37960,16866,126492,33731,206604,33731c939149,1821370,973866,1817286,1006375,1809397r18140,-5642l1024515,2342248r-46361,1931c876960,2344179,758901,2327313,695655,2306231r,1224192c695655,3726701,458356,3824999,319557,3686201l,3366643,,164427c181280,71679,518592,,885393,xe" fillcolor="#017841" stroked="f" strokeweight="0">
-            <v:stroke miterlimit="83231f" joinstyle="miter"/>
-            <v:formulas/>
-            <v:path arrowok="t" o:connecttype="segments" textboxrect="0,0,1024515,3824999"/>
-          </v:shape>
-          <v:shape id="Shape 208" o:spid="_x0000_s1371" style="position:absolute;left:30735;top:8237;width:10245;height:23372;visibility:visible;mso-wrap-style:square;v-text-anchor:top" coordsize="1024528,2337137" o:spt="100" o:gfxdata="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" adj="0,,0" path="m,l127560,14487v583864,91076,896968,496880,896968,1160930c1024528,1835512,702144,2280668,81695,2333735l,2337137,,1798644r28965,-9010c225880,1714083,328860,1483710,328860,1175417,328860,829419,220313,617037,23565,549557l,543036,,xe" fillcolor="#017841" stroked="f" strokeweight="0">
-            <v:stroke miterlimit="83231f" joinstyle="miter"/>
-            <v:formulas/>
-            <v:path arrowok="t" o:connecttype="segments" textboxrect="0,0,1024528,2337137"/>
-          </v:shape>
-          <w10:anchorlock/>
-        </v:group>
-      </w:pict>
-    </w:r>
-    <w:r>
-      <w:pict w14:anchorId="02B7C5FB">
-        <v:group id="_x0000_s1354" style="width:322.7pt;height:365.65pt;mso-position-horizontal-relative:char;mso-position-vertical-relative:line" coordsize="40980,46436">
-          <v:shape id="Shape 201" o:spid="_x0000_s1355" style="position:absolute;left:20490;top:9840;width:10245;height:30888;visibility:visible;mso-wrap-style:square;v-text-anchor:top" coordsize="1024515,3088805" o:spt="100" o:gfxdata="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" adj="0,,0" path="m,l695655,r,786816c758889,765721,881164,744652,982358,744652r42157,1756l1024515,1279357r-14113,-4346c978006,1267237,943354,1263218,906463,1263218v-80099,,-172860,16866,-210808,33744l695655,2519642v37948,16866,126492,29502,202375,29502c934395,2549144,968783,2545653,1001121,2538711r23394,-6474l1024515,3083693r-1696,192c978367,3087159,932549,3088805,885380,3088805,514376,3088805,177076,3017152,,2924391l,xe" fillcolor="#24613a" stroked="f" strokeweight="0">
-            <v:stroke miterlimit="83231f" joinstyle="miter"/>
-            <v:formulas/>
-            <v:path arrowok="t" o:connecttype="segments" textboxrect="0,0,1024515,3088805"/>
-          </v:shape>
-          <v:shape id="Shape 202" o:spid="_x0000_s1356" style="position:absolute;left:30735;top:17304;width:10245;height:23373;visibility:visible;mso-wrap-style:square;v-text-anchor:top" coordsize="1024516,2337284" o:spt="100" o:gfxdata="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" adj="0,,0" path="m,l85854,3577v619994,53066,938662,498222,938662,1158317c1024516,1825932,711411,2231726,127546,2322799l,2337284,,1785829r23565,-6521c220313,1711829,328861,1499447,328861,1153448,328861,845145,228663,617554,32786,543046l,532949,,xe" fillcolor="#24613a" stroked="f" strokeweight="0">
-            <v:stroke miterlimit="83231f" joinstyle="miter"/>
-            <v:formulas/>
-            <v:path arrowok="t" o:connecttype="segments" textboxrect="0,0,1024516,2337284"/>
-          </v:shape>
-          <v:shape id="Shape 203" o:spid="_x0000_s1357" style="position:absolute;top:5393;width:10245;height:23372;visibility:visible;mso-wrap-style:square;v-text-anchor:top" coordsize="1024515,2337147" o:spt="100" o:gfxdata="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" adj="0,,0" path="m1024515,r,543035l1000950,549557c804202,617039,695655,829428,695655,1175416v,308303,102981,538678,299895,614229l1024515,1798655r,538492l942830,2333745c322373,2280678,,1835510,,1175416,,511366,313104,105561,896969,14486l1024515,xe" fillcolor="#017841" stroked="f" strokeweight="0">
-            <v:stroke miterlimit="83231f" joinstyle="miter"/>
-            <v:formulas/>
-            <v:path arrowok="t" o:connecttype="segments" textboxrect="0,0,1024515,2337147"/>
-          </v:shape>
-          <v:shape id="Shape 204" o:spid="_x0000_s1358" style="position:absolute;left:10245;top:5342;width:10245;height:30343;visibility:visible;mso-wrap-style:square;v-text-anchor:top" coordsize="1024515,3034310" o:spt="100" o:gfxdata="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" adj="0,,0" path="m139135,v366788,,704088,71692,885380,164440l1024515,3034310r-695655,l328860,2306244v-63246,21082,-181292,37947,-282486,37947l,2342260,,1803768r18140,5642c50650,1817299,85366,1821383,122256,1821383v80112,,168656,-16865,206604,-33731l328860,564972c286696,548107,206585,531241,126486,531241v-36365,,-70754,3492,-103092,10433l,548148,,5113,1696,4920c46148,1647,91966,,139135,xe" fillcolor="#017841" stroked="f" strokeweight="0">
-            <v:stroke miterlimit="83231f" joinstyle="miter"/>
-            <v:formulas/>
-            <v:path arrowok="t" o:connecttype="segments" textboxrect="0,0,1024515,3034310"/>
-          </v:shape>
-          <v:shape id="Shape 205" o:spid="_x0000_s1359" style="position:absolute;top:14028;width:10245;height:23373;visibility:visible;mso-wrap-style:square;v-text-anchor:top" coordsize="1024515,2337297" o:spt="100" o:gfxdata="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" adj="0,,0" path="m1024515,r,532959l991723,543059c795852,617567,695655,845157,695655,1153461v,345988,108547,558368,305288,625848l1024515,1785832r,551465l896969,2322811c313105,2231736,,1825934,,1161907,,501812,318667,56644,938661,3577l1024515,xe" fillcolor="#24613a" stroked="f" strokeweight="0">
-            <v:stroke miterlimit="83231f" joinstyle="miter"/>
-            <v:formulas/>
-            <v:path arrowok="t" o:connecttype="segments" textboxrect="0,0,1024515,2337297"/>
-          </v:shape>
-          <v:shape id="Shape 206" o:spid="_x0000_s1360" style="position:absolute;left:10245;width:10245;height:37452;visibility:visible;mso-wrap-style:square;v-text-anchor:top" coordsize="1024515,3745242" o:spt="100" o:gfxdata="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" adj="0,,0" path="m781372,1541c797092,,812848,200,828363,2025v103432,12167,196152,96586,196152,219284l1024515,3580828v-177076,92748,-514375,164414,-885380,164414c91966,3745242,46148,3743595,1696,3740322l,3740129,,3188664r23386,6472c55723,3202077,90110,3205568,126473,3205568v75895,,164439,-12636,202387,-29502l328860,1953386v-37948,-16865,-130708,-33731,-210820,-33731c81150,1919655,46499,1923674,14105,1931447l,1935791,,1402832r42158,-1756c143351,1401076,265614,1422158,328860,1443240r,-1058266l648329,65493c687373,26449,734212,6163,781372,1541xe" fillcolor="#24613a" stroked="f" strokeweight="0">
-            <v:stroke miterlimit="83231f" joinstyle="miter"/>
-            <v:formulas/>
-            <v:path arrowok="t" o:connecttype="segments" textboxrect="0,0,1024515,3745242"/>
-          </v:shape>
-          <v:shape id="Shape 207" o:spid="_x0000_s1361" style="position:absolute;left:20490;top:8186;width:10245;height:38250;visibility:visible;mso-wrap-style:square;v-text-anchor:top" coordsize="1024515,3824999" o:spt="100" o:gfxdata="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" adj="0,,0" path="m885393,v47169,,92987,1647,137439,4920l1024515,5111r,543037l1001121,541674c968783,534732,934395,531241,898030,531241v-80099,,-160198,16853,-202375,33719l695655,1787639v37960,16866,126492,33731,206604,33731c939149,1821370,973866,1817286,1006375,1809397r18140,-5642l1024515,2342248r-46361,1931c876960,2344179,758901,2327313,695655,2306231r,1224192c695655,3726701,458356,3824999,319557,3686201l,3366643,,164427c181280,71679,518592,,885393,xe" fillcolor="#017841" stroked="f" strokeweight="0">
-            <v:stroke miterlimit="83231f" joinstyle="miter"/>
-            <v:formulas/>
-            <v:path arrowok="t" o:connecttype="segments" textboxrect="0,0,1024515,3824999"/>
-          </v:shape>
-          <v:shape id="Shape 208" o:spid="_x0000_s1362" style="position:absolute;left:30735;top:8237;width:10245;height:23372;visibility:visible;mso-wrap-style:square;v-text-anchor:top" coordsize="1024528,2337137" o:spt="100" o:gfxdata="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" adj="0,,0" path="m,l127560,14487v583864,91076,896968,496880,896968,1160930c1024528,1835512,702144,2280668,81695,2333735l,2337137,,1798644r28965,-9010c225880,1714083,328860,1483710,328860,1175417,328860,829419,220313,617037,23565,549557l,543036,,xe" fillcolor="#017841" stroked="f" strokeweight="0">
-            <v:stroke miterlimit="83231f" joinstyle="miter"/>
-            <v:formulas/>
-            <v:path arrowok="t" o:connecttype="segments" textboxrect="0,0,1024528,2337137"/>
-          </v:shape>
-          <w10:anchorlock/>
-        </v:group>
-      </w:pict>
-    </w:r>
-    <w:r>
-      <w:pict w14:anchorId="40130A88">
-        <v:group id="_x0000_s1345" style="width:322.7pt;height:365.65pt;mso-position-horizontal-relative:char;mso-position-vertical-relative:line" coordsize="40980,46436">
-          <v:shape id="Shape 201" o:spid="_x0000_s1346" style="position:absolute;left:20490;top:9840;width:10245;height:30888;visibility:visible;mso-wrap-style:square;v-text-anchor:top" coordsize="1024515,3088805" o:spt="100" o:gfxdata="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" adj="0,,0" path="m,l695655,r,786816c758889,765721,881164,744652,982358,744652r42157,1756l1024515,1279357r-14113,-4346c978006,1267237,943354,1263218,906463,1263218v-80099,,-172860,16866,-210808,33744l695655,2519642v37948,16866,126492,29502,202375,29502c934395,2549144,968783,2545653,1001121,2538711r23394,-6474l1024515,3083693r-1696,192c978367,3087159,932549,3088805,885380,3088805,514376,3088805,177076,3017152,,2924391l,xe" fillcolor="#24613a" stroked="f" strokeweight="0">
-            <v:stroke miterlimit="83231f" joinstyle="miter"/>
-            <v:formulas/>
-            <v:path arrowok="t" o:connecttype="segments" textboxrect="0,0,1024515,3088805"/>
-          </v:shape>
-          <v:shape id="Shape 202" o:spid="_x0000_s1347" style="position:absolute;left:30735;top:17304;width:10245;height:23373;visibility:visible;mso-wrap-style:square;v-text-anchor:top" coordsize="1024516,2337284" o:spt="100" o:gfxdata="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" adj="0,,0" path="m,l85854,3577v619994,53066,938662,498222,938662,1158317c1024516,1825932,711411,2231726,127546,2322799l,2337284,,1785829r23565,-6521c220313,1711829,328861,1499447,328861,1153448,328861,845145,228663,617554,32786,543046l,532949,,xe" fillcolor="#24613a" stroked="f" strokeweight="0">
-            <v:stroke miterlimit="83231f" joinstyle="miter"/>
-            <v:formulas/>
-            <v:path arrowok="t" o:connecttype="segments" textboxrect="0,0,1024516,2337284"/>
-          </v:shape>
-          <v:shape id="Shape 203" o:spid="_x0000_s1348" style="position:absolute;top:5393;width:10245;height:23372;visibility:visible;mso-wrap-style:square;v-text-anchor:top" coordsize="1024515,2337147" o:spt="100" o:gfxdata="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" adj="0,,0" path="m1024515,r,543035l1000950,549557c804202,617039,695655,829428,695655,1175416v,308303,102981,538678,299895,614229l1024515,1798655r,538492l942830,2333745c322373,2280678,,1835510,,1175416,,511366,313104,105561,896969,14486l1024515,xe" fillcolor="#017841" stroked="f" strokeweight="0">
-            <v:stroke miterlimit="83231f" joinstyle="miter"/>
-            <v:formulas/>
-            <v:path arrowok="t" o:connecttype="segments" textboxrect="0,0,1024515,2337147"/>
-          </v:shape>
-          <v:shape id="Shape 204" o:spid="_x0000_s1349" style="position:absolute;left:10245;top:5342;width:10245;height:30343;visibility:visible;mso-wrap-style:square;v-text-anchor:top" coordsize="1024515,3034310" o:spt="100" o:gfxdata="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" adj="0,,0" path="m139135,v366788,,704088,71692,885380,164440l1024515,3034310r-695655,l328860,2306244v-63246,21082,-181292,37947,-282486,37947l,2342260,,1803768r18140,5642c50650,1817299,85366,1821383,122256,1821383v80112,,168656,-16865,206604,-33731l328860,564972c286696,548107,206585,531241,126486,531241v-36365,,-70754,3492,-103092,10433l,548148,,5113,1696,4920c46148,1647,91966,,139135,xe" fillcolor="#017841" stroked="f" strokeweight="0">
-            <v:stroke miterlimit="83231f" joinstyle="miter"/>
-            <v:formulas/>
-            <v:path arrowok="t" o:connecttype="segments" textboxrect="0,0,1024515,3034310"/>
-          </v:shape>
-          <v:shape id="Shape 205" o:spid="_x0000_s1350" style="position:absolute;top:14028;width:10245;height:23373;visibility:visible;mso-wrap-style:square;v-text-anchor:top" coordsize="1024515,2337297" o:spt="100" o:gfxdata="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" adj="0,,0" path="m1024515,r,532959l991723,543059c795852,617567,695655,845157,695655,1153461v,345988,108547,558368,305288,625848l1024515,1785832r,551465l896969,2322811c313105,2231736,,1825934,,1161907,,501812,318667,56644,938661,3577l1024515,xe" fillcolor="#24613a" stroked="f" strokeweight="0">
-            <v:stroke miterlimit="83231f" joinstyle="miter"/>
-            <v:formulas/>
-            <v:path arrowok="t" o:connecttype="segments" textboxrect="0,0,1024515,2337297"/>
-          </v:shape>
-          <v:shape id="Shape 206" o:spid="_x0000_s1351" style="position:absolute;left:10245;width:10245;height:37452;visibility:visible;mso-wrap-style:square;v-text-anchor:top" coordsize="1024515,3745242" o:spt="100" o:gfxdata="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" adj="0,,0" path="m781372,1541c797092,,812848,200,828363,2025v103432,12167,196152,96586,196152,219284l1024515,3580828v-177076,92748,-514375,164414,-885380,164414c91966,3745242,46148,3743595,1696,3740322l,3740129,,3188664r23386,6472c55723,3202077,90110,3205568,126473,3205568v75895,,164439,-12636,202387,-29502l328860,1953386v-37948,-16865,-130708,-33731,-210820,-33731c81150,1919655,46499,1923674,14105,1931447l,1935791,,1402832r42158,-1756c143351,1401076,265614,1422158,328860,1443240r,-1058266l648329,65493c687373,26449,734212,6163,781372,1541xe" fillcolor="#24613a" stroked="f" strokeweight="0">
-            <v:stroke miterlimit="83231f" joinstyle="miter"/>
-            <v:formulas/>
-            <v:path arrowok="t" o:connecttype="segments" textboxrect="0,0,1024515,3745242"/>
-          </v:shape>
-          <v:shape id="Shape 207" o:spid="_x0000_s1352" style="position:absolute;left:20490;top:8186;width:10245;height:38250;visibility:visible;mso-wrap-style:square;v-text-anchor:top" coordsize="1024515,3824999" o:spt="100" o:gfxdata="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" adj="0,,0" path="m885393,v47169,,92987,1647,137439,4920l1024515,5111r,543037l1001121,541674c968783,534732,934395,531241,898030,531241v-80099,,-160198,16853,-202375,33719l695655,1787639v37960,16866,126492,33731,206604,33731c939149,1821370,973866,1817286,1006375,1809397r18140,-5642l1024515,2342248r-46361,1931c876960,2344179,758901,2327313,695655,2306231r,1224192c695655,3726701,458356,3824999,319557,3686201l,3366643,,164427c181280,71679,518592,,885393,xe" fillcolor="#017841" stroked="f" strokeweight="0">
-            <v:stroke miterlimit="83231f" joinstyle="miter"/>
-            <v:formulas/>
-            <v:path arrowok="t" o:connecttype="segments" textboxrect="0,0,1024515,3824999"/>
-          </v:shape>
-          <v:shape id="Shape 208" o:spid="_x0000_s1353" style="position:absolute;left:30735;top:8237;width:10245;height:23372;visibility:visible;mso-wrap-style:square;v-text-anchor:top" coordsize="1024528,2337137" o:spt="100" o:gfxdata="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" adj="0,,0" path="m,l127560,14487v583864,91076,896968,496880,896968,1160930c1024528,1835512,702144,2280668,81695,2333735l,2337137,,1798644r28965,-9010c225880,1714083,328860,1483710,328860,1175417,328860,829419,220313,617037,23565,549557l,543036,,xe" fillcolor="#017841" stroked="f" strokeweight="0">
-            <v:stroke miterlimit="83231f" joinstyle="miter"/>
-            <v:formulas/>
-            <v:path arrowok="t" o:connecttype="segments" textboxrect="0,0,1024528,2337137"/>
-          </v:shape>
-          <w10:anchorlock/>
-        </v:group>
-      </w:pict>
-    </w:r>
-    <w:r>
-      <w:pict w14:anchorId="3876291A">
-        <v:group id="_x0000_s1336" style="width:322.7pt;height:365.65pt;mso-position-horizontal-relative:char;mso-position-vertical-relative:line" coordsize="40980,46436">
-          <v:shape id="Shape 201" o:spid="_x0000_s1337" style="position:absolute;left:20490;top:9840;width:10245;height:30888;visibility:visible;mso-wrap-style:square;v-text-anchor:top" coordsize="1024515,3088805" o:spt="100" o:gfxdata="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" adj="0,,0" path="m,l695655,r,786816c758889,765721,881164,744652,982358,744652r42157,1756l1024515,1279357r-14113,-4346c978006,1267237,943354,1263218,906463,1263218v-80099,,-172860,16866,-210808,33744l695655,2519642v37948,16866,126492,29502,202375,29502c934395,2549144,968783,2545653,1001121,2538711r23394,-6474l1024515,3083693r-1696,192c978367,3087159,932549,3088805,885380,3088805,514376,3088805,177076,3017152,,2924391l,xe" fillcolor="#24613a" stroked="f" strokeweight="0">
-            <v:stroke miterlimit="83231f" joinstyle="miter"/>
-            <v:formulas/>
-            <v:path arrowok="t" o:connecttype="segments" textboxrect="0,0,1024515,3088805"/>
-          </v:shape>
-          <v:shape id="Shape 202" o:spid="_x0000_s1338" style="position:absolute;left:30735;top:17304;width:10245;height:23373;visibility:visible;mso-wrap-style:square;v-text-anchor:top" coordsize="1024516,2337284" o:spt="100" o:gfxdata="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" adj="0,,0" path="m,l85854,3577v619994,53066,938662,498222,938662,1158317c1024516,1825932,711411,2231726,127546,2322799l,2337284,,1785829r23565,-6521c220313,1711829,328861,1499447,328861,1153448,328861,845145,228663,617554,32786,543046l,532949,,xe" fillcolor="#24613a" stroked="f" strokeweight="0">
-            <v:stroke miterlimit="83231f" joinstyle="miter"/>
-            <v:formulas/>
-            <v:path arrowok="t" o:connecttype="segments" textboxrect="0,0,1024516,2337284"/>
-          </v:shape>
-          <v:shape id="Shape 203" o:spid="_x0000_s1339" style="position:absolute;top:5393;width:10245;height:23372;visibility:visible;mso-wrap-style:square;v-text-anchor:top" coordsize="1024515,2337147" o:spt="100" o:gfxdata="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" adj="0,,0" path="m1024515,r,543035l1000950,549557c804202,617039,695655,829428,695655,1175416v,308303,102981,538678,299895,614229l1024515,1798655r,538492l942830,2333745c322373,2280678,,1835510,,1175416,,511366,313104,105561,896969,14486l1024515,xe" fillcolor="#017841" stroked="f" strokeweight="0">
-            <v:stroke miterlimit="83231f" joinstyle="miter"/>
-            <v:formulas/>
-            <v:path arrowok="t" o:connecttype="segments" textboxrect="0,0,1024515,2337147"/>
-          </v:shape>
-          <v:shape id="Shape 204" o:spid="_x0000_s1340" style="position:absolute;left:10245;top:5342;width:10245;height:30343;visibility:visible;mso-wrap-style:square;v-text-anchor:top" coordsize="1024515,3034310" o:spt="100" o:gfxdata="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" adj="0,,0" path="m139135,v366788,,704088,71692,885380,164440l1024515,3034310r-695655,l328860,2306244v-63246,21082,-181292,37947,-282486,37947l,2342260,,1803768r18140,5642c50650,1817299,85366,1821383,122256,1821383v80112,,168656,-16865,206604,-33731l328860,564972c286696,548107,206585,531241,126486,531241v-36365,,-70754,3492,-103092,10433l,548148,,5113,1696,4920c46148,1647,91966,,139135,xe" fillcolor="#017841" stroked="f" strokeweight="0">
-            <v:stroke miterlimit="83231f" joinstyle="miter"/>
-            <v:formulas/>
-            <v:path arrowok="t" o:connecttype="segments" textboxrect="0,0,1024515,3034310"/>
-          </v:shape>
-          <v:shape id="Shape 205" o:spid="_x0000_s1341" style="position:absolute;top:14028;width:10245;height:23373;visibility:visible;mso-wrap-style:square;v-text-anchor:top" coordsize="1024515,2337297" o:spt="100" o:gfxdata="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" adj="0,,0" path="m1024515,r,532959l991723,543059c795852,617567,695655,845157,695655,1153461v,345988,108547,558368,305288,625848l1024515,1785832r,551465l896969,2322811c313105,2231736,,1825934,,1161907,,501812,318667,56644,938661,3577l1024515,xe" fillcolor="#24613a" stroked="f" strokeweight="0">
-            <v:stroke miterlimit="83231f" joinstyle="miter"/>
-            <v:formulas/>
-            <v:path arrowok="t" o:connecttype="segments" textboxrect="0,0,1024515,2337297"/>
-          </v:shape>
-          <v:shape id="Shape 206" o:spid="_x0000_s1342" style="position:absolute;left:10245;width:10245;height:37452;visibility:visible;mso-wrap-style:square;v-text-anchor:top" coordsize="1024515,3745242" o:spt="100" o:gfxdata="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" adj="0,,0" path="m781372,1541c797092,,812848,200,828363,2025v103432,12167,196152,96586,196152,219284l1024515,3580828v-177076,92748,-514375,164414,-885380,164414c91966,3745242,46148,3743595,1696,3740322l,3740129,,3188664r23386,6472c55723,3202077,90110,3205568,126473,3205568v75895,,164439,-12636,202387,-29502l328860,1953386v-37948,-16865,-130708,-33731,-210820,-33731c81150,1919655,46499,1923674,14105,1931447l,1935791,,1402832r42158,-1756c143351,1401076,265614,1422158,328860,1443240r,-1058266l648329,65493c687373,26449,734212,6163,781372,1541xe" fillcolor="#24613a" stroked="f" strokeweight="0">
-            <v:stroke miterlimit="83231f" joinstyle="miter"/>
-            <v:formulas/>
-            <v:path arrowok="t" o:connecttype="segments" textboxrect="0,0,1024515,3745242"/>
-          </v:shape>
-          <v:shape id="Shape 207" o:spid="_x0000_s1343" style="position:absolute;left:20490;top:8186;width:10245;height:38250;visibility:visible;mso-wrap-style:square;v-text-anchor:top" coordsize="1024515,3824999" o:spt="100" o:gfxdata="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" adj="0,,0" path="m885393,v47169,,92987,1647,137439,4920l1024515,5111r,543037l1001121,541674c968783,534732,934395,531241,898030,531241v-80099,,-160198,16853,-202375,33719l695655,1787639v37960,16866,126492,33731,206604,33731c939149,1821370,973866,1817286,1006375,1809397r18140,-5642l1024515,2342248r-46361,1931c876960,2344179,758901,2327313,695655,2306231r,1224192c695655,3726701,458356,3824999,319557,3686201l,3366643,,164427c181280,71679,518592,,885393,xe" fillcolor="#017841" stroked="f" strokeweight="0">
-            <v:stroke miterlimit="83231f" joinstyle="miter"/>
-            <v:formulas/>
-            <v:path arrowok="t" o:connecttype="segments" textboxrect="0,0,1024515,3824999"/>
-          </v:shape>
-          <v:shape id="Shape 208" o:spid="_x0000_s1344" style="position:absolute;left:30735;top:8237;width:10245;height:23372;visibility:visible;mso-wrap-style:square;v-text-anchor:top" coordsize="1024528,2337137" o:spt="100" o:gfxdata="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" adj="0,,0" path="m,l127560,14487v583864,91076,896968,496880,896968,1160930c1024528,1835512,702144,2280668,81695,2333735l,2337137,,1798644r28965,-9010c225880,1714083,328860,1483710,328860,1175417,328860,829419,220313,617037,23565,549557l,543036,,xe" fillcolor="#017841" stroked="f" strokeweight="0">
-            <v:stroke miterlimit="83231f" joinstyle="miter"/>
-            <v:formulas/>
-            <v:path arrowok="t" o:connecttype="segments" textboxrect="0,0,1024528,2337137"/>
-          </v:shape>
-          <w10:anchorlock/>
-        </v:group>
-      </w:pict>
-    </w:r>
-    <w:r>
-      <w:pict w14:anchorId="1444B9B0">
-        <v:group id="_x0000_s1327" style="width:322.7pt;height:365.65pt;mso-position-horizontal-relative:char;mso-position-vertical-relative:line" coordsize="40980,46436">
-          <v:shape id="Shape 201" o:spid="_x0000_s1328" style="position:absolute;left:20490;top:9840;width:10245;height:30888;visibility:visible;mso-wrap-style:square;v-text-anchor:top" coordsize="1024515,3088805" o:spt="100" o:gfxdata="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" adj="0,,0" path="m,l695655,r,786816c758889,765721,881164,744652,982358,744652r42157,1756l1024515,1279357r-14113,-4346c978006,1267237,943354,1263218,906463,1263218v-80099,,-172860,16866,-210808,33744l695655,2519642v37948,16866,126492,29502,202375,29502c934395,2549144,968783,2545653,1001121,2538711r23394,-6474l1024515,3083693r-1696,192c978367,3087159,932549,3088805,885380,3088805,514376,3088805,177076,3017152,,2924391l,xe" fillcolor="#24613a" stroked="f" strokeweight="0">
-            <v:stroke miterlimit="83231f" joinstyle="miter"/>
-            <v:formulas/>
-            <v:path arrowok="t" o:connecttype="segments" textboxrect="0,0,1024515,3088805"/>
-          </v:shape>
-          <v:shape id="Shape 202" o:spid="_x0000_s1329" style="position:absolute;left:30735;top:17304;width:10245;height:23373;visibility:visible;mso-wrap-style:square;v-text-anchor:top" coordsize="1024516,2337284" o:spt="100" o:gfxdata="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" adj="0,,0" path="m,l85854,3577v619994,53066,938662,498222,938662,1158317c1024516,1825932,711411,2231726,127546,2322799l,2337284,,1785829r23565,-6521c220313,1711829,328861,1499447,328861,1153448,328861,845145,228663,617554,32786,543046l,532949,,xe" fillcolor="#24613a" stroked="f" strokeweight="0">
-            <v:stroke miterlimit="83231f" joinstyle="miter"/>
-            <v:formulas/>
-            <v:path arrowok="t" o:connecttype="segments" textboxrect="0,0,1024516,2337284"/>
-          </v:shape>
-          <v:shape id="Shape 203" o:spid="_x0000_s1330" style="position:absolute;top:5393;width:10245;height:23372;visibility:visible;mso-wrap-style:square;v-text-anchor:top" coordsize="1024515,2337147" o:spt="100" o:gfxdata="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" adj="0,,0" path="m1024515,r,543035l1000950,549557c804202,617039,695655,829428,695655,1175416v,308303,102981,538678,299895,614229l1024515,1798655r,538492l942830,2333745c322373,2280678,,1835510,,1175416,,511366,313104,105561,896969,14486l1024515,xe" fillcolor="#017841" stroked="f" strokeweight="0">
-            <v:stroke miterlimit="83231f" joinstyle="miter"/>
-            <v:formulas/>
-            <v:path arrowok="t" o:connecttype="segments" textboxrect="0,0,1024515,2337147"/>
-          </v:shape>
-          <v:shape id="Shape 204" o:spid="_x0000_s1331" style="position:absolute;left:10245;top:5342;width:10245;height:30343;visibility:visible;mso-wrap-style:square;v-text-anchor:top" coordsize="1024515,3034310" o:spt="100" o:gfxdata="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" adj="0,,0" path="m139135,v366788,,704088,71692,885380,164440l1024515,3034310r-695655,l328860,2306244v-63246,21082,-181292,37947,-282486,37947l,2342260,,1803768r18140,5642c50650,1817299,85366,1821383,122256,1821383v80112,,168656,-16865,206604,-33731l328860,564972c286696,548107,206585,531241,126486,531241v-36365,,-70754,3492,-103092,10433l,548148,,5113,1696,4920c46148,1647,91966,,139135,xe" fillcolor="#017841" stroked="f" strokeweight="0">
-            <v:stroke miterlimit="83231f" joinstyle="miter"/>
-            <v:formulas/>
-            <v:path arrowok="t" o:connecttype="segments" textboxrect="0,0,1024515,3034310"/>
-          </v:shape>
-          <v:shape id="Shape 205" o:spid="_x0000_s1332" style="position:absolute;top:14028;width:10245;height:23373;visibility:visible;mso-wrap-style:square;v-text-anchor:top" coordsize="1024515,2337297" o:spt="100" o:gfxdata="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" adj="0,,0" path="m1024515,r,532959l991723,543059c795852,617567,695655,845157,695655,1153461v,345988,108547,558368,305288,625848l1024515,1785832r,551465l896969,2322811c313105,2231736,,1825934,,1161907,,501812,318667,56644,938661,3577l1024515,xe" fillcolor="#24613a" stroked="f" strokeweight="0">
-            <v:stroke miterlimit="83231f" joinstyle="miter"/>
-            <v:formulas/>
-            <v:path arrowok="t" o:connecttype="segments" textboxrect="0,0,1024515,2337297"/>
-          </v:shape>
-          <v:shape id="Shape 206" o:spid="_x0000_s1333" style="position:absolute;left:10245;width:10245;height:37452;visibility:visible;mso-wrap-style:square;v-text-anchor:top" coordsize="1024515,3745242" o:spt="100" o:gfxdata="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" adj="0,,0" path="m781372,1541c797092,,812848,200,828363,2025v103432,12167,196152,96586,196152,219284l1024515,3580828v-177076,92748,-514375,164414,-885380,164414c91966,3745242,46148,3743595,1696,3740322l,3740129,,3188664r23386,6472c55723,3202077,90110,3205568,126473,3205568v75895,,164439,-12636,202387,-29502l328860,1953386v-37948,-16865,-130708,-33731,-210820,-33731c81150,1919655,46499,1923674,14105,1931447l,1935791,,1402832r42158,-1756c143351,1401076,265614,1422158,328860,1443240r,-1058266l648329,65493c687373,26449,734212,6163,781372,1541xe" fillcolor="#24613a" stroked="f" strokeweight="0">
-            <v:stroke miterlimit="83231f" joinstyle="miter"/>
-            <v:formulas/>
-            <v:path arrowok="t" o:connecttype="segments" textboxrect="0,0,1024515,3745242"/>
-          </v:shape>
-          <v:shape id="Shape 207" o:spid="_x0000_s1334" style="position:absolute;left:20490;top:8186;width:10245;height:38250;visibility:visible;mso-wrap-style:square;v-text-anchor:top" coordsize="1024515,3824999" o:spt="100" o:gfxdata="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" adj="0,,0" path="m885393,v47169,,92987,1647,137439,4920l1024515,5111r,543037l1001121,541674c968783,534732,934395,531241,898030,531241v-80099,,-160198,16853,-202375,33719l695655,1787639v37960,16866,126492,33731,206604,33731c939149,1821370,973866,1817286,1006375,1809397r18140,-5642l1024515,2342248r-46361,1931c876960,2344179,758901,2327313,695655,2306231r,1224192c695655,3726701,458356,3824999,319557,3686201l,3366643,,164427c181280,71679,518592,,885393,xe" fillcolor="#017841" stroked="f" strokeweight="0">
-            <v:stroke miterlimit="83231f" joinstyle="miter"/>
-            <v:formulas/>
-            <v:path arrowok="t" o:connecttype="segments" textboxrect="0,0,1024515,3824999"/>
-          </v:shape>
-          <v:shape id="Shape 208" o:spid="_x0000_s1335" style="position:absolute;left:30735;top:8237;width:10245;height:23372;visibility:visible;mso-wrap-style:square;v-text-anchor:top" coordsize="1024528,2337137" o:spt="100" o:gfxdata="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" adj="0,,0" path="m,l127560,14487v583864,91076,896968,496880,896968,1160930c1024528,1835512,702144,2280668,81695,2333735l,2337137,,1798644r28965,-9010c225880,1714083,328860,1483710,328860,1175417,328860,829419,220313,617037,23565,549557l,543036,,xe" fillcolor="#017841" stroked="f" strokeweight="0">
-            <v:stroke miterlimit="83231f" joinstyle="miter"/>
-            <v:formulas/>
-            <v:path arrowok="t" o:connecttype="segments" textboxrect="0,0,1024528,2337137"/>
-          </v:shape>
-          <w10:anchorlock/>
-        </v:group>
-      </w:pict>
-    </w:r>
-    <w:r>
-      <w:pict w14:anchorId="7207038C">
-        <v:group id="_x0000_s1318" style="width:322.7pt;height:365.65pt;mso-position-horizontal-relative:char;mso-position-vertical-relative:line" coordsize="40980,46436">
-          <v:shape id="Shape 201" o:spid="_x0000_s1319" style="position:absolute;left:20490;top:9840;width:10245;height:30888;visibility:visible;mso-wrap-style:square;v-text-anchor:top" coordsize="1024515,3088805" o:spt="100" o:gfxdata="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" adj="0,,0" path="m,l695655,r,786816c758889,765721,881164,744652,982358,744652r42157,1756l1024515,1279357r-14113,-4346c978006,1267237,943354,1263218,906463,1263218v-80099,,-172860,16866,-210808,33744l695655,2519642v37948,16866,126492,29502,202375,29502c934395,2549144,968783,2545653,1001121,2538711r23394,-6474l1024515,3083693r-1696,192c978367,3087159,932549,3088805,885380,3088805,514376,3088805,177076,3017152,,2924391l,xe" fillcolor="#24613a" stroked="f" strokeweight="0">
-            <v:stroke miterlimit="83231f" joinstyle="miter"/>
-            <v:formulas/>
-            <v:path arrowok="t" o:connecttype="segments" textboxrect="0,0,1024515,3088805"/>
-          </v:shape>
-          <v:shape id="Shape 202" o:spid="_x0000_s1320" style="position:absolute;left:30735;top:17304;width:10245;height:23373;visibility:visible;mso-wrap-style:square;v-text-anchor:top" coordsize="1024516,2337284" o:spt="100" o:gfxdata="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" adj="0,,0" path="m,l85854,3577v619994,53066,938662,498222,938662,1158317c1024516,1825932,711411,2231726,127546,2322799l,2337284,,1785829r23565,-6521c220313,1711829,328861,1499447,328861,1153448,328861,845145,228663,617554,32786,543046l,532949,,xe" fillcolor="#24613a" stroked="f" strokeweight="0">
-            <v:stroke miterlimit="83231f" joinstyle="miter"/>
-            <v:formulas/>
-            <v:path arrowok="t" o:connecttype="segments" textboxrect="0,0,1024516,2337284"/>
-          </v:shape>
-          <v:shape id="Shape 203" o:spid="_x0000_s1321" style="position:absolute;top:5393;width:10245;height:23372;visibility:visible;mso-wrap-style:square;v-text-anchor:top" coordsize="1024515,2337147" o:spt="100" o:gfxdata="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" adj="0,,0" path="m1024515,r,543035l1000950,549557c804202,617039,695655,829428,695655,1175416v,308303,102981,538678,299895,614229l1024515,1798655r,538492l942830,2333745c322373,2280678,,1835510,,1175416,,511366,313104,105561,896969,14486l1024515,xe" fillcolor="#017841" stroked="f" strokeweight="0">
-            <v:stroke miterlimit="83231f" joinstyle="miter"/>
-            <v:formulas/>
-            <v:path arrowok="t" o:connecttype="segments" textboxrect="0,0,1024515,2337147"/>
-          </v:shape>
-          <v:shape id="Shape 204" o:spid="_x0000_s1322" style="position:absolute;left:10245;top:5342;width:10245;height:30343;visibility:visible;mso-wrap-style:square;v-text-anchor:top" coordsize="1024515,3034310" o:spt="100" o:gfxdata="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" adj="0,,0" path="m139135,v366788,,704088,71692,885380,164440l1024515,3034310r-695655,l328860,2306244v-63246,21082,-181292,37947,-282486,37947l,2342260,,1803768r18140,5642c50650,1817299,85366,1821383,122256,1821383v80112,,168656,-16865,206604,-33731l328860,564972c286696,548107,206585,531241,126486,531241v-36365,,-70754,3492,-103092,10433l,548148,,5113,1696,4920c46148,1647,91966,,139135,xe" fillcolor="#017841" stroked="f" strokeweight="0">
-            <v:stroke miterlimit="83231f" joinstyle="miter"/>
-            <v:formulas/>
-            <v:path arrowok="t" o:connecttype="segments" textboxrect="0,0,1024515,3034310"/>
-          </v:shape>
-          <v:shape id="Shape 205" o:spid="_x0000_s1323" style="position:absolute;top:14028;width:10245;height:23373;visibility:visible;mso-wrap-style:square;v-text-anchor:top" coordsize="1024515,2337297" o:spt="100" o:gfxdata="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" adj="0,,0" path="m1024515,r,532959l991723,543059c795852,617567,695655,845157,695655,1153461v,345988,108547,558368,305288,625848l1024515,1785832r,551465l896969,2322811c313105,2231736,,1825934,,1161907,,501812,318667,56644,938661,3577l1024515,xe" fillcolor="#24613a" stroked="f" strokeweight="0">
-            <v:stroke miterlimit="83231f" joinstyle="miter"/>
-            <v:formulas/>
-            <v:path arrowok="t" o:connecttype="segments" textboxrect="0,0,1024515,2337297"/>
-          </v:shape>
-          <v:shape id="Shape 206" o:spid="_x0000_s1324" style="position:absolute;left:10245;width:10245;height:37452;visibility:visible;mso-wrap-style:square;v-text-anchor:top" coordsize="1024515,3745242" o:spt="100" o:gfxdata="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" adj="0,,0" path="m781372,1541c797092,,812848,200,828363,2025v103432,12167,196152,96586,196152,219284l1024515,3580828v-177076,92748,-514375,164414,-885380,164414c91966,3745242,46148,3743595,1696,3740322l,3740129,,3188664r23386,6472c55723,3202077,90110,3205568,126473,3205568v75895,,164439,-12636,202387,-29502l328860,1953386v-37948,-16865,-130708,-33731,-210820,-33731c81150,1919655,46499,1923674,14105,1931447l,1935791,,1402832r42158,-1756c143351,1401076,265614,1422158,328860,1443240r,-1058266l648329,65493c687373,26449,734212,6163,781372,1541xe" fillcolor="#24613a" stroked="f" strokeweight="0">
-            <v:stroke miterlimit="83231f" joinstyle="miter"/>
-            <v:formulas/>
-            <v:path arrowok="t" o:connecttype="segments" textboxrect="0,0,1024515,3745242"/>
-          </v:shape>
-          <v:shape id="Shape 207" o:spid="_x0000_s1325" style="position:absolute;left:20490;top:8186;width:10245;height:38250;visibility:visible;mso-wrap-style:square;v-text-anchor:top" coordsize="1024515,3824999" o:spt="100" o:gfxdata="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" adj="0,,0" path="m885393,v47169,,92987,1647,137439,4920l1024515,5111r,543037l1001121,541674c968783,534732,934395,531241,898030,531241v-80099,,-160198,16853,-202375,33719l695655,1787639v37960,16866,126492,33731,206604,33731c939149,1821370,973866,1817286,1006375,1809397r18140,-5642l1024515,2342248r-46361,1931c876960,2344179,758901,2327313,695655,2306231r,1224192c695655,3726701,458356,3824999,319557,3686201l,3366643,,164427c181280,71679,518592,,885393,xe" fillcolor="#017841" stroked="f" strokeweight="0">
-            <v:stroke miterlimit="83231f" joinstyle="miter"/>
-            <v:formulas/>
-            <v:path arrowok="t" o:connecttype="segments" textboxrect="0,0,1024515,3824999"/>
-          </v:shape>
-          <v:shape id="Shape 208" o:spid="_x0000_s1326" style="position:absolute;left:30735;top:8237;width:10245;height:23372;visibility:visible;mso-wrap-style:square;v-text-anchor:top" coordsize="1024528,2337137" o:spt="100" o:gfxdata="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" adj="0,,0" path="m,l127560,14487v583864,91076,896968,496880,896968,1160930c1024528,1835512,702144,2280668,81695,2333735l,2337137,,1798644r28965,-9010c225880,1714083,328860,1483710,328860,1175417,328860,829419,220313,617037,23565,549557l,543036,,xe" fillcolor="#017841" stroked="f" strokeweight="0">
-            <v:stroke miterlimit="83231f" joinstyle="miter"/>
-            <v:formulas/>
-            <v:path arrowok="t" o:connecttype="segments" textboxrect="0,0,1024528,2337137"/>
-          </v:shape>
-          <w10:anchorlock/>
-        </v:group>
-      </w:pict>
-    </w:r>
-    <w:r>
-      <w:pict w14:anchorId="74059A1C">
-        <v:group id="_x0000_s1309" style="width:322.7pt;height:365.65pt;mso-position-horizontal-relative:char;mso-position-vertical-relative:line" coordsize="40980,46436">
-          <v:shape id="Shape 201" o:spid="_x0000_s1310" style="position:absolute;left:20490;top:9840;width:10245;height:30888;visibility:visible;mso-wrap-style:square;v-text-anchor:top" coordsize="1024515,3088805" o:spt="100" o:gfxdata="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" adj="0,,0" path="m,l695655,r,786816c758889,765721,881164,744652,982358,744652r42157,1756l1024515,1279357r-14113,-4346c978006,1267237,943354,1263218,906463,1263218v-80099,,-172860,16866,-210808,33744l695655,2519642v37948,16866,126492,29502,202375,29502c934395,2549144,968783,2545653,1001121,2538711r23394,-6474l1024515,3083693r-1696,192c978367,3087159,932549,3088805,885380,3088805,514376,3088805,177076,3017152,,2924391l,xe" fillcolor="#24613a" stroked="f" strokeweight="0">
-            <v:stroke miterlimit="83231f" joinstyle="miter"/>
-            <v:formulas/>
-            <v:path arrowok="t" o:connecttype="segments" textboxrect="0,0,1024515,3088805"/>
-          </v:shape>
-          <v:shape id="Shape 202" o:spid="_x0000_s1311" style="position:absolute;left:30735;top:17304;width:10245;height:23373;visibility:visible;mso-wrap-style:square;v-text-anchor:top" coordsize="1024516,2337284" o:spt="100" o:gfxdata="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" adj="0,,0" path="m,l85854,3577v619994,53066,938662,498222,938662,1158317c1024516,1825932,711411,2231726,127546,2322799l,2337284,,1785829r23565,-6521c220313,1711829,328861,1499447,328861,1153448,328861,845145,228663,617554,32786,543046l,532949,,xe" fillcolor="#24613a" stroked="f" strokeweight="0">
-            <v:stroke miterlimit="83231f" joinstyle="miter"/>
-            <v:formulas/>
-            <v:path arrowok="t" o:connecttype="segments" textboxrect="0,0,1024516,2337284"/>
-          </v:shape>
-          <v:shape id="Shape 203" o:spid="_x0000_s1312" style="position:absolute;top:5393;width:10245;height:23372;visibility:visible;mso-wrap-style:square;v-text-anchor:top" coordsize="1024515,2337147" o:spt="100" o:gfxdata="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" adj="0,,0" path="m1024515,r,543035l1000950,549557c804202,617039,695655,829428,695655,1175416v,308303,102981,538678,299895,614229l1024515,1798655r,538492l942830,2333745c322373,2280678,,1835510,,1175416,,511366,313104,105561,896969,14486l1024515,xe" fillcolor="#017841" stroked="f" strokeweight="0">
-            <v:stroke miterlimit="83231f" joinstyle="miter"/>
-            <v:formulas/>
-            <v:path arrowok="t" o:connecttype="segments" textboxrect="0,0,1024515,2337147"/>
-          </v:shape>
-          <v:shape id="Shape 204" o:spid="_x0000_s1313" style="position:absolute;left:10245;top:5342;width:10245;height:30343;visibility:visible;mso-wrap-style:square;v-text-anchor:top" coordsize="1024515,3034310" o:spt="100" o:gfxdata="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" adj="0,,0" path="m139135,v366788,,704088,71692,885380,164440l1024515,3034310r-695655,l328860,2306244v-63246,21082,-181292,37947,-282486,37947l,2342260,,1803768r18140,5642c50650,1817299,85366,1821383,122256,1821383v80112,,168656,-16865,206604,-33731l328860,564972c286696,548107,206585,531241,126486,531241v-36365,,-70754,3492,-103092,10433l,548148,,5113,1696,4920c46148,1647,91966,,139135,xe" fillcolor="#017841" stroked="f" strokeweight="0">
-            <v:stroke miterlimit="83231f" joinstyle="miter"/>
-            <v:formulas/>
-            <v:path arrowok="t" o:connecttype="segments" textboxrect="0,0,1024515,3034310"/>
-          </v:shape>
-          <v:shape id="Shape 205" o:spid="_x0000_s1314" style="position:absolute;top:14028;width:10245;height:23373;visibility:visible;mso-wrap-style:square;v-text-anchor:top" coordsize="1024515,2337297" o:spt="100" o:gfxdata="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" adj="0,,0" path="m1024515,r,532959l991723,543059c795852,617567,695655,845157,695655,1153461v,345988,108547,558368,305288,625848l1024515,1785832r,551465l896969,2322811c313105,2231736,,1825934,,1161907,,501812,318667,56644,938661,3577l1024515,xe" fillcolor="#24613a" stroked="f" strokeweight="0">
-            <v:stroke miterlimit="83231f" joinstyle="miter"/>
-            <v:formulas/>
-            <v:path arrowok="t" o:connecttype="segments" textboxrect="0,0,1024515,2337297"/>
-          </v:shape>
-          <v:shape id="Shape 206" o:spid="_x0000_s1315" style="position:absolute;left:10245;width:10245;height:37452;visibility:visible;mso-wrap-style:square;v-text-anchor:top" coordsize="1024515,3745242" o:spt="100" o:gfxdata="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" adj="0,,0" path="m781372,1541c797092,,812848,200,828363,2025v103432,12167,196152,96586,196152,219284l1024515,3580828v-177076,92748,-514375,164414,-885380,164414c91966,3745242,46148,3743595,1696,3740322l,3740129,,3188664r23386,6472c55723,3202077,90110,3205568,126473,3205568v75895,,164439,-12636,202387,-29502l328860,1953386v-37948,-16865,-130708,-33731,-210820,-33731c81150,1919655,46499,1923674,14105,1931447l,1935791,,1402832r42158,-1756c143351,1401076,265614,1422158,328860,1443240r,-1058266l648329,65493c687373,26449,734212,6163,781372,1541xe" fillcolor="#24613a" stroked="f" strokeweight="0">
-            <v:stroke miterlimit="83231f" joinstyle="miter"/>
-            <v:formulas/>
-            <v:path arrowok="t" o:connecttype="segments" textboxrect="0,0,1024515,3745242"/>
-          </v:shape>
-          <v:shape id="Shape 207" o:spid="_x0000_s1316" style="position:absolute;left:20490;top:8186;width:10245;height:38250;visibility:visible;mso-wrap-style:square;v-text-anchor:top" coordsize="1024515,3824999" o:spt="100" o:gfxdata="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" adj="0,,0" path="m885393,v47169,,92987,1647,137439,4920l1024515,5111r,543037l1001121,541674c968783,534732,934395,531241,898030,531241v-80099,,-160198,16853,-202375,33719l695655,1787639v37960,16866,126492,33731,206604,33731c939149,1821370,973866,1817286,1006375,1809397r18140,-5642l1024515,2342248r-46361,1931c876960,2344179,758901,2327313,695655,2306231r,1224192c695655,3726701,458356,3824999,319557,3686201l,3366643,,164427c181280,71679,518592,,885393,xe" fillcolor="#017841" stroked="f" strokeweight="0">
-            <v:stroke miterlimit="83231f" joinstyle="miter"/>
-            <v:formulas/>
-            <v:path arrowok="t" o:connecttype="segments" textboxrect="0,0,1024515,3824999"/>
-          </v:shape>
-          <v:shape id="Shape 208" o:spid="_x0000_s1317" style="position:absolute;left:30735;top:8237;width:10245;height:23372;visibility:visible;mso-wrap-style:square;v-text-anchor:top" coordsize="1024528,2337137" o:spt="100" o:gfxdata="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" adj="0,,0" path="m,l127560,14487v583864,91076,896968,496880,896968,1160930c1024528,1835512,702144,2280668,81695,2333735l,2337137,,1798644r28965,-9010c225880,1714083,328860,1483710,328860,1175417,328860,829419,220313,617037,23565,549557l,543036,,xe" fillcolor="#017841" stroked="f" strokeweight="0">
-            <v:stroke miterlimit="83231f" joinstyle="miter"/>
-            <v:formulas/>
-            <v:path arrowok="t" o:connecttype="segments" textboxrect="0,0,1024528,2337137"/>
-          </v:shape>
-          <w10:anchorlock/>
-        </v:group>
-      </w:pict>
-    </w:r>
-    <w:r>
-      <w:pict w14:anchorId="1E17F19F">
-        <v:group id="_x0000_s1300" style="width:322.7pt;height:365.65pt;mso-position-horizontal-relative:char;mso-position-vertical-relative:line" coordsize="40980,46436">
-          <v:shape id="Shape 201" o:spid="_x0000_s1301" style="position:absolute;left:20490;top:9840;width:10245;height:30888;visibility:visible;mso-wrap-style:square;v-text-anchor:top" coordsize="1024515,3088805" o:spt="100" o:gfxdata="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" adj="0,,0" path="m,l695655,r,786816c758889,765721,881164,744652,982358,744652r42157,1756l1024515,1279357r-14113,-4346c978006,1267237,943354,1263218,906463,1263218v-80099,,-172860,16866,-210808,33744l695655,2519642v37948,16866,126492,29502,202375,29502c934395,2549144,968783,2545653,1001121,2538711r23394,-6474l1024515,3083693r-1696,192c978367,3087159,932549,3088805,885380,3088805,514376,3088805,177076,3017152,,2924391l,xe" fillcolor="#24613a" stroked="f" strokeweight="0">
-            <v:stroke miterlimit="83231f" joinstyle="miter"/>
-            <v:formulas/>
-            <v:path arrowok="t" o:connecttype="segments" textboxrect="0,0,1024515,3088805"/>
-          </v:shape>
-          <v:shape id="Shape 202" o:spid="_x0000_s1302" style="position:absolute;left:30735;top:17304;width:10245;height:23373;visibility:visible;mso-wrap-style:square;v-text-anchor:top" coordsize="1024516,2337284" o:spt="100" o:gfxdata="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" adj="0,,0" path="m,l85854,3577v619994,53066,938662,498222,938662,1158317c1024516,1825932,711411,2231726,127546,2322799l,2337284,,1785829r23565,-6521c220313,1711829,328861,1499447,328861,1153448,328861,845145,228663,617554,32786,543046l,532949,,xe" fillcolor="#24613a" stroked="f" strokeweight="0">
-            <v:stroke miterlimit="83231f" joinstyle="miter"/>
-            <v:formulas/>
-            <v:path arrowok="t" o:connecttype="segments" textboxrect="0,0,1024516,2337284"/>
-          </v:shape>
-          <v:shape id="Shape 203" o:spid="_x0000_s1303" style="position:absolute;top:5393;width:10245;height:23372;visibility:visible;mso-wrap-style:square;v-text-anchor:top" coordsize="1024515,2337147" o:spt="100" o:gfxdata="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" adj="0,,0" path="m1024515,r,543035l1000950,549557c804202,617039,695655,829428,695655,1175416v,308303,102981,538678,299895,614229l1024515,1798655r,538492l942830,2333745c322373,2280678,,1835510,,1175416,,511366,313104,105561,896969,14486l1024515,xe" fillcolor="#017841" stroked="f" strokeweight="0">
-            <v:stroke miterlimit="83231f" joinstyle="miter"/>
-            <v:formulas/>
-            <v:path arrowok="t" o:connecttype="segments" textboxrect="0,0,1024515,2337147"/>
-          </v:shape>
-          <v:shape id="Shape 204" o:spid="_x0000_s1304" style="position:absolute;left:10245;top:5342;width:10245;height:30343;visibility:visible;mso-wrap-style:square;v-text-anchor:top" coordsize="1024515,3034310" o:spt="100" o:gfxdata="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" adj="0,,0" path="m139135,v366788,,704088,71692,885380,164440l1024515,3034310r-695655,l328860,2306244v-63246,21082,-181292,37947,-282486,37947l,2342260,,1803768r18140,5642c50650,1817299,85366,1821383,122256,1821383v80112,,168656,-16865,206604,-33731l328860,564972c286696,548107,206585,531241,126486,531241v-36365,,-70754,3492,-103092,10433l,548148,,5113,1696,4920c46148,1647,91966,,139135,xe" fillcolor="#017841" stroked="f" strokeweight="0">
-            <v:stroke miterlimit="83231f" joinstyle="miter"/>
-            <v:formulas/>
-            <v:path arrowok="t" o:connecttype="segments" textboxrect="0,0,1024515,3034310"/>
-          </v:shape>
-          <v:shape id="Shape 205" o:spid="_x0000_s1305" style="position:absolute;top:14028;width:10245;height:23373;visibility:visible;mso-wrap-style:square;v-text-anchor:top" coordsize="1024515,2337297" o:spt="100" o:gfxdata="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" adj="0,,0" path="m1024515,r,532959l991723,543059c795852,617567,695655,845157,695655,1153461v,345988,108547,558368,305288,625848l1024515,1785832r,551465l896969,2322811c313105,2231736,,1825934,,1161907,,501812,318667,56644,938661,3577l1024515,xe" fillcolor="#24613a" stroked="f" strokeweight="0">
-            <v:stroke miterlimit="83231f" joinstyle="miter"/>
-            <v:formulas/>
-            <v:path arrowok="t" o:connecttype="segments" textboxrect="0,0,1024515,2337297"/>
-          </v:shape>
-          <v:shape id="Shape 206" o:spid="_x0000_s1306" style="position:absolute;left:10245;width:10245;height:37452;visibility:visible;mso-wrap-style:square;v-text-anchor:top" coordsize="1024515,3745242" o:spt="100" o:gfxdata="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" adj="0,,0" path="m781372,1541c797092,,812848,200,828363,2025v103432,12167,196152,96586,196152,219284l1024515,3580828v-177076,92748,-514375,164414,-885380,164414c91966,3745242,46148,3743595,1696,3740322l,3740129,,3188664r23386,6472c55723,3202077,90110,3205568,126473,3205568v75895,,164439,-12636,202387,-29502l328860,1953386v-37948,-16865,-130708,-33731,-210820,-33731c81150,1919655,46499,1923674,14105,1931447l,1935791,,1402832r42158,-1756c143351,1401076,265614,1422158,328860,1443240r,-1058266l648329,65493c687373,26449,734212,6163,781372,1541xe" fillcolor="#24613a" stroked="f" strokeweight="0">
-            <v:stroke miterlimit="83231f" joinstyle="miter"/>
-            <v:formulas/>
-            <v:path arrowok="t" o:connecttype="segments" textboxrect="0,0,1024515,3745242"/>
-          </v:shape>
-          <v:shape id="Shape 207" o:spid="_x0000_s1307" style="position:absolute;left:20490;top:8186;width:10245;height:38250;visibility:visible;mso-wrap-style:square;v-text-anchor:top" coordsize="1024515,3824999" o:spt="100" o:gfxdata="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" adj="0,,0" path="m885393,v47169,,92987,1647,137439,4920l1024515,5111r,543037l1001121,541674c968783,534732,934395,531241,898030,531241v-80099,,-160198,16853,-202375,33719l695655,1787639v37960,16866,126492,33731,206604,33731c939149,1821370,973866,1817286,1006375,1809397r18140,-5642l1024515,2342248r-46361,1931c876960,2344179,758901,2327313,695655,2306231r,1224192c695655,3726701,458356,3824999,319557,3686201l,3366643,,164427c181280,71679,518592,,885393,xe" fillcolor="#017841" stroked="f" strokeweight="0">
-            <v:stroke miterlimit="83231f" joinstyle="miter"/>
-            <v:formulas/>
-            <v:path arrowok="t" o:connecttype="segments" textboxrect="0,0,1024515,3824999"/>
-          </v:shape>
-          <v:shape id="Shape 208" o:spid="_x0000_s1308" style="position:absolute;left:30735;top:8237;width:10245;height:23372;visibility:visible;mso-wrap-style:square;v-text-anchor:top" coordsize="1024528,2337137" o:spt="100" o:gfxdata="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" adj="0,,0" path="m,l127560,14487v583864,91076,896968,496880,896968,1160930c1024528,1835512,702144,2280668,81695,2333735l,2337137,,1798644r28965,-9010c225880,1714083,328860,1483710,328860,1175417,328860,829419,220313,617037,23565,549557l,543036,,xe" fillcolor="#017841" stroked="f" strokeweight="0">
-            <v:stroke miterlimit="83231f" joinstyle="miter"/>
-            <v:formulas/>
-            <v:path arrowok="t" o:connecttype="segments" textboxrect="0,0,1024528,2337137"/>
-          </v:shape>
-          <w10:anchorlock/>
-        </v:group>
       </w:pict>
     </w:r>
   </w:p>
@@ -6060,7 +4000,7 @@
 </file>
 
 <file path=word/header3.xml><?xml version="1.0" encoding="utf-8"?>
-<w:hdr xmlns:wpc="http://schemas.microsoft.com/office/word/2010/wordprocessingCanvas" xmlns:cx="http://schemas.microsoft.com/office/drawing/2014/chartex" xmlns:cx1="http://schemas.microsoft.com/office/drawing/2015/9/8/chartex" xmlns:cx2="http://schemas.microsoft.com/office/drawing/2015/10/21/chartex" xmlns:cx3="http://schemas.microsoft.com/office/drawing/2016/5/9/chartex" xmlns:cx4="http://schemas.microsoft.com/office/drawing/2016/5/10/chartex" xmlns:cx5="http://schemas.microsoft.com/office/drawing/2016/5/11/chartex" xmlns:cx6="http://schemas.microsoft.com/office/drawing/2016/5/12/chartex" xmlns:cx7="http://schemas.microsoft.com/office/drawing/2016/5/13/chartex" xmlns:cx8="http://schemas.microsoft.com/office/drawing/2016/5/14/chartex" xmlns:mc="http://schemas.openxmlformats.org/markup-compatibility/2006" xmlns:aink="http://schemas.microsoft.com/office/drawing/2016/ink" xmlns:am3d="http://schemas.microsoft.com/office/drawing/2017/model3d" xmlns:o="urn:schemas-microsoft-com:office:office" xmlns:oel="http://schemas.microsoft.com/office/2019/extlst" xmlns:r="http://schemas.openxmlformats.org/officeDocument/2006/relationships" xmlns:m="http://schemas.openxmlformats.org/officeDocument/2006/math" xmlns:v="urn:schemas-microsoft-com:vml" xmlns:wp14="http://schemas.microsoft.com/office/word/2010/wordprocessingDrawing" xmlns:wp="http://schemas.openxmlformats.org/drawingml/2006/wordprocessingDrawing" xmlns:w10="urn:schemas-microsoft-com:office:word" xmlns:w="http://schemas.openxmlformats.org/wordprocessingml/2006/main" xmlns:w14="http://schemas.microsoft.com/office/word/2010/wordml" xmlns:w15="http://schemas.microsoft.com/office/word/2012/wordml" xmlns:w16cex="http://schemas.microsoft.com/office/word/2018/wordml/cex" xmlns:w16cid="http://schemas.microsoft.com/office/word/2016/wordml/cid" xmlns:w16="http://schemas.microsoft.com/office/word/2018/wordml" xmlns:w16du="http://schemas.microsoft.com/office/word/2023/wordml/word16du" xmlns:w16sdtdh="http://schemas.microsoft.com/office/word/2020/wordml/sdtdatahash" xmlns:w16sdtfl="http://schemas.microsoft.com/office/word/2024/wordml/sdtformatlock" xmlns:w16se="http://schemas.microsoft.com/office/word/2015/wordml/symex" xmlns:wpg="http://schemas.microsoft.com/office/word/2010/wordprocessingGroup" xmlns:wpi="http://schemas.microsoft.com/office/word/2010/wordprocessingInk" xmlns:wne="http://schemas.microsoft.com/office/word/2006/wordml" xmlns:wps="http://schemas.microsoft.com/office/word/2010/wordprocessingShape" mc:Ignorable="w14 w15 w16se w16cid w16 w16cex w16sdtdh w16sdtfl w16du wp14">
+<w:hdr xmlns:ve="http://schemas.openxmlformats.org/markup-compatibility/2006" xmlns:o="urn:schemas-microsoft-com:office:office" xmlns:r="http://schemas.openxmlformats.org/officeDocument/2006/relationships" xmlns:m="http://schemas.openxmlformats.org/officeDocument/2006/math" xmlns:v="urn:schemas-microsoft-com:vml" xmlns:wp="http://schemas.openxmlformats.org/drawingml/2006/wordprocessingDrawing" xmlns:w10="urn:schemas-microsoft-com:office:word" xmlns:w="http://schemas.openxmlformats.org/wordprocessingml/2006/main" xmlns:wne="http://schemas.microsoft.com/office/word/2006/wordml">
   <w:p>
     <w:pPr>
       <w:pStyle w:val="Cabealho"/>
@@ -6070,7 +4010,7 @@
         <w:noProof/>
         <w:lang w:val="pt-BR" w:eastAsia="pt-BR" w:bidi="ar-SA"/>
       </w:rPr>
-      <w:pict w14:anchorId="72FFF1BC">
+      <w:pict>
         <v:shapetype id="_x0000_t75" coordsize="21600,21600" o:spt="75" o:preferrelative="t" path="m@4@5l@4@11@9@11@9@5xe" filled="f" stroked="f">
           <v:stroke joinstyle="miter"/>
           <v:formulas>
@@ -6090,7 +4030,7 @@
           <v:path o:extrusionok="f" gradientshapeok="t" o:connecttype="rect"/>
           <o:lock v:ext="edit" aspectratio="t"/>
         </v:shapetype>
-        <v:shape id="WordPictureWatermark180196531" o:spid="_x0000_s1505" type="#_x0000_t75" style="position:absolute;left:0;text-align:left;margin-left:0;margin-top:0;width:322.55pt;height:360.8pt;z-index:-251624448;mso-position-horizontal:center;mso-position-horizontal-relative:margin;mso-position-vertical:center;mso-position-vertical-relative:margin" o:allowincell="f">
+        <v:shape id="WordPictureWatermark179838109" o:spid="_x0000_s1123" type="#_x0000_t75" style="position:absolute;margin-left:0;margin-top:0;width:322.55pt;height:360.8pt;z-index:-251651072;mso-position-horizontal:center;mso-position-horizontal-relative:margin;mso-position-vertical:center;mso-position-vertical-relative:margin" o:allowincell="f">
           <v:imagedata r:id="rId1" o:title="Marca D'agua" gain="19661f" blacklevel="22938f"/>
           <w10:wrap anchorx="margin" anchory="margin"/>
         </v:shape>

</xml_diff>